<commit_message>
Rut gon proposal tu 15 xuong 11 trang, thien ve kien truc phan mem/data pipeline/mo hinh
Cat trung lap giua Proposed Method va Research Methodology, gon lai
Introduction/Scope/Expected Results, giu nguyen bang kien truc 5 tang va
module contract theo yeu cau nhan manh phan ky thuat phan mem.

Co-Authored-By: Claude Sonnet 5 <noreply@anthropic.com>
</commit_message>
<xml_diff>
--- a/docs/THESIS_PROPOSAL.docx
+++ b/docs/THESIS_PROPOSAL.docx
@@ -306,7 +306,7 @@
                 <w:rFonts w:ascii="Times New Roman" w:hAnsi="Times New Roman"/>
                 <w:sz w:val="24"/>
               </w:rPr>
-              <w:t xml:space="preserve">The foreign exchange (FX) market is the largest and most liquid financial market in the world, and many decision-support tools marketed to retail participants display a directional forecast, chart-pattern signals, and a qualitative confidence label whose empirical foundation is weaker than their presentation suggests. Daily exchange-rate returns have resisted prediction since Meese and Rogoff [1], and large-scale replications of technical trading rules report that in-sample profitability largely disappears out of sample, with residual abnormal returns absorbed by a time-series momentum factor [2], [3]. The central difficulty is inference under a low signal-to-noise ratio combined with a large hypothesis space: a system that evaluates thousands of candidate rules will find many spurious relationships unless the hypothesis space is enumerated in advance and the family-wise error rate is controlled [4]–[6]. A related, less-addressed difficulty is that a negative finding is uninformative without its minimum detectable effect size (MDES) — otherwise "there is nothing there" and "the test could not have found it" are indistinguishable. Predictability is also not one property: the </w:t>
+              <w:t xml:space="preserve">Retail FX decision-support tools typically display a directional forecast and a confidence label whose empirical foundation is weaker than their presentation suggests: daily returns have resisted prediction since Meese and Rogoff [1], and technical-rule replications show in-sample profitability largely disappearing out of sample, absorbed by a momentum factor [2], [3]. The core difficulty is inference under a low signal-to-noise ratio with a large hypothesis space — evaluating thousands of candidate rules finds spurious relationships unless the hypothesis space is enumerated in advance and the family-wise error rate is controlled [4]–[6] — compounded by the fact that a negative finding is uninformative without its minimum detectable effect size (MDES). Predictability also differs by axis: the HAR model of realized volatility [7]–[9] gives well-established </w:t>
             </w:r>
             <w:r>
               <w:rPr>
@@ -314,14 +314,14 @@
                 <w:i/>
                 <w:sz w:val="24"/>
               </w:rPr>
-              <w:t>direction</w:t>
+              <w:t>magnitude</w:t>
             </w:r>
             <w:r>
               <w:rPr>
                 <w:rFonts w:ascii="Times New Roman" w:hAnsi="Times New Roman"/>
                 <w:sz w:val="24"/>
               </w:rPr>
-              <w:t xml:space="preserve"> and </w:t>
+              <w:t xml:space="preserve"> forecasts while </w:t>
             </w:r>
             <w:r>
               <w:rPr>
@@ -329,14 +329,14 @@
                 <w:i/>
                 <w:sz w:val="24"/>
               </w:rPr>
-              <w:t>magnitude</w:t>
+              <w:t>direction</w:t>
             </w:r>
             <w:r>
               <w:rPr>
                 <w:rFonts w:ascii="Times New Roman" w:hAnsi="Times New Roman"/>
                 <w:sz w:val="24"/>
               </w:rPr>
-              <w:t xml:space="preserve"> axes have different empirical status — the HAR model of realized volatility [7]–[9] gives well-established magnitude forecasts while directional skill remains contested [10], [11] — so a decision support system should state explicitly which axis it claims skill on and demonstrate that under a fixed protocol.</w:t>
+              <w:t xml:space="preserve"> remains contested [10], [11], so a system should state explicitly which axis it claims skill on.</w:t>
             </w:r>
           </w:p>
           <w:p>
@@ -350,7 +350,7 @@
                 <w:rFonts w:ascii="Times New Roman" w:hAnsi="Times New Roman"/>
                 <w:sz w:val="24"/>
               </w:rPr>
-              <w:t>Preliminary work by the group has established feasibility through three staged, pre-registered phases, each closed with a written decision record. A complete data pipeline covers six major pairs (EUR/USD, GBP/USD, USD/JPY, AUD/USD, USD/CAD, USD/CHF) over 2010–2025 (≈34.9 million one-minute bars); a production volatility layer, a three-class probability layer, and a risk layer run end to end through an operating web application updated on a daily schedule. The extended HAR specification attains a test-set QLIKE of 0.1585 versus 0.2172 for the prior baseline, and fourteen ML/DL alternatives plus 509 forecast combinations fail to displace it from the Model Confidence Set [12]. On the direction axis, 8,652 enumerated rule hypotheses across twelve discovery branches (price patterns and central-bank communication) yield zero survivors after family-wise error control, with measured detection power at a lift of 1.20. A further pre-registered ablation of exogenous macro/cross-asset variables under a causal-versus-validation feature-selection design is completed and frozen; its sealed-set evaluation was withheld because the pre-specified opening rule was not met.</w:t>
+              <w:t>Preliminary work has established feasibility through three pre-registered phases, each closed with a written decision record. A complete pipeline covers six pairs (EUR/USD, GBP/USD, USD/JPY, AUD/USD, USD/CAD, USD/CHF) over 2010–2025 (≈34.9M one-minute bars); a production volatility layer, a three-class probability layer, and a risk layer run end to end through a web application updated daily. The extended HAR model attains test-set QLIKE 0.1585 vs. 0.2172 for the prior baseline, and 14 ML/DL alternatives plus 509 combinations fail to displace it from the Model Confidence Set [12]. On direction, 8,652 rule hypotheses across twelve discovery branches yield zero survivors after family-wise error control. A pre-registered causal-vs-validation feature-selection ablation is completed and frozen; its sealed-set evaluation was withheld because the pre-specified opening rule was not met.</w:t>
             </w:r>
           </w:p>
           <w:p>
@@ -364,7 +364,7 @@
                 <w:rFonts w:ascii="Times New Roman" w:hAnsi="Times New Roman"/>
                 <w:sz w:val="24"/>
               </w:rPr>
-              <w:t xml:space="preserve">This thesis therefore addresses a problem that is as much </w:t>
+              <w:t xml:space="preserve">This thesis is therefore as much an </w:t>
             </w:r>
             <w:r>
               <w:rPr>
@@ -379,7 +379,22 @@
                 <w:rFonts w:ascii="Times New Roman" w:hAnsi="Times New Roman"/>
                 <w:sz w:val="24"/>
               </w:rPr>
-              <w:t xml:space="preserve"> as it is statistical: constructing a decision support system whose every displayed number is traceable to a pre-registered measurement, states the axis on which it has skill, quantifies its negative findings, and is delivered as software that runs continuously rather than as a script for a report. The data pipeline, computation layer, API, and web application (Proposed Method and System Architecture) are a primary deliverable, developed across the full sixteen weeks rather than assembled at the end. The remaining research work is a small number of explicitly identified residual validation items, the single sealed-set evaluation, and system hardening.</w:t>
+              <w:t xml:space="preserve"> problem as a statistical one: a decision support system whose every number is traceable to a pre-registered measurement, delivered as software that runs continuously rather than a script for a report. The data pipeline, computation layer, API, and web application (see </w:t>
+            </w:r>
+            <w:r>
+              <w:rPr>
+                <w:rFonts w:ascii="Times New Roman" w:hAnsi="Times New Roman"/>
+                <w:i/>
+                <w:sz w:val="24"/>
+              </w:rPr>
+              <w:t>Proposed Method and System Architecture</w:t>
+            </w:r>
+            <w:r>
+              <w:rPr>
+                <w:rFonts w:ascii="Times New Roman" w:hAnsi="Times New Roman"/>
+                <w:sz w:val="24"/>
+              </w:rPr>
+              <w:t>) are a primary deliverable, developed across all sixteen weeks rather than assembled at the end.</w:t>
             </w:r>
           </w:p>
         </w:tc>
@@ -413,7 +428,7 @@
                 <w:rFonts w:ascii="Times New Roman" w:hAnsi="Times New Roman"/>
                 <w:sz w:val="24"/>
               </w:rPr>
-              <w:t xml:space="preserve">The group surveyed existing retail FX decision-support tools so the contribution below is stated relative to what exists, not in the abstract. </w:t>
+              <w:t xml:space="preserve">Existing retail tools were surveyed to state the contribution relative to what exists. </w:t>
             </w:r>
             <w:r>
               <w:rPr>
@@ -428,7 +443,7 @@
                 <w:rFonts w:ascii="Times New Roman" w:hAnsi="Times New Roman"/>
                 <w:sz w:val="24"/>
               </w:rPr>
-              <w:t xml:space="preserve"> (MQL5/MetaTrader, TradingView public scripts) publish a track record from the vendor's own in-sample selection, with no pre-registered protocol or multiple-testing correction across the many scripts a user browses. </w:t>
+              <w:t xml:space="preserve"> (MQL5/MetaTrader, TradingView) publish track records from the vendor's own in-sample selection, with no multiple-testing correction. </w:t>
             </w:r>
             <w:r>
               <w:rPr>
@@ -443,7 +458,7 @@
                 <w:rFonts w:ascii="Times New Roman" w:hAnsi="Times New Roman"/>
                 <w:sz w:val="24"/>
               </w:rPr>
-              <w:t xml:space="preserve"> (Myfxbook, FX Blue) report realized trade statistics but no forward-looking calibrated probabilities or backtested risk figures. </w:t>
+              <w:t xml:space="preserve"> (Myfxbook, FX Blue) report realized statistics but no calibrated forward-looking probabilities. </w:t>
             </w:r>
             <w:r>
               <w:rPr>
@@ -451,14 +466,14 @@
                 <w:b/>
                 <w:sz w:val="24"/>
               </w:rPr>
-              <w:t>Broker "confidence"/"sentiment" widgets</w:t>
+              <w:t>Broker "confidence" widgets</w:t>
             </w:r>
             <w:r>
               <w:rPr>
                 <w:rFonts w:ascii="Times New Roman" w:hAnsi="Times New Roman"/>
                 <w:sz w:val="24"/>
               </w:rPr>
-              <w:t xml:space="preserve"> attach a qualitative label with no proper scoring rule or calibration diagnostic. None discloses the hypothesis space searched, the multiple-testing correction applied, a calibration guarantee, or a quantified probability of ruin — properties missing from applied decision support systems generally [27]. This gap, not a claim of superior directional accuracy, is what the proposed system targets.</w:t>
+              <w:t xml:space="preserve"> attach a qualitative label with no scoring rule. None discloses the hypothesis space searched, the multiple-testing correction, a calibration guarantee, or a quantified probability of ruin — gaps identified in decision support systems generally [27] and specifically targeted here.</w:t>
             </w:r>
           </w:p>
         </w:tc>
@@ -492,21 +507,7 @@
                 <w:rFonts w:ascii="Times New Roman" w:hAnsi="Times New Roman"/>
                 <w:sz w:val="24"/>
               </w:rPr>
-              <w:t>The primary objective is to design, implement, and empirically validate a decision support system for FX trading in which forecast skill is established per target axis under strict multiple-testing control, uncertainty is communicated through calibrated conformal prediction, and position sizing is constrained by an estimated probability of ruin.</w:t>
-            </w:r>
-          </w:p>
-          <w:p>
-            <w:pPr>
-              <w:spacing w:after="100"/>
-              <w:ind w:firstLine="340"/>
-              <w:jc w:val="both"/>
-            </w:pPr>
-            <w:r>
-              <w:rPr>
-                <w:rFonts w:ascii="Times New Roman" w:hAnsi="Times New Roman"/>
-                <w:sz w:val="24"/>
-              </w:rPr>
-              <w:t xml:space="preserve">Three groups of quantities are kept conceptually distinct throughout: </w:t>
+              <w:t xml:space="preserve">Design, implement, and validate a decision support system in which forecast skill is established per target axis under multiple-testing control, uncertainty is communicated via calibrated conformal prediction, and position sizing is constrained by an estimated probability of ruin. Three quantity groups are kept distinct: </w:t>
             </w:r>
             <w:r>
               <w:rPr>
@@ -521,7 +522,7 @@
                 <w:rFonts w:ascii="Times New Roman" w:hAnsi="Times New Roman"/>
                 <w:sz w:val="24"/>
               </w:rPr>
-              <w:t xml:space="preserve"> (direction, magnitude, tail-event probability, each scored against its own baseline), </w:t>
+              <w:t xml:space="preserve"> (direction, magnitude, tail probability), </w:t>
             </w:r>
             <w:r>
               <w:rPr>
@@ -536,7 +537,7 @@
                 <w:rFonts w:ascii="Times New Roman" w:hAnsi="Times New Roman"/>
                 <w:sz w:val="24"/>
               </w:rPr>
-              <w:t xml:space="preserve"> (coverage and reliability), and the </w:t>
+              <w:t xml:space="preserve"> (coverage, reliability), and the </w:t>
             </w:r>
             <w:r>
               <w:rPr>
@@ -551,21 +552,7 @@
                 <w:rFonts w:ascii="Times New Roman" w:hAnsi="Times New Roman"/>
                 <w:sz w:val="24"/>
               </w:rPr>
-              <w:t xml:space="preserve"> (VaR, ES, stop-out probability, position sizing).</w:t>
-            </w:r>
-          </w:p>
-          <w:p>
-            <w:pPr>
-              <w:spacing w:after="100"/>
-              <w:ind w:firstLine="340"/>
-              <w:jc w:val="both"/>
-            </w:pPr>
-            <w:r>
-              <w:rPr>
-                <w:rFonts w:ascii="Times New Roman" w:hAnsi="Times New Roman"/>
-                <w:sz w:val="24"/>
-              </w:rPr>
-              <w:t>Specific objectives:</w:t>
+              <w:t xml:space="preserve"> (VaR, ES, stop-out probability, sizing).</w:t>
             </w:r>
           </w:p>
           <w:p>
@@ -581,14 +568,14 @@
                 <w:b/>
                 <w:sz w:val="24"/>
               </w:rPr>
-              <w:t>Establishing axis-specific predictability.</w:t>
+              <w:t>Axis-specific predictability.</w:t>
             </w:r>
             <w:r>
               <w:rPr>
                 <w:rFonts w:ascii="Times New Roman" w:hAnsi="Times New Roman"/>
                 <w:sz w:val="24"/>
               </w:rPr>
-              <w:t xml:space="preserve"> Determine, under one fixed protocol, on which axis — direction, magnitude, or risk — out-of-sample skill exists for daily FX, reported separately per axis.</w:t>
+              <w:t xml:space="preserve"> Under one fixed protocol, determine on which axis out-of-sample skill exists, reported separately.</w:t>
             </w:r>
           </w:p>
           <w:p>
@@ -604,14 +591,14 @@
                 <w:b/>
                 <w:sz w:val="24"/>
               </w:rPr>
-              <w:t>Benchmarking model complexity against a well-specified econometric baseline.</w:t>
+              <w:t>Model-complexity benchmarking.</w:t>
             </w:r>
             <w:r>
               <w:rPr>
                 <w:rFonts w:ascii="Times New Roman" w:hAnsi="Times New Roman"/>
                 <w:sz w:val="24"/>
               </w:rPr>
-              <w:t xml:space="preserve"> Compare linear HAR-type specifications with tree-based, recurrent, attention-based, and foundation-model alternatives, and systematic forecast combinations, under proper scoring rules and formal comparison tests.</w:t>
+              <w:t xml:space="preserve"> Compare HAR-type, tree-based, recurrent, attention-based, and foundation-model alternatives under proper scoring rules and formal tests.</w:t>
             </w:r>
           </w:p>
           <w:p>
@@ -627,14 +614,14 @@
                 <w:b/>
                 <w:sz w:val="24"/>
               </w:rPr>
-              <w:t>Quantifying the incremental value of additional information layers.</w:t>
+              <w:t>Incremental information value.</w:t>
             </w:r>
             <w:r>
               <w:rPr>
                 <w:rFonts w:ascii="Times New Roman" w:hAnsi="Times New Roman"/>
                 <w:sz w:val="24"/>
               </w:rPr>
-              <w:t xml:space="preserve"> Evaluate whether central-bank text, exogenous macro/cross-asset variables, and candlestick geometry [26] add predictive value, and whether causal filtering outperforms ordinary feature selection.</w:t>
+              <w:t xml:space="preserve"> Test whether central-bank text, exogenous/cross-asset variables, and candlestick geometry [26] add value, and whether causal filtering beats ordinary selection.</w:t>
             </w:r>
           </w:p>
           <w:p>
@@ -650,14 +637,14 @@
                 <w:b/>
                 <w:sz w:val="24"/>
               </w:rPr>
-              <w:t>Delivering calibrated uncertainty.</w:t>
+              <w:t>Calibrated uncertainty.</w:t>
             </w:r>
             <w:r>
               <w:rPr>
                 <w:rFonts w:ascii="Times New Roman" w:hAnsi="Times New Roman"/>
                 <w:sz w:val="24"/>
               </w:rPr>
-              <w:t xml:space="preserve"> Implement and validate adaptive conformal prediction for target coverage under distribution shift, verified empirically and by regime, with proper scoring rules and reliability diagnostics.</w:t>
+              <w:t xml:space="preserve"> Validate adaptive conformal prediction for target coverage under distribution shift.</w:t>
             </w:r>
           </w:p>
           <w:p>
@@ -673,14 +660,14 @@
                 <w:b/>
                 <w:sz w:val="24"/>
               </w:rPr>
-              <w:t>Converting forecasts into risk-controlled decisions.</w:t>
+              <w:t>Risk-controlled decisions.</w:t>
             </w:r>
             <w:r>
               <w:rPr>
                 <w:rFonts w:ascii="Times New Roman" w:hAnsi="Times New Roman"/>
                 <w:sz w:val="24"/>
               </w:rPr>
-              <w:t xml:space="preserve"> Produce a per-session decision record: forecast volatility, stop distance, stop-out probability by horizon, VaR/ES with formal backtests, and a ruin-constrained position size adjusted for portfolio correlation and slippage.</w:t>
+              <w:t xml:space="preserve"> Produce a per-session record: volatility, stop distance, stop-out probability, VaR/ES with backtests, ruin-constrained sizing.</w:t>
             </w:r>
           </w:p>
           <w:p>
@@ -696,14 +683,14 @@
                 <w:b/>
                 <w:sz w:val="24"/>
               </w:rPr>
-              <w:t>Reporting negative findings with quantified power.</w:t>
+              <w:t>Power-bounded negative findings.</w:t>
             </w:r>
             <w:r>
               <w:rPr>
                 <w:rFonts w:ascii="Times New Roman" w:hAnsi="Times New Roman"/>
                 <w:sz w:val="24"/>
               </w:rPr>
-              <w:t xml:space="preserve"> Report the MDES for every negative result, so each negative claim is bounded rather than open-ended.</w:t>
+              <w:t xml:space="preserve"> Report the MDES for every negative result.</w:t>
             </w:r>
           </w:p>
           <w:p>
@@ -719,14 +706,14 @@
                 <w:b/>
                 <w:sz w:val="24"/>
               </w:rPr>
-              <w:t>Engineering and operating a production decision support architecture.</w:t>
+              <w:t>Engineering a production architecture.</w:t>
             </w:r>
             <w:r>
               <w:rPr>
                 <w:rFonts w:ascii="Times New Roman" w:hAnsi="Times New Roman"/>
                 <w:sz w:val="24"/>
               </w:rPr>
-              <w:t xml:space="preserve"> Design, implement, and extend — throughout the sixteen weeks rather than only at the end — a five-layer software architecture (data pipeline, computation layer, versioned forecast artefacts, a documented API, and a web application) so every research layer is integrated as soon as it is completed and every displayed number stays traceable to its measurement (Proposed Method and System Architecture).</w:t>
+              <w:t xml:space="preserve"> Design and extend, across all sixteen weeks, a five-layer software architecture (pipeline, computation layer, versioned artefacts, API, web application) so every number stays traceable.</w:t>
             </w:r>
           </w:p>
         </w:tc>
@@ -760,7 +747,7 @@
                 <w:rFonts w:ascii="Times New Roman" w:hAnsi="Times New Roman"/>
                 <w:sz w:val="24"/>
               </w:rPr>
-              <w:t xml:space="preserve">This research focuses on </w:t>
+              <w:t xml:space="preserve">Daily-horizon decision support for six major USD pairs. The 2010–2025 sample splits into training, validation (selection only), and a held-out development-test segment scored once. A </w:t>
             </w:r>
             <w:r>
               <w:rPr>
@@ -768,14 +755,14 @@
                 <w:b/>
                 <w:sz w:val="24"/>
               </w:rPr>
-              <w:t>daily-horizon decision support for six major USD pairs</w:t>
+              <w:t>sealed evaluation set</w:t>
             </w:r>
             <w:r>
               <w:rPr>
                 <w:rFonts w:ascii="Times New Roman" w:hAnsi="Times New Roman"/>
                 <w:sz w:val="24"/>
               </w:rPr>
-              <w:t>: EUR/USD, GBP/USD, USD/JPY, AUD/USD, USD/CAD, USD/CHF. The development sample (2010–2025) is split into training, validation (model/hyper-parameter selection only), and a held-out development-test segment scored once, distinct from the sealed set below.</w:t>
+              <w:t xml:space="preserve"> — six cross pairs never used in development (EUR/GBP, EUR/JPY, GBP/JPY, AUD/JPY, EUR/CHF, NZD/USD) plus 2026 data for all twelve pairs — opens exactly once after the configuration is frozen, with no retuning after.</w:t>
             </w:r>
           </w:p>
           <w:p>
@@ -789,7 +776,7 @@
                 <w:rFonts w:ascii="Times New Roman" w:hAnsi="Times New Roman"/>
                 <w:sz w:val="24"/>
               </w:rPr>
-              <w:t xml:space="preserve">A </w:t>
+              <w:t xml:space="preserve">The primary source is one-minute bar data, from which daily bars and five-minute realized measures are computed; supplementary sources include the central-bank/macro calendar, exogenous daily series, and tick-derived transaction costs. Horizons are one, five, and twenty sessions (one-session default). The study explicitly does </w:t>
             </w:r>
             <w:r>
               <w:rPr>
@@ -797,57 +784,14 @@
                 <w:b/>
                 <w:sz w:val="24"/>
               </w:rPr>
-              <w:t>sealed evaluation set</w:t>
+              <w:t>not</w:t>
             </w:r>
             <w:r>
               <w:rPr>
                 <w:rFonts w:ascii="Times New Roman" w:hAnsi="Times New Roman"/>
                 <w:sz w:val="24"/>
               </w:rPr>
-              <w:t xml:space="preserve"> — six cross pairs never used in development (EUR/GBP, EUR/JPY, GBP/JPY, AUD/JPY, EUR/CHF, NZD/USD) plus 2026 data for all twelve pairs as available at a pre-specified cutoff — is opened exactly once after the final configuration is frozen in writing, with no retuning afterward. Because the sealed set includes calendar year 2026 while the study concludes before that year ends, "2026" means whatever the continuously operating daily pipeline has collected by the cutoff, not the completed year.</w:t>
-            </w:r>
-          </w:p>
-          <w:p>
-            <w:pPr>
-              <w:spacing w:after="100"/>
-              <w:ind w:firstLine="340"/>
-              <w:jc w:val="both"/>
-            </w:pPr>
-            <w:r>
-              <w:rPr>
-                <w:rFonts w:ascii="Times New Roman" w:hAnsi="Times New Roman"/>
-                <w:sz w:val="24"/>
-              </w:rPr>
-              <w:t>The primary source is one-minute historical bar data, from which daily bars and five-minute realized measures (variance, quarticity, bipower variation, signed semivariances) are computed. Supplementary sources: the central-bank/macro release calendar, daily exogenous series from a public economic data service, monetary-policy surprise measures, interest-rate differentials, and tick-derived transaction-cost measurements.</w:t>
-            </w:r>
-          </w:p>
-          <w:p>
-            <w:pPr>
-              <w:spacing w:after="100"/>
-              <w:ind w:firstLine="340"/>
-              <w:jc w:val="both"/>
-            </w:pPr>
-            <w:r>
-              <w:rPr>
-                <w:rFonts w:ascii="Times New Roman" w:hAnsi="Times New Roman"/>
-                <w:sz w:val="24"/>
-              </w:rPr>
-              <w:t xml:space="preserve">Forecast horizons are one, five, and twenty sessions, with one session the operational default; longer horizons are reported with their measured skill rather than presented as equivalent. The study explicitly does </w:t>
-            </w:r>
-            <w:r>
-              <w:rPr>
-                <w:rFonts w:ascii="Times New Roman" w:hAnsi="Times New Roman"/>
-                <w:b/>
-                <w:sz w:val="24"/>
-              </w:rPr>
-              <w:t>not</w:t>
-            </w:r>
-            <w:r>
-              <w:rPr>
-                <w:rFonts w:ascii="Times New Roman" w:hAnsi="Times New Roman"/>
-                <w:sz w:val="24"/>
-              </w:rPr>
-              <w:t xml:space="preserve"> attempt a profitable automated trading strategy — order execution, microstructure, market impact, sub-daily timing, and cross-asset portfolio optimisation are out of scope. Causality claims are limited to temporal predictive relationships in the Granger sense, not structural causal claims.</w:t>
+              <w:t xml:space="preserve"> target a profitable trading strategy — execution, microstructure, and sub-daily timing are out of scope; causality claims are limited to Granger-sense temporal precedence.</w:t>
             </w:r>
           </w:p>
         </w:tc>
@@ -879,38 +823,17 @@
             <w:r>
               <w:rPr>
                 <w:rFonts w:ascii="Times New Roman" w:hAnsi="Times New Roman"/>
-                <w:sz w:val="24"/>
-              </w:rPr>
-              <w:t xml:space="preserve">The primary research subject is </w:t>
-            </w:r>
-            <w:r>
-              <w:rPr>
-                <w:rFonts w:ascii="Times New Roman" w:hAnsi="Times New Roman"/>
                 <w:b/>
                 <w:sz w:val="24"/>
               </w:rPr>
-              <w:t>the statistical validation of decision support outputs for foreign exchange trading under a low signal-to-noise ratio</w:t>
+              <w:t>The statistical validation of decision support outputs for FX under a low signal-to-noise ratio</w:t>
             </w:r>
             <w:r>
               <w:rPr>
                 <w:rFonts w:ascii="Times New Roman" w:hAnsi="Times New Roman"/>
                 <w:sz w:val="24"/>
               </w:rPr>
-              <w:t>.</w:t>
-            </w:r>
-          </w:p>
-          <w:p>
-            <w:pPr>
-              <w:spacing w:after="100"/>
-              <w:ind w:firstLine="340"/>
-              <w:jc w:val="both"/>
-            </w:pPr>
-            <w:r>
-              <w:rPr>
-                <w:rFonts w:ascii="Times New Roman" w:hAnsi="Times New Roman"/>
-                <w:sz w:val="24"/>
-              </w:rPr>
-              <w:t>The study examines how forecast skill is attributed to a target axis and an information layer; how multiple-testing control, power analysis, leakage protection, and sealed-set validation combine to produce claims that survive replication; how calibrated forecasts and conformal sets convert into risk limits with a measured probability of ruin; and how this evidence should be presented so a user can distinguish what the system measures from what it merely assumes.</w:t>
+              <w:t>: how skill is attributed to an axis and an information layer; how multiple-testing control, power analysis, and sealed-set validation combine to produce replicable claims; how calibrated forecasts convert into risk limits with a measured ruin probability; and how this evidence should be presented so a user can separate what is measured from what is assumed.</w:t>
             </w:r>
           </w:p>
         </w:tc>
@@ -944,7 +867,7 @@
                 <w:rFonts w:ascii="Times New Roman" w:hAnsi="Times New Roman"/>
                 <w:sz w:val="24"/>
               </w:rPr>
-              <w:t xml:space="preserve">This section states what is proposed, labelling each item </w:t>
+              <w:t xml:space="preserve">Each item below is labelled </w:t>
             </w:r>
             <w:r>
               <w:rPr>
@@ -974,7 +897,7 @@
                 <w:rFonts w:ascii="Times New Roman" w:hAnsi="Times New Roman"/>
                 <w:sz w:val="24"/>
               </w:rPr>
-              <w:t xml:space="preserve"> to distinguish components already frozen from remaining work; nothing here is presented as finished until it appears with measured numbers in Expected Results or the defended thesis.</w:t>
+              <w:t>; nothing is a finished result until it appears with measured numbers in Expected Results.</w:t>
             </w:r>
           </w:p>
           <w:p>
@@ -1004,7 +927,7 @@
                 <w:b/>
                 <w:sz w:val="24"/>
               </w:rPr>
-              <w:t>Magnitude model — extended HAR.</w:t>
+              <w:t>Magnitude — extended HAR.</w:t>
             </w:r>
             <w:r>
               <w:rPr>
@@ -1026,7 +949,7 @@
                 <w:rFonts w:ascii="Times New Roman" w:hAnsi="Times New Roman"/>
                 <w:sz w:val="24"/>
               </w:rPr>
-              <w:t xml:space="preserve"> A heterogeneous-autoregressive specification on realized variance [7], extended with measurement-error correction [8] and jump/semivariance decomposition [9], selected over fourteen ML/DL challengers and 509 combinations under the Model Confidence Set [12].</w:t>
+              <w:t xml:space="preserve"> Heterogeneous-autoregressive on realized variance [7], extended with measurement-error correction [8] and jump/semivariance decomposition [9], selected over 14 ML/DL challengers and 509 combinations under the Model Confidence Set [12].</w:t>
             </w:r>
           </w:p>
           <w:p>
@@ -1042,7 +965,7 @@
                 <w:b/>
                 <w:sz w:val="24"/>
               </w:rPr>
-              <w:t>Direction/probability model — online expert combination.</w:t>
+              <w:t>Direction/probability — online expert combination.</w:t>
             </w:r>
             <w:r>
               <w:rPr>
@@ -1064,7 +987,7 @@
                 <w:rFonts w:ascii="Times New Roman" w:hAnsi="Times New Roman"/>
                 <w:sz w:val="24"/>
               </w:rPr>
-              <w:t xml:space="preserve"> A Hedge-style combination [13] of four sub-models (climatology, persistence, σ̂-only, σ̂+regime), re-weighted every session; challenged by regularised linear, tree, recurrent, attention, and foundation-model alternatives.</w:t>
+              <w:t xml:space="preserve"> Hedge-style combination [13] of four sub-models, re-weighted every session; challenged by linear, tree, recurrent, attention, and foundation-model alternatives.</w:t>
             </w:r>
           </w:p>
           <w:p>
@@ -1080,7 +1003,7 @@
                 <w:b/>
                 <w:sz w:val="24"/>
               </w:rPr>
-              <w:t>Causal discovery module.</w:t>
+              <w:t>Causal discovery.</w:t>
             </w:r>
             <w:r>
               <w:rPr>
@@ -1095,14 +1018,14 @@
                 <w:i/>
                 <w:sz w:val="24"/>
               </w:rPr>
-              <w:t>(implemented — validation role; forecast-integration tested and deferred)</w:t>
+              <w:t>(implemented — validation role)</w:t>
             </w:r>
             <w:r>
               <w:rPr>
                 <w:rFonts w:ascii="Times New Roman" w:hAnsi="Times New Roman"/>
                 <w:sz w:val="24"/>
               </w:rPr>
-              <w:t xml:space="preserve"> Five triangulated methods decide which exogenous variable is trusted; using the estimated effect to adjust the forecast directly was tested and found not yet effective (below; Deferred / Future Work).</w:t>
+              <w:t xml:space="preserve"> Five triangulated methods decide which exogenous variable is trusted; using the effect to adjust the forecast directly was tested and found not yet effective (Deferred / Future Work).</w:t>
             </w:r>
           </w:p>
           <w:p>
@@ -1118,7 +1041,7 @@
                 <w:b/>
                 <w:sz w:val="24"/>
               </w:rPr>
-              <w:t>Calibration — Mondrian-stratified adaptive conformal inference.</w:t>
+              <w:t>Calibration — Mondrian-stratified ACI.</w:t>
             </w:r>
             <w:r>
               <w:rPr>
@@ -1140,7 +1063,7 @@
                 <w:rFonts w:ascii="Times New Roman" w:hAnsi="Times New Roman"/>
                 <w:sz w:val="24"/>
               </w:rPr>
-              <w:t xml:space="preserve"> ACI [19] stratified by volatility regime [20], 1.2-point maximum calibration deviation versus 2.4–3.2 for four alternatives. </w:t>
+              <w:t xml:space="preserve"> [19], [20], 1.2-point maximum deviation vs. 2.4–3.2 for alternatives. </w:t>
             </w:r>
             <w:r>
               <w:rPr>
@@ -1155,7 +1078,7 @@
                 <w:rFonts w:ascii="Times New Roman" w:hAnsi="Times New Roman"/>
                 <w:sz w:val="24"/>
               </w:rPr>
-              <w:t xml:space="preserve"> A PID-controller-based online update [30] is evaluated as a candidate refinement for the below-target coverage observed during drawdown.</w:t>
+              <w:t xml:space="preserve"> PID-controller online update [30] for below-target coverage during drawdown.</w:t>
             </w:r>
           </w:p>
           <w:p>
@@ -1171,7 +1094,7 @@
                 <w:b/>
                 <w:sz w:val="24"/>
               </w:rPr>
-              <w:t>Risk/decision module.</w:t>
+              <w:t>Risk/decision.</w:t>
             </w:r>
             <w:r>
               <w:rPr>
@@ -1193,7 +1116,7 @@
                 <w:rFonts w:ascii="Times New Roman" w:hAnsi="Times New Roman"/>
                 <w:sz w:val="24"/>
               </w:rPr>
-              <w:t xml:space="preserve"> Empirical-quantile VaR/ES with Kupiec [21], Christoffersen [22], and dynamic-quantile [23] backtests and a consistent joint scoring function [24]; Kelly-derived position size [25] capped by an estimated probability of ruin. </w:t>
+              <w:t xml:space="preserve"> Empirical-quantile VaR/ES with Kupiec [21], Christoffersen [22], dynamic-quantile [23] backtests and a consistent scoring function [24]; Kelly-derived sizing [25] capped by ruin probability. </w:t>
             </w:r>
             <w:r>
               <w:rPr>
@@ -1208,7 +1131,7 @@
                 <w:rFonts w:ascii="Times New Roman" w:hAnsi="Times New Roman"/>
                 <w:sz w:val="24"/>
               </w:rPr>
-              <w:t xml:space="preserve"> Portfolio-correlation adjustment and a slippage coefficient measured from observed stop-loss executions.</w:t>
+              <w:t xml:space="preserve"> Portfolio-correlation adjustment and a measured slippage coefficient.</w:t>
             </w:r>
           </w:p>
           <w:p>
@@ -1236,7 +1159,7 @@
                 <w:rFonts w:ascii="Times New Roman" w:hAnsi="Times New Roman"/>
                 <w:sz w:val="24"/>
               </w:rPr>
-              <w:t xml:space="preserve">The exogenous layer needs a method that conditions on many candidates simultaneously rather than pairwise, separates a direct link from a shared-confound artefact, and plugs into the same false-discovery control as the price-pattern families. The </w:t>
+              <w:t xml:space="preserve">The exogenous layer needs a method conditioning on many candidates simultaneously, separating a direct link from a shared confound, under the same false-discovery control as the pattern families. The </w:t>
             </w:r>
             <w:r>
               <w:rPr>
@@ -1244,14 +1167,14 @@
                 <w:b/>
                 <w:sz w:val="24"/>
               </w:rPr>
-              <w:t>official decision gate</w:t>
+              <w:t>official gate</w:t>
             </w:r>
             <w:r>
               <w:rPr>
                 <w:rFonts w:ascii="Times New Roman" w:hAnsi="Times New Roman"/>
                 <w:sz w:val="24"/>
               </w:rPr>
-              <w:t xml:space="preserve"> for the frozen exogenous feature-selection ablation is Granger-type nested-regression F-testing under step-down Westfall–Young control [4]. Beyond it, four independent, non-self-written methods triangulate the result — this is the answer to "which algorithm, and how do you know it is real causality rather than random correlation":</w:t>
+              <w:t xml:space="preserve"> is Granger-type F-testing under step-down Westfall–Young control [4]. Four independent methods triangulate the result — the answer to "which algorithm, and how do you know it is causality, not correlation":</w:t>
             </w:r>
           </w:p>
           <w:tbl>
@@ -1320,7 +1243,7 @@
                       <w:b/>
                       <w:sz w:val="21"/>
                     </w:rPr>
-                    <w:t>Question answered</w:t>
+                    <w:t>Question</w:t>
                   </w:r>
                 </w:p>
               </w:tc>
@@ -1372,21 +1295,7 @@
                       <w:rFonts w:ascii="Times New Roman" w:hAnsi="Times New Roman"/>
                       <w:sz w:val="21"/>
                     </w:rPr>
-                    <w:t xml:space="preserve"> [18], [29] (</w:t>
-                  </w:r>
-                  <w:r>
-                    <w:rPr>
-                      <w:rFonts w:ascii="Consolas" w:hAnsi="Consolas"/>
-                      <w:sz w:val="21"/>
-                    </w:rPr>
-                    <w:t>tigramite</w:t>
-                  </w:r>
-                  <w:r>
-                    <w:rPr>
-                      <w:rFonts w:ascii="Times New Roman" w:hAnsi="Times New Roman"/>
-                      <w:sz w:val="21"/>
-                    </w:rPr>
-                    <w:t>)</w:t>
+                    <w:t xml:space="preserve"> [18], [29]</w:t>
                   </w:r>
                 </w:p>
               </w:tc>
@@ -1405,7 +1314,7 @@
                       <w:rFonts w:ascii="Times New Roman" w:hAnsi="Times New Roman"/>
                       <w:sz w:val="21"/>
                     </w:rPr>
-                    <w:t>Does the link survive simultaneous conditioning on the other candidates?</w:t>
+                    <w:t>Survives simultaneous conditioning?</w:t>
                   </w:r>
                 </w:p>
               </w:tc>
@@ -1424,7 +1333,7 @@
                       <w:rFonts w:ascii="Times New Roman" w:hAnsi="Times New Roman"/>
                       <w:sz w:val="21"/>
                     </w:rPr>
-                    <w:t>VIX survives on every pair tested; gold-implied volatility (GVZCLS) looks causal alone but loses significance once conditioned on VIX — the concrete confound-vs-cause distinction pairwise Granger cannot make</w:t>
+                    <w:t>VIX survives on every pair; gold-implied volatility (GVZCLS) loses significance once conditioned on VIX — the confound-vs-cause distinction pairwise Granger cannot make</w:t>
                   </w:r>
                 </w:p>
               </w:tc>
@@ -1449,28 +1358,14 @@
                       <w:b/>
                       <w:sz w:val="21"/>
                     </w:rPr>
-                    <w:t>Double Machine Learning</w:t>
+                    <w:t>Double ML</w:t>
                   </w:r>
                   <w:r>
                     <w:rPr>
                       <w:rFonts w:ascii="Times New Roman" w:hAnsi="Times New Roman"/>
                       <w:sz w:val="21"/>
                     </w:rPr>
-                    <w:t xml:space="preserve"> [33] (</w:t>
-                  </w:r>
-                  <w:r>
-                    <w:rPr>
-                      <w:rFonts w:ascii="Consolas" w:hAnsi="Consolas"/>
-                      <w:sz w:val="21"/>
-                    </w:rPr>
-                    <w:t>doubleml</w:t>
-                  </w:r>
-                  <w:r>
-                    <w:rPr>
-                      <w:rFonts w:ascii="Times New Roman" w:hAnsi="Times New Roman"/>
-                      <w:sz w:val="21"/>
-                    </w:rPr>
-                    <w:t>)</w:t>
+                    <w:t xml:space="preserve"> [33]</w:t>
                   </w:r>
                 </w:p>
               </w:tc>
@@ -1489,7 +1384,7 @@
                       <w:rFonts w:ascii="Times New Roman" w:hAnsi="Times New Roman"/>
                       <w:sz w:val="21"/>
                     </w:rPr>
-                    <w:t xml:space="preserve">What is the effect </w:t>
+                    <w:t xml:space="preserve">Effect </w:t>
                   </w:r>
                   <w:r>
                     <w:rPr>
@@ -1504,7 +1399,7 @@
                       <w:rFonts w:ascii="Times New Roman" w:hAnsi="Times New Roman"/>
                       <w:sz w:val="21"/>
                     </w:rPr>
-                    <w:t>, with a nonlinear nuisance model?</w:t>
+                    <w:t>, nonlinear nuisance model?</w:t>
                   </w:r>
                 </w:p>
               </w:tc>
@@ -1523,7 +1418,7 @@
                       <w:rFonts w:ascii="Times New Roman" w:hAnsi="Times New Roman"/>
                       <w:sz w:val="21"/>
                     </w:rPr>
-                    <w:t xml:space="preserve">VIX effect positive, Holm-significant in </w:t>
+                    <w:t xml:space="preserve">Positive, Holm-significant in </w:t>
                   </w:r>
                   <w:r>
                     <w:rPr>
@@ -1538,7 +1433,7 @@
                       <w:rFonts w:ascii="Times New Roman" w:hAnsi="Times New Roman"/>
                       <w:sz w:val="21"/>
                     </w:rPr>
-                    <w:t xml:space="preserve"> pairs (θ = 0.070–0.186) — the strongest, most consistent result in the triangulation</w:t>
+                    <w:t xml:space="preserve"> pairs — strongest result</w:t>
                   </w:r>
                 </w:p>
               </w:tc>
@@ -1570,21 +1465,7 @@
                       <w:rFonts w:ascii="Times New Roman" w:hAnsi="Times New Roman"/>
                       <w:sz w:val="21"/>
                     </w:rPr>
-                    <w:t xml:space="preserve"> [34] (</w:t>
-                  </w:r>
-                  <w:r>
-                    <w:rPr>
-                      <w:rFonts w:ascii="Consolas" w:hAnsi="Consolas"/>
-                      <w:sz w:val="21"/>
-                    </w:rPr>
-                    <w:t>econml</w:t>
-                  </w:r>
-                  <w:r>
-                    <w:rPr>
-                      <w:rFonts w:ascii="Times New Roman" w:hAnsi="Times New Roman"/>
-                      <w:sz w:val="21"/>
-                    </w:rPr>
-                    <w:t>)</w:t>
+                    <w:t xml:space="preserve"> [34]</w:t>
                   </w:r>
                 </w:p>
               </w:tc>
@@ -1603,7 +1484,7 @@
                       <w:rFonts w:ascii="Times New Roman" w:hAnsi="Times New Roman"/>
                       <w:sz w:val="21"/>
                     </w:rPr>
-                    <w:t>Is the effect regime-dependent?</w:t>
+                    <w:t>Regime-dependent?</w:t>
                   </w:r>
                 </w:p>
               </w:tc>
@@ -1622,7 +1503,7 @@
                       <w:rFonts w:ascii="Times New Roman" w:hAnsi="Times New Roman"/>
                       <w:sz w:val="21"/>
                     </w:rPr>
-                    <w:t>Heterogeneous but not consistent across pairs (4/6 increase with stress, 2 do not) — no single rule generalises</w:t>
+                    <w:t>Heterogeneous but inconsistent across pairs — no rule generalises</w:t>
                   </w:r>
                 </w:p>
               </w:tc>
@@ -1654,21 +1535,7 @@
                       <w:rFonts w:ascii="Times New Roman" w:hAnsi="Times New Roman"/>
                       <w:sz w:val="21"/>
                     </w:rPr>
-                    <w:t xml:space="preserve"> [28] (</w:t>
-                  </w:r>
-                  <w:r>
-                    <w:rPr>
-                      <w:rFonts w:ascii="Consolas" w:hAnsi="Consolas"/>
-                      <w:sz w:val="21"/>
-                    </w:rPr>
-                    <w:t>pycausalimpact</w:t>
-                  </w:r>
-                  <w:r>
-                    <w:rPr>
-                      <w:rFonts w:ascii="Times New Roman" w:hAnsi="Times New Roman"/>
-                      <w:sz w:val="21"/>
-                    </w:rPr>
-                    <w:t>)</w:t>
+                    <w:t xml:space="preserve"> [28]</w:t>
                   </w:r>
                 </w:p>
               </w:tc>
@@ -1702,7 +1569,7 @@
                       <w:rFonts w:ascii="Times New Roman" w:hAnsi="Times New Roman"/>
                       <w:sz w:val="21"/>
                     </w:rPr>
-                    <w:t xml:space="preserve"> specific event move volatility past its counterfactual?</w:t>
+                    <w:t xml:space="preserve"> event move volatility?</w:t>
                   </w:r>
                 </w:p>
               </w:tc>
@@ -1721,7 +1588,7 @@
                       <w:rFonts w:ascii="Times New Roman" w:hAnsi="Times New Roman"/>
                       <w:sz w:val="21"/>
                     </w:rPr>
-                    <w:t>Piloted on 20 ECB meetings: 6/20 significant after FDR correction (vs. ~5% expected under noise), all positive</w:t>
+                    <w:t>6/20 ECB meetings significant after FDR (vs. ~5% under noise)</w:t>
                   </w:r>
                 </w:p>
               </w:tc>
@@ -1749,7 +1616,7 @@
                 <w:rFonts w:ascii="Times New Roman" w:hAnsi="Times New Roman"/>
                 <w:sz w:val="24"/>
               </w:rPr>
-              <w:t>Four independently authored methods, resting on different assumptions (linear/nonlinear, pairwise/simultaneous, existence/magnitude/heterogeneity/single-event), converging on the same variable is stronger evidence than any single p-value — this triangulation, not one algorithm, is how the causality-versus-correlation question is answered. Consistent with the Research Scope, none of the five methods is presented as establishing structural causality; every statement remains a temporal-precedence or potential-outcomes claim under its own method's assumptions.</w:t>
+              <w:t>Four independently authored methods, different assumptions, converging on one variable is stronger evidence than any single p-value; none establishes structural causality — every claim remains temporal-precedence or potential-outcomes under its method's assumptions.</w:t>
             </w:r>
           </w:p>
           <w:p>
@@ -1764,14 +1631,14 @@
                 <w:b/>
                 <w:sz w:val="24"/>
               </w:rPr>
-              <w:t>Two roles, only one shipped.</w:t>
+              <w:t>Two roles, one shipped.</w:t>
             </w:r>
             <w:r>
               <w:rPr>
                 <w:rFonts w:ascii="Times New Roman" w:hAnsi="Times New Roman"/>
                 <w:sz w:val="24"/>
               </w:rPr>
-              <w:t xml:space="preserve"> The triangulation's </w:t>
+              <w:t xml:space="preserve"> The </w:t>
             </w:r>
             <w:r>
               <w:rPr>
@@ -1786,7 +1653,7 @@
                 <w:rFonts w:ascii="Times New Roman" w:hAnsi="Times New Roman"/>
                 <w:sz w:val="24"/>
               </w:rPr>
-              <w:t xml:space="preserve">: it is the actual filter that kept VIX and dropped ten other candidates from the frozen feature set. Its </w:t>
+              <w:t xml:space="preserve"> — it is the actual filter behind the frozen feature set. The </w:t>
             </w:r>
             <w:r>
               <w:rPr>
@@ -1794,14 +1661,29 @@
                 <w:b/>
                 <w:sz w:val="24"/>
               </w:rPr>
-              <w:t>forecast-performance role — using the effect to directly adjust the production forecast (constant and regime-conditional overlays) — produced no significant QLIKE improvement in any pair after Holm correction</w:t>
+              <w:t>forecast-performance role</w:t>
             </w:r>
             <w:r>
               <w:rPr>
                 <w:rFonts w:ascii="Times New Roman" w:hAnsi="Times New Roman"/>
                 <w:sz w:val="24"/>
               </w:rPr>
-              <w:t>, most plausibly because the HAR baseline already absorbs the information indirectly. Consistent with this thesis's negative-findings policy, this application is not deployed and moves to Deferred / Future Work rather than the remaining timeline.</w:t>
+              <w:t xml:space="preserve"> (adjusting the forecast directly) was tested and produced </w:t>
+            </w:r>
+            <w:r>
+              <w:rPr>
+                <w:rFonts w:ascii="Times New Roman" w:hAnsi="Times New Roman"/>
+                <w:b/>
+                <w:sz w:val="24"/>
+              </w:rPr>
+              <w:t>no significant QLIKE improvement after Holm correction</w:t>
+            </w:r>
+            <w:r>
+              <w:rPr>
+                <w:rFonts w:ascii="Times New Roman" w:hAnsi="Times New Roman"/>
+                <w:sz w:val="24"/>
+              </w:rPr>
+              <w:t>, plausibly because HAR already absorbs the information indirectly; consistent with this thesis's negative-findings policy, it moves to Deferred / Future Work.</w:t>
             </w:r>
           </w:p>
           <w:p>
@@ -1830,7 +1712,14 @@
                 <w:i/>
                 <w:sz w:val="24"/>
               </w:rPr>
-              <w:t>(Data pipeline and API: implemented and operating on a daily schedule; extensions in the Research Plan are proposed.)</w:t>
+              <w:t>(Pipeline and API: implemented, operating daily; extensions below are proposed.)</w:t>
+            </w:r>
+            <w:r>
+              <w:rPr>
+                <w:rFonts w:ascii="Times New Roman" w:hAnsi="Times New Roman"/>
+                <w:sz w:val="24"/>
+              </w:rPr>
+              <w:t xml:space="preserve"> Five layers share one computation layer across two deployment targets, so the live site and thesis numbers share one code path:</w:t>
             </w:r>
           </w:p>
           <w:p>
@@ -1844,7 +1733,22 @@
                 <w:rFonts w:ascii="Times New Roman" w:hAnsi="Times New Roman"/>
                 <w:sz w:val="24"/>
               </w:rPr>
-              <w:t>Five layers share one computation layer across two deployment targets, so the live site and the numbers computed for the thesis come from the same code path:</w:t>
+              <w:t xml:space="preserve">1. </w:t>
+            </w:r>
+            <w:r>
+              <w:rPr>
+                <w:rFonts w:ascii="Times New Roman" w:hAnsi="Times New Roman"/>
+                <w:b/>
+                <w:sz w:val="24"/>
+              </w:rPr>
+              <w:t>Data pipeline (`collect/`).</w:t>
+            </w:r>
+            <w:r>
+              <w:rPr>
+                <w:rFonts w:ascii="Times New Roman" w:hAnsi="Times New Roman"/>
+                <w:sz w:val="24"/>
+              </w:rPr>
+              <w:t xml:space="preserve"> One-time historical bootstrap plus a daily job (four times/day via CI) building daily bars, realized measures, and the macro calendar.</w:t>
             </w:r>
           </w:p>
           <w:p>
@@ -1858,7 +1762,7 @@
                 <w:rFonts w:ascii="Times New Roman" w:hAnsi="Times New Roman"/>
                 <w:sz w:val="24"/>
               </w:rPr>
-              <w:t xml:space="preserve">1. </w:t>
+              <w:t xml:space="preserve">2. </w:t>
             </w:r>
             <w:r>
               <w:rPr>
@@ -1866,42 +1770,14 @@
                 <w:b/>
                 <w:sz w:val="24"/>
               </w:rPr>
-              <w:t>Data pipeline (`collect/`).</w:t>
+              <w:t>Data store (`data/`).</w:t>
             </w:r>
             <w:r>
               <w:rPr>
                 <w:rFonts w:ascii="Times New Roman" w:hAnsi="Times New Roman"/>
                 <w:sz w:val="24"/>
               </w:rPr>
-              <w:t xml:space="preserve"> A one-time historical bootstrap plus a daily job (</w:t>
-            </w:r>
-            <w:r>
-              <w:rPr>
-                <w:rFonts w:ascii="Consolas" w:hAnsi="Consolas"/>
-                <w:sz w:val="24"/>
-              </w:rPr>
-              <w:t>live_fx.py</w:t>
-            </w:r>
-            <w:r>
-              <w:rPr>
-                <w:rFonts w:ascii="Times New Roman" w:hAnsi="Times New Roman"/>
-                <w:sz w:val="24"/>
-              </w:rPr>
-              <w:t xml:space="preserve">, </w:t>
-            </w:r>
-            <w:r>
-              <w:rPr>
-                <w:rFonts w:ascii="Consolas" w:hAnsi="Consolas"/>
-                <w:sz w:val="24"/>
-              </w:rPr>
-              <w:t>lich_su_kien.py</w:t>
-            </w:r>
-            <w:r>
-              <w:rPr>
-                <w:rFonts w:ascii="Times New Roman" w:hAnsi="Times New Roman"/>
-                <w:sz w:val="24"/>
-              </w:rPr>
-              <w:t>, run four times a day via CI) build daily bars, five-minute realized measures, and the macro/central-bank calendar.</w:t>
+              <w:t xml:space="preserve"> Frozen historical CSVs kept separate from a daily-overwritten live store, so development and sealed segments cannot be silently mixed.</w:t>
             </w:r>
           </w:p>
           <w:p>
@@ -1915,7 +1791,7 @@
                 <w:rFonts w:ascii="Times New Roman" w:hAnsi="Times New Roman"/>
                 <w:sz w:val="24"/>
               </w:rPr>
-              <w:t xml:space="preserve">2. </w:t>
+              <w:t xml:space="preserve">3. </w:t>
             </w:r>
             <w:r>
               <w:rPr>
@@ -1923,14 +1799,14 @@
                 <w:b/>
                 <w:sz w:val="24"/>
               </w:rPr>
-              <w:t>Data store (`data/`).</w:t>
+              <w:t>Computation layer (`src/`, `api/cache.py`).</w:t>
             </w:r>
             <w:r>
               <w:rPr>
                 <w:rFonts w:ascii="Times New Roman" w:hAnsi="Times New Roman"/>
                 <w:sz w:val="24"/>
               </w:rPr>
-              <w:t xml:space="preserve"> Frozen historical CSVs are kept separate from a daily-overwritten live store, so development and sealed-evaluation segments cannot be silently mixed by a pipeline bug.</w:t>
+              <w:t xml:space="preserve"> Series join, HAR forecast, calibration, and sizing run in one process, no serialisation boundary.</w:t>
             </w:r>
           </w:p>
           <w:p>
@@ -1944,7 +1820,7 @@
                 <w:rFonts w:ascii="Times New Roman" w:hAnsi="Times New Roman"/>
                 <w:sz w:val="24"/>
               </w:rPr>
-              <w:t xml:space="preserve">3. </w:t>
+              <w:t xml:space="preserve">4. </w:t>
             </w:r>
             <w:r>
               <w:rPr>
@@ -1952,14 +1828,84 @@
                 <w:b/>
                 <w:sz w:val="24"/>
               </w:rPr>
-              <w:t>Computation layer (`src/`, `api/cache.py`).</w:t>
+              <w:t>API (`api/`, FastAPI).</w:t>
             </w:r>
             <w:r>
               <w:rPr>
                 <w:rFonts w:ascii="Times New Roman" w:hAnsi="Times New Roman"/>
                 <w:sz w:val="24"/>
               </w:rPr>
-              <w:t xml:space="preserve"> The series join, HAR forecast, three-class combination, conformal calibration, and risk/sizing functions run in one process, with no serialisation boundary to the layer that serves them.</w:t>
+              <w:t xml:space="preserve"> One router per concern (</w:t>
+            </w:r>
+            <w:r>
+              <w:rPr>
+                <w:rFonts w:ascii="Consolas" w:hAnsi="Consolas"/>
+                <w:sz w:val="24"/>
+              </w:rPr>
+              <w:t>meta</w:t>
+            </w:r>
+            <w:r>
+              <w:rPr>
+                <w:rFonts w:ascii="Times New Roman" w:hAnsi="Times New Roman"/>
+                <w:sz w:val="24"/>
+              </w:rPr>
+              <w:t xml:space="preserve">, </w:t>
+            </w:r>
+            <w:r>
+              <w:rPr>
+                <w:rFonts w:ascii="Consolas" w:hAnsi="Consolas"/>
+                <w:sz w:val="24"/>
+              </w:rPr>
+              <w:t>market</w:t>
+            </w:r>
+            <w:r>
+              <w:rPr>
+                <w:rFonts w:ascii="Times New Roman" w:hAnsi="Times New Roman"/>
+                <w:sz w:val="24"/>
+              </w:rPr>
+              <w:t xml:space="preserve">, </w:t>
+            </w:r>
+            <w:r>
+              <w:rPr>
+                <w:rFonts w:ascii="Consolas" w:hAnsi="Consolas"/>
+                <w:sz w:val="24"/>
+              </w:rPr>
+              <w:t>forecast</w:t>
+            </w:r>
+            <w:r>
+              <w:rPr>
+                <w:rFonts w:ascii="Times New Roman" w:hAnsi="Times New Roman"/>
+                <w:sz w:val="24"/>
+              </w:rPr>
+              <w:t xml:space="preserve">, </w:t>
+            </w:r>
+            <w:r>
+              <w:rPr>
+                <w:rFonts w:ascii="Consolas" w:hAnsi="Consolas"/>
+                <w:sz w:val="24"/>
+              </w:rPr>
+              <w:t>risk</w:t>
+            </w:r>
+            <w:r>
+              <w:rPr>
+                <w:rFonts w:ascii="Times New Roman" w:hAnsi="Times New Roman"/>
+                <w:sz w:val="24"/>
+              </w:rPr>
+              <w:t xml:space="preserve">, </w:t>
+            </w:r>
+            <w:r>
+              <w:rPr>
+                <w:rFonts w:ascii="Consolas" w:hAnsi="Consolas"/>
+                <w:sz w:val="24"/>
+              </w:rPr>
+              <w:t>admin</w:t>
+            </w:r>
+            <w:r>
+              <w:rPr>
+                <w:rFonts w:ascii="Times New Roman" w:hAnsi="Times New Roman"/>
+                <w:sz w:val="24"/>
+              </w:rPr>
+              <w:t>) with Pydantic models, exposing endpoints extended through the Research Plan.</w:t>
             </w:r>
           </w:p>
           <w:p>
@@ -1973,7 +1919,7 @@
                 <w:rFonts w:ascii="Times New Roman" w:hAnsi="Times New Roman"/>
                 <w:sz w:val="24"/>
               </w:rPr>
-              <w:t xml:space="preserve">4. </w:t>
+              <w:t xml:space="preserve">5. </w:t>
             </w:r>
             <w:r>
               <w:rPr>
@@ -1981,266 +1927,14 @@
                 <w:b/>
                 <w:sz w:val="24"/>
               </w:rPr>
-              <w:t>API (`api/`, FastAPI).</w:t>
+              <w:t>Web application.</w:t>
             </w:r>
             <w:r>
               <w:rPr>
                 <w:rFonts w:ascii="Times New Roman" w:hAnsi="Times New Roman"/>
                 <w:sz w:val="24"/>
               </w:rPr>
-              <w:t xml:space="preserve"> One router per concern (</w:t>
-            </w:r>
-            <w:r>
-              <w:rPr>
-                <w:rFonts w:ascii="Consolas" w:hAnsi="Consolas"/>
-                <w:sz w:val="24"/>
-              </w:rPr>
-              <w:t>meta</w:t>
-            </w:r>
-            <w:r>
-              <w:rPr>
-                <w:rFonts w:ascii="Times New Roman" w:hAnsi="Times New Roman"/>
-                <w:sz w:val="24"/>
-              </w:rPr>
-              <w:t xml:space="preserve">, </w:t>
-            </w:r>
-            <w:r>
-              <w:rPr>
-                <w:rFonts w:ascii="Consolas" w:hAnsi="Consolas"/>
-                <w:sz w:val="24"/>
-              </w:rPr>
-              <w:t>market</w:t>
-            </w:r>
-            <w:r>
-              <w:rPr>
-                <w:rFonts w:ascii="Times New Roman" w:hAnsi="Times New Roman"/>
-                <w:sz w:val="24"/>
-              </w:rPr>
-              <w:t xml:space="preserve">, </w:t>
-            </w:r>
-            <w:r>
-              <w:rPr>
-                <w:rFonts w:ascii="Consolas" w:hAnsi="Consolas"/>
-                <w:sz w:val="24"/>
-              </w:rPr>
-              <w:t>forecast</w:t>
-            </w:r>
-            <w:r>
-              <w:rPr>
-                <w:rFonts w:ascii="Times New Roman" w:hAnsi="Times New Roman"/>
-                <w:sz w:val="24"/>
-              </w:rPr>
-              <w:t xml:space="preserve">, </w:t>
-            </w:r>
-            <w:r>
-              <w:rPr>
-                <w:rFonts w:ascii="Consolas" w:hAnsi="Consolas"/>
-                <w:sz w:val="24"/>
-              </w:rPr>
-              <w:t>risk</w:t>
-            </w:r>
-            <w:r>
-              <w:rPr>
-                <w:rFonts w:ascii="Times New Roman" w:hAnsi="Times New Roman"/>
-                <w:sz w:val="24"/>
-              </w:rPr>
-              <w:t xml:space="preserve">, </w:t>
-            </w:r>
-            <w:r>
-              <w:rPr>
-                <w:rFonts w:ascii="Consolas" w:hAnsi="Consolas"/>
-                <w:sz w:val="24"/>
-              </w:rPr>
-              <w:t>admin</w:t>
-            </w:r>
-            <w:r>
-              <w:rPr>
-                <w:rFonts w:ascii="Times New Roman" w:hAnsi="Times New Roman"/>
-                <w:sz w:val="24"/>
-              </w:rPr>
-              <w:t>) with Pydantic response models, already exposing the endpoints extended through the Research Plan below (</w:t>
-            </w:r>
-            <w:r>
-              <w:rPr>
-                <w:rFonts w:ascii="Consolas" w:hAnsi="Consolas"/>
-                <w:sz w:val="24"/>
-              </w:rPr>
-              <w:t>/health</w:t>
-            </w:r>
-            <w:r>
-              <w:rPr>
-                <w:rFonts w:ascii="Times New Roman" w:hAnsi="Times New Roman"/>
-                <w:sz w:val="24"/>
-              </w:rPr>
-              <w:t xml:space="preserve">, </w:t>
-            </w:r>
-            <w:r>
-              <w:rPr>
-                <w:rFonts w:ascii="Consolas" w:hAnsi="Consolas"/>
-                <w:sz w:val="24"/>
-              </w:rPr>
-              <w:t>/meta</w:t>
-            </w:r>
-            <w:r>
-              <w:rPr>
-                <w:rFonts w:ascii="Times New Roman" w:hAnsi="Times New Roman"/>
-                <w:sz w:val="24"/>
-              </w:rPr>
-              <w:t xml:space="preserve">, </w:t>
-            </w:r>
-            <w:r>
-              <w:rPr>
-                <w:rFonts w:ascii="Consolas" w:hAnsi="Consolas"/>
-                <w:sz w:val="24"/>
-              </w:rPr>
-              <w:t>/series</w:t>
-            </w:r>
-            <w:r>
-              <w:rPr>
-                <w:rFonts w:ascii="Times New Roman" w:hAnsi="Times New Roman"/>
-                <w:sz w:val="24"/>
-              </w:rPr>
-              <w:t xml:space="preserve">, </w:t>
-            </w:r>
-            <w:r>
-              <w:rPr>
-                <w:rFonts w:ascii="Consolas" w:hAnsi="Consolas"/>
-                <w:sz w:val="24"/>
-              </w:rPr>
-              <w:t>/indicators</w:t>
-            </w:r>
-            <w:r>
-              <w:rPr>
-                <w:rFonts w:ascii="Times New Roman" w:hAnsi="Times New Roman"/>
-                <w:sz w:val="24"/>
-              </w:rPr>
-              <w:t xml:space="preserve">, </w:t>
-            </w:r>
-            <w:r>
-              <w:rPr>
-                <w:rFonts w:ascii="Consolas" w:hAnsi="Consolas"/>
-                <w:sz w:val="24"/>
-              </w:rPr>
-              <w:t>/forecast</w:t>
-            </w:r>
-            <w:r>
-              <w:rPr>
-                <w:rFonts w:ascii="Times New Roman" w:hAnsi="Times New Roman"/>
-                <w:sz w:val="24"/>
-              </w:rPr>
-              <w:t xml:space="preserve">, </w:t>
-            </w:r>
-            <w:r>
-              <w:rPr>
-                <w:rFonts w:ascii="Consolas" w:hAnsi="Consolas"/>
-                <w:sz w:val="24"/>
-              </w:rPr>
-              <w:t>/forecast_series</w:t>
-            </w:r>
-            <w:r>
-              <w:rPr>
-                <w:rFonts w:ascii="Times New Roman" w:hAnsi="Times New Roman"/>
-                <w:sz w:val="24"/>
-              </w:rPr>
-              <w:t xml:space="preserve">, </w:t>
-            </w:r>
-            <w:r>
-              <w:rPr>
-                <w:rFonts w:ascii="Consolas" w:hAnsi="Consolas"/>
-                <w:sz w:val="24"/>
-              </w:rPr>
-              <w:t>/forecast_next</w:t>
-            </w:r>
-            <w:r>
-              <w:rPr>
-                <w:rFonts w:ascii="Times New Roman" w:hAnsi="Times New Roman"/>
-                <w:sz w:val="24"/>
-              </w:rPr>
-              <w:t xml:space="preserve">, </w:t>
-            </w:r>
-            <w:r>
-              <w:rPr>
-                <w:rFonts w:ascii="Consolas" w:hAnsi="Consolas"/>
-                <w:sz w:val="24"/>
-              </w:rPr>
-              <w:t>/journal</w:t>
-            </w:r>
-            <w:r>
-              <w:rPr>
-                <w:rFonts w:ascii="Times New Roman" w:hAnsi="Times New Roman"/>
-                <w:sz w:val="24"/>
-              </w:rPr>
-              <w:t xml:space="preserve">, </w:t>
-            </w:r>
-            <w:r>
-              <w:rPr>
-                <w:rFonts w:ascii="Consolas" w:hAnsi="Consolas"/>
-                <w:sz w:val="24"/>
-              </w:rPr>
-              <w:t>/calibration</w:t>
-            </w:r>
-            <w:r>
-              <w:rPr>
-                <w:rFonts w:ascii="Times New Roman" w:hAnsi="Times New Roman"/>
-                <w:sz w:val="24"/>
-              </w:rPr>
-              <w:t xml:space="preserve">, </w:t>
-            </w:r>
-            <w:r>
-              <w:rPr>
-                <w:rFonts w:ascii="Consolas" w:hAnsi="Consolas"/>
-                <w:sz w:val="24"/>
-              </w:rPr>
-              <w:t>/models</w:t>
-            </w:r>
-            <w:r>
-              <w:rPr>
-                <w:rFonts w:ascii="Times New Roman" w:hAnsi="Times New Roman"/>
-                <w:sz w:val="24"/>
-              </w:rPr>
-              <w:t xml:space="preserve">, </w:t>
-            </w:r>
-            <w:r>
-              <w:rPr>
-                <w:rFonts w:ascii="Consolas" w:hAnsi="Consolas"/>
-                <w:sz w:val="24"/>
-              </w:rPr>
-              <w:t>/risk</w:t>
-            </w:r>
-            <w:r>
-              <w:rPr>
-                <w:rFonts w:ascii="Times New Roman" w:hAnsi="Times New Roman"/>
-                <w:sz w:val="24"/>
-              </w:rPr>
-              <w:t xml:space="preserve">, </w:t>
-            </w:r>
-            <w:r>
-              <w:rPr>
-                <w:rFonts w:ascii="Consolas" w:hAnsi="Consolas"/>
-                <w:sz w:val="24"/>
-              </w:rPr>
-              <w:t>/events</w:t>
-            </w:r>
-            <w:r>
-              <w:rPr>
-                <w:rFonts w:ascii="Times New Roman" w:hAnsi="Times New Roman"/>
-                <w:sz w:val="24"/>
-              </w:rPr>
-              <w:t xml:space="preserve">, </w:t>
-            </w:r>
-            <w:r>
-              <w:rPr>
-                <w:rFonts w:ascii="Consolas" w:hAnsi="Consolas"/>
-                <w:sz w:val="24"/>
-              </w:rPr>
-              <w:t>/refresh</w:t>
-            </w:r>
-            <w:r>
-              <w:rPr>
-                <w:rFonts w:ascii="Times New Roman" w:hAnsi="Times New Roman"/>
-                <w:sz w:val="24"/>
-              </w:rPr>
-              <w:t>).</w:t>
+              <w:t xml:space="preserve"> One HTML/JS template is the source of truth, compiled to three deployed variants.</w:t>
             </w:r>
           </w:p>
           <w:p>
@@ -2252,38 +1946,32 @@
             <w:r>
               <w:rPr>
                 <w:rFonts w:ascii="Times New Roman" w:hAnsi="Times New Roman"/>
-                <w:sz w:val="24"/>
-              </w:rPr>
-              <w:t xml:space="preserve">5. </w:t>
-            </w:r>
-            <w:r>
-              <w:rPr>
-                <w:rFonts w:ascii="Times New Roman" w:hAnsi="Times New Roman"/>
                 <w:b/>
                 <w:sz w:val="24"/>
               </w:rPr>
-              <w:t>Web application.</w:t>
+              <w:t>The two deployment targets are a stated trade-off, not an inconsistency.</w:t>
             </w:r>
             <w:r>
               <w:rPr>
                 <w:rFonts w:ascii="Times New Roman" w:hAnsi="Times New Roman"/>
                 <w:sz w:val="24"/>
               </w:rPr>
-              <w:t xml:space="preserve"> One HTML/JS template (</w:t>
-            </w:r>
-            <w:r>
-              <w:rPr>
-                <w:rFonts w:ascii="Consolas" w:hAnsi="Consolas"/>
+              <w:t xml:space="preserve"> The local/CI deployment runs the full FastAPI process and is the only place risk numbers are </w:t>
+            </w:r>
+            <w:r>
+              <w:rPr>
+                <w:rFonts w:ascii="Times New Roman" w:hAnsi="Times New Roman"/>
+                <w:i/>
                 <w:sz w:val="24"/>
               </w:rPr>
-              <w:t>web/ui_template.html</w:t>
+              <w:t>computed</w:t>
             </w:r>
             <w:r>
               <w:rPr>
                 <w:rFonts w:ascii="Times New Roman" w:hAnsi="Times New Roman"/>
                 <w:sz w:val="24"/>
               </w:rPr>
-              <w:t>) is the source of truth, compiled to three deployed variants rather than maintained as three hand-written pages.</w:t>
+              <w:t>; Vercel's serverless size limit cannot host that stack, so a daily job pre-computes once-a-day numbers as static JSON while a lightweight function handles only intraday chart data — practice consistent with scaling ML-serving systems under heterogeneous constraints [31], [32].</w:t>
             </w:r>
           </w:p>
           <w:p>
@@ -2298,51 +1986,14 @@
                 <w:b/>
                 <w:sz w:val="24"/>
               </w:rPr>
-              <w:t>The two deployment targets are a stated engineering trade-off, not an inconsistency — this answers how the modules are linked at the deployment level.</w:t>
+              <w:t>Module contract</w:t>
             </w:r>
             <w:r>
               <w:rPr>
                 <w:rFonts w:ascii="Times New Roman" w:hAnsi="Times New Roman"/>
                 <w:sz w:val="24"/>
               </w:rPr>
-              <w:t xml:space="preserve"> The local/CI deployment runs the full FastAPI process and is the only place risk numbers are </w:t>
-            </w:r>
-            <w:r>
-              <w:rPr>
-                <w:rFonts w:ascii="Times New Roman" w:hAnsi="Times New Roman"/>
-                <w:i/>
-                <w:sz w:val="24"/>
-              </w:rPr>
-              <w:t>computed</w:t>
-            </w:r>
-            <w:r>
-              <w:rPr>
-                <w:rFonts w:ascii="Times New Roman" w:hAnsi="Times New Roman"/>
-                <w:sz w:val="24"/>
-              </w:rPr>
-              <w:t>; Vercel's serverless size limit cannot host that dependency stack, so the daily job pre-computes the once-a-day numbers as static JSON while a separate lightweight function computes only the intraday chart data. Concentrating computation in one synchronous service that a lighter target consumes as a versioned artefact follows established practice for scaling ML-serving systems under heterogeneous deployment constraints [31], [32].</w:t>
-            </w:r>
-          </w:p>
-          <w:p>
-            <w:pPr>
-              <w:spacing w:after="100"/>
-              <w:ind w:firstLine="340"/>
-              <w:jc w:val="both"/>
-            </w:pPr>
-            <w:r>
-              <w:rPr>
-                <w:rFonts w:ascii="Times New Roman" w:hAnsi="Times New Roman"/>
-                <w:b/>
-                <w:sz w:val="24"/>
-              </w:rPr>
-              <w:t>Module contract — the mechanism, not just the diagram.</w:t>
-            </w:r>
-            <w:r>
-              <w:rPr>
-                <w:rFonts w:ascii="Times New Roman" w:hAnsi="Times New Roman"/>
-                <w:sz w:val="24"/>
-              </w:rPr>
-              <w:t xml:space="preserve"> Each row is a fixed data contract enforced in code, not an informal call:</w:t>
+              <w:t>, enforced in code, not an informal call:</w:t>
             </w:r>
           </w:p>
           <w:tbl>
@@ -2514,7 +2165,7 @@
                       <w:rFonts w:ascii="Times New Roman" w:hAnsi="Times New Roman"/>
                       <w:sz w:val="21"/>
                     </w:rPr>
-                    <w:t>direct CSV/JSON write</w:t>
+                    <w:t>direct write</w:t>
                   </w:r>
                 </w:p>
               </w:tc>
@@ -2533,7 +2184,7 @@
                       <w:rFonts w:ascii="Times New Roman" w:hAnsi="Times New Roman"/>
                       <w:sz w:val="21"/>
                     </w:rPr>
-                    <w:t>fixed columns, no silent schema change</w:t>
+                    <w:t>fixed columns</w:t>
                   </w:r>
                 </w:p>
               </w:tc>
@@ -2595,7 +2246,7 @@
                       <w:rFonts w:ascii="Times New Roman" w:hAnsi="Times New Roman"/>
                       <w:sz w:val="21"/>
                     </w:rPr>
-                    <w:t>fixed-path CSV read</w:t>
+                    <w:t>fixed-path read</w:t>
                   </w:r>
                 </w:p>
               </w:tc>
@@ -2614,7 +2265,7 @@
                       <w:rFonts w:ascii="Consolas" w:hAnsi="Consolas"/>
                       <w:sz w:val="21"/>
                     </w:rPr>
-                    <w:t>Date, open, high, low, close, rv5, …</w:t>
+                    <w:t>Date, open, …, rv5</w:t>
                   </w:r>
                 </w:p>
               </w:tc>
@@ -2676,7 +2327,7 @@
                       <w:rFonts w:ascii="Times New Roman" w:hAnsi="Times New Roman"/>
                       <w:sz w:val="21"/>
                     </w:rPr>
-                    <w:t>in-process function call</w:t>
+                    <w:t>in-process call</w:t>
                   </w:r>
                 </w:p>
               </w:tc>
@@ -2695,7 +2346,7 @@
                       <w:rFonts w:ascii="Times New Roman" w:hAnsi="Times New Roman"/>
                       <w:sz w:val="21"/>
                     </w:rPr>
-                    <w:t>numpy/DataFrame, no serialisation</w:t>
+                    <w:t>DataFrame, no serialisation</w:t>
                   </w:r>
                 </w:p>
               </w:tc>
@@ -2757,7 +2408,7 @@
                       <w:rFonts w:ascii="Times New Roman" w:hAnsi="Times New Roman"/>
                       <w:sz w:val="21"/>
                     </w:rPr>
-                    <w:t>in-memory dictionary</w:t>
+                    <w:t>in-memory dict</w:t>
                   </w:r>
                 </w:p>
               </w:tc>
@@ -2805,20 +2456,6 @@
                       <w:sz w:val="21"/>
                     </w:rPr>
                     <w:t>sig</w:t>
-                  </w:r>
-                  <w:r>
-                    <w:rPr>
-                      <w:rFonts w:ascii="Times New Roman" w:hAnsi="Times New Roman"/>
-                      <w:sz w:val="21"/>
-                    </w:rPr>
-                    <w:t xml:space="preserve">, </w:t>
-                  </w:r>
-                  <w:r>
-                    <w:rPr>
-                      <w:rFonts w:ascii="Consolas" w:hAnsi="Consolas"/>
-                      <w:sz w:val="21"/>
-                    </w:rPr>
-                    <w:t>che_do</w:t>
                   </w:r>
                   <w:r>
                     <w:rPr>
@@ -2903,24 +2540,10 @@
                   <w:r/>
                   <w:r>
                     <w:rPr>
-                      <w:rFonts w:ascii="Times New Roman" w:hAnsi="Times New Roman"/>
-                      <w:sz w:val="21"/>
-                    </w:rPr>
-                    <w:t xml:space="preserve">Pydantic </w:t>
-                  </w:r>
-                  <w:r>
-                    <w:rPr>
                       <w:rFonts w:ascii="Consolas" w:hAnsi="Consolas"/>
                       <w:sz w:val="21"/>
                     </w:rPr>
                     <w:t>response_model</w:t>
-                  </w:r>
-                  <w:r>
-                    <w:rPr>
-                      <w:rFonts w:ascii="Times New Roman" w:hAnsi="Times New Roman"/>
-                      <w:sz w:val="21"/>
-                    </w:rPr>
-                    <w:t xml:space="preserve"> where declared</w:t>
                   </w:r>
                 </w:p>
               </w:tc>
@@ -2982,7 +2605,7 @@
                       <w:rFonts w:ascii="Times New Roman" w:hAnsi="Times New Roman"/>
                       <w:sz w:val="21"/>
                     </w:rPr>
-                    <w:t>HTTP call to the API</w:t>
+                    <w:t>HTTP call to API</w:t>
                   </w:r>
                 </w:p>
               </w:tc>
@@ -3001,7 +2624,7 @@
                       <w:rFonts w:ascii="Times New Roman" w:hAnsi="Times New Roman"/>
                       <w:sz w:val="21"/>
                     </w:rPr>
-                    <w:t>identical JSON — never recomputed by a second formula</w:t>
+                    <w:t>identical JSON, never recomputed</w:t>
                   </w:r>
                 </w:p>
               </w:tc>
@@ -3029,7 +2652,7 @@
                 <w:rFonts w:ascii="Times New Roman" w:hAnsi="Times New Roman"/>
                 <w:sz w:val="24"/>
               </w:rPr>
-              <w:t>The daily job never recomputes a number through a second code path — it calls the API and snapshots the response. This single-source-of-truth discipline, recommended practice for operationalising ML systems reliably [31], is what keeps the static and live deployments from ever diverging, and applies to every module added under the Research Plan below, not only the modules that exist today.</w:t>
+              <w:t>The daily job never recomputes through a second code path — it calls the API and snapshots the response, the discipline [31] that keeps the static and live deployments from diverging, applied to every module added under the Research Plan.</w:t>
             </w:r>
           </w:p>
         </w:tc>
@@ -3054,30 +2677,25 @@
           </w:p>
           <w:p>
             <w:pPr>
-              <w:spacing w:after="100"/>
-              <w:ind w:firstLine="340"/>
+              <w:pStyle w:val="ListBullet"/>
+              <w:spacing w:after="60"/>
+              <w:ind w:left="454"/>
               <w:jc w:val="both"/>
             </w:pPr>
             <w:r>
               <w:rPr>
                 <w:rFonts w:ascii="Times New Roman" w:hAnsi="Times New Roman"/>
+                <w:b/>
                 <w:sz w:val="24"/>
               </w:rPr>
-              <w:t>The research proceeds through the following activities.</w:t>
-            </w:r>
-          </w:p>
-          <w:p>
-            <w:pPr>
-              <w:spacing w:before="140" w:after="60"/>
-            </w:pPr>
+              <w:t>Literature review.</w:t>
+            </w:r>
             <w:r>
               <w:rPr>
                 <w:rFonts w:ascii="Times New Roman" w:hAnsi="Times New Roman"/>
-                <w:b/>
-                <w:i/>
                 <w:sz w:val="24"/>
               </w:rPr>
-              <w:t>Literature Review</w:t>
+              <w:t xml:space="preserve"> HAR family and extensions; FX directional-predictability evidence; statistically sound pattern discovery and multiple-testing control; conformal prediction; VaR/ES backtesting and ruin-constrained sizing.</w:t>
             </w:r>
           </w:p>
           <w:p>
@@ -3090,9 +2708,62 @@
             <w:r>
               <w:rPr>
                 <w:rFonts w:ascii="Times New Roman" w:hAnsi="Times New Roman"/>
+                <w:b/>
                 <w:sz w:val="24"/>
               </w:rPr>
-              <w:t>Realized-volatility modelling: the HAR family and its measurement-error, jump, and semivariance extensions; recent ML/foundation-model comparisons.</w:t>
+              <w:t>Data preparation and protocol fixing.</w:t>
+            </w:r>
+            <w:r>
+              <w:rPr>
+                <w:rFonts w:ascii="Times New Roman" w:hAnsi="Times New Roman"/>
+                <w:sz w:val="24"/>
+              </w:rPr>
+              <w:t xml:space="preserve"> Construct bars and realized measures; verify contiguity and session conventions; fix the partition, metrics, multiple-testing procedure, and sealed-set policy in writing </w:t>
+            </w:r>
+            <w:r>
+              <w:rPr>
+                <w:rFonts w:ascii="Times New Roman" w:hAnsi="Times New Roman"/>
+                <w:b/>
+                <w:sz w:val="24"/>
+              </w:rPr>
+              <w:t>before</w:t>
+            </w:r>
+            <w:r>
+              <w:rPr>
+                <w:rFonts w:ascii="Times New Roman" w:hAnsi="Times New Roman"/>
+                <w:sz w:val="24"/>
+              </w:rPr>
+              <w:t xml:space="preserve"> any scoring; anti-leakage self-test (truncating information after </w:t>
+            </w:r>
+            <w:r>
+              <w:rPr>
+                <w:rFonts w:ascii="Times New Roman" w:hAnsi="Times New Roman"/>
+                <w:i/>
+                <w:sz w:val="24"/>
+              </w:rPr>
+              <w:t>t</w:t>
+            </w:r>
+            <w:r>
+              <w:rPr>
+                <w:rFonts w:ascii="Times New Roman" w:hAnsi="Times New Roman"/>
+                <w:sz w:val="24"/>
+              </w:rPr>
+              <w:t xml:space="preserve"> leaves the value at </w:t>
+            </w:r>
+            <w:r>
+              <w:rPr>
+                <w:rFonts w:ascii="Times New Roman" w:hAnsi="Times New Roman"/>
+                <w:i/>
+                <w:sz w:val="24"/>
+              </w:rPr>
+              <w:t>t</w:t>
+            </w:r>
+            <w:r>
+              <w:rPr>
+                <w:rFonts w:ascii="Times New Roman" w:hAnsi="Times New Roman"/>
+                <w:sz w:val="24"/>
+              </w:rPr>
+              <w:t xml:space="preserve"> unchanged).</w:t>
             </w:r>
           </w:p>
           <w:p>
@@ -3105,9 +2776,17 @@
             <w:r>
               <w:rPr>
                 <w:rFonts w:ascii="Times New Roman" w:hAnsi="Times New Roman"/>
+                <w:b/>
                 <w:sz w:val="24"/>
               </w:rPr>
-              <w:t>FX directional predictability: large-scale technical-rule studies with data-snooping control; the momentum-factor explanation.</w:t>
+              <w:t>Baseline and model comparison.</w:t>
+            </w:r>
+            <w:r>
+              <w:rPr>
+                <w:rFonts w:ascii="Times New Roman" w:hAnsi="Times New Roman"/>
+                <w:sz w:val="24"/>
+              </w:rPr>
+              <w:t xml:space="preserve"> Extended HAR and online combination as baselines; compare against regularised linear, tree, recurrent/attention, and foundation models [11], [14] under an identical information set; evaluate with QLIKE [15], CRPS, log/Brier [16]; test with Diebold–Mariano [17], superior predictive ability [5], and Model Confidence Sets [12].</w:t>
             </w:r>
           </w:p>
           <w:p>
@@ -3120,9 +2799,47 @@
             <w:r>
               <w:rPr>
                 <w:rFonts w:ascii="Times New Roman" w:hAnsi="Times New Roman"/>
+                <w:b/>
                 <w:sz w:val="24"/>
               </w:rPr>
-              <w:t>Statistically sound pattern discovery, family-wise error control, superior predictive ability testing, model confidence sets.</w:t>
+              <w:t>Pattern, exogenous, and causal analysis.</w:t>
+            </w:r>
+            <w:r>
+              <w:rPr>
+                <w:rFonts w:ascii="Times New Roman" w:hAnsi="Times New Roman"/>
+                <w:sz w:val="24"/>
+              </w:rPr>
+              <w:t xml:space="preserve"> Enumerate each discovery family's hypothesis space in advance, step-down max-</w:t>
+            </w:r>
+            <w:r>
+              <w:rPr>
+                <w:rFonts w:ascii="Times New Roman" w:hAnsi="Times New Roman"/>
+                <w:i/>
+                <w:sz w:val="24"/>
+              </w:rPr>
+              <w:t>T</w:t>
+            </w:r>
+            <w:r>
+              <w:rPr>
+                <w:rFonts w:ascii="Times New Roman" w:hAnsi="Times New Roman"/>
+                <w:sz w:val="24"/>
+              </w:rPr>
+              <w:t xml:space="preserve"> resampling [4]; condition on the strongest null. The exogenous/causal layer (</w:t>
+            </w:r>
+            <w:r>
+              <w:rPr>
+                <w:rFonts w:ascii="Times New Roman" w:hAnsi="Times New Roman"/>
+                <w:i/>
+                <w:sz w:val="24"/>
+              </w:rPr>
+              <w:t>Causal Discovery Method</w:t>
+            </w:r>
+            <w:r>
+              <w:rPr>
+                <w:rFonts w:ascii="Times New Roman" w:hAnsi="Times New Roman"/>
+                <w:sz w:val="24"/>
+              </w:rPr>
+              <w:t>) is complete; remaining work is write-up (Week 9–10) — the forecast overlay stays deferred.</w:t>
             </w:r>
           </w:p>
           <w:p>
@@ -3135,9 +2852,17 @@
             <w:r>
               <w:rPr>
                 <w:rFonts w:ascii="Times New Roman" w:hAnsi="Times New Roman"/>
+                <w:b/>
                 <w:sz w:val="24"/>
               </w:rPr>
-              <w:t>Conformal prediction under distribution shift, proper scoring rules, calibration diagnostics.</w:t>
+              <w:t>Calibration, risk, decision layer.</w:t>
+            </w:r>
+            <w:r>
+              <w:rPr>
+                <w:rFonts w:ascii="Times New Roman" w:hAnsi="Times New Roman"/>
+                <w:sz w:val="24"/>
+              </w:rPr>
+              <w:t xml:space="preserve"> Mondrian ACI [19], [20]; VaR/ES backtests [21]–[24]; sizing as min(growth-optimal fraction [25], ruin-constrained cap), adjusted by regime, drawdown, correlation, and slippage.</w:t>
             </w:r>
           </w:p>
           <w:p>
@@ -3150,23 +2875,17 @@
             <w:r>
               <w:rPr>
                 <w:rFonts w:ascii="Times New Roman" w:hAnsi="Times New Roman"/>
+                <w:b/>
                 <w:sz w:val="24"/>
               </w:rPr>
-              <w:t>VaR/ES backtesting and growth-optimal position sizing under a ruin constraint.</w:t>
-            </w:r>
-          </w:p>
-          <w:p>
-            <w:pPr>
-              <w:spacing w:before="140" w:after="60"/>
-            </w:pPr>
+              <w:t>Power analysis and sealed validation.</w:t>
+            </w:r>
             <w:r>
               <w:rPr>
                 <w:rFonts w:ascii="Times New Roman" w:hAnsi="Times New Roman"/>
-                <w:b/>
-                <w:i/>
                 <w:sz w:val="24"/>
               </w:rPr>
-              <w:t>Data Preparation and Protocol Fixing</w:t>
+              <w:t xml:space="preserve"> Inject synthetic effects through the actual funnel, report the MDES at 80% power; freeze the configuration, then open the sealed set exactly once.</w:t>
             </w:r>
           </w:p>
           <w:p>
@@ -3179,379 +2898,17 @@
             <w:r>
               <w:rPr>
                 <w:rFonts w:ascii="Times New Roman" w:hAnsi="Times New Roman"/>
+                <w:b/>
                 <w:sz w:val="24"/>
               </w:rPr>
-              <w:t>Construct daily bars and five-minute realized measures from one-minute data; verify contiguity, session conventions, and time-zone handling.</w:t>
-            </w:r>
-          </w:p>
-          <w:p>
-            <w:pPr>
-              <w:pStyle w:val="ListBullet"/>
-              <w:spacing w:after="60"/>
-              <w:ind w:left="454"/>
-              <w:jc w:val="both"/>
-            </w:pPr>
+              <w:t>System implementation.</w:t>
+            </w:r>
             <w:r>
               <w:rPr>
                 <w:rFonts w:ascii="Times New Roman" w:hAnsi="Times New Roman"/>
                 <w:sz w:val="24"/>
               </w:rPr>
-              <w:t xml:space="preserve">Fix the temporal partition, per-axis metrics, multiple-testing procedure, and sealed-set policy in writing </w:t>
-            </w:r>
-            <w:r>
-              <w:rPr>
-                <w:rFonts w:ascii="Times New Roman" w:hAnsi="Times New Roman"/>
-                <w:b/>
-                <w:sz w:val="24"/>
-              </w:rPr>
-              <w:t>before</w:t>
-            </w:r>
-            <w:r>
-              <w:rPr>
-                <w:rFonts w:ascii="Times New Roman" w:hAnsi="Times New Roman"/>
-                <w:sz w:val="24"/>
-              </w:rPr>
-              <w:t xml:space="preserve"> any scoring; record every configuration evaluated.</w:t>
-            </w:r>
-          </w:p>
-          <w:p>
-            <w:pPr>
-              <w:pStyle w:val="ListBullet"/>
-              <w:spacing w:after="60"/>
-              <w:ind w:left="454"/>
-              <w:jc w:val="both"/>
-            </w:pPr>
-            <w:r>
-              <w:rPr>
-                <w:rFonts w:ascii="Times New Roman" w:hAnsi="Times New Roman"/>
-                <w:sz w:val="24"/>
-              </w:rPr>
-              <w:t xml:space="preserve">Anti-leakage self-test: every derived feature's value at time </w:t>
-            </w:r>
-            <w:r>
-              <w:rPr>
-                <w:rFonts w:ascii="Times New Roman" w:hAnsi="Times New Roman"/>
-                <w:i/>
-                <w:sz w:val="24"/>
-              </w:rPr>
-              <w:t>t</w:t>
-            </w:r>
-            <w:r>
-              <w:rPr>
-                <w:rFonts w:ascii="Times New Roman" w:hAnsi="Times New Roman"/>
-                <w:sz w:val="24"/>
-              </w:rPr>
-              <w:t xml:space="preserve"> is unchanged by truncating information revealed after </w:t>
-            </w:r>
-            <w:r>
-              <w:rPr>
-                <w:rFonts w:ascii="Times New Roman" w:hAnsi="Times New Roman"/>
-                <w:i/>
-                <w:sz w:val="24"/>
-              </w:rPr>
-              <w:t>t</w:t>
-            </w:r>
-            <w:r>
-              <w:rPr>
-                <w:rFonts w:ascii="Times New Roman" w:hAnsi="Times New Roman"/>
-                <w:sz w:val="24"/>
-              </w:rPr>
-              <w:t>.</w:t>
-            </w:r>
-          </w:p>
-          <w:p>
-            <w:pPr>
-              <w:spacing w:before="140" w:after="60"/>
-            </w:pPr>
-            <w:r>
-              <w:rPr>
-                <w:rFonts w:ascii="Times New Roman" w:hAnsi="Times New Roman"/>
-                <w:b/>
-                <w:i/>
-                <w:sz w:val="24"/>
-              </w:rPr>
-              <w:t>Baseline Establishment and Model Comparison</w:t>
-            </w:r>
-          </w:p>
-          <w:p>
-            <w:pPr>
-              <w:pStyle w:val="ListBullet"/>
-              <w:spacing w:after="60"/>
-              <w:ind w:left="454"/>
-              <w:jc w:val="both"/>
-            </w:pPr>
-            <w:r>
-              <w:rPr>
-                <w:rFonts w:ascii="Times New Roman" w:hAnsi="Times New Roman"/>
-                <w:sz w:val="24"/>
-              </w:rPr>
-              <w:t>Extended HAR as the production magnitude baseline; an online expert-combination layer [13] as the probability baseline.</w:t>
-            </w:r>
-          </w:p>
-          <w:p>
-            <w:pPr>
-              <w:pStyle w:val="ListBullet"/>
-              <w:spacing w:after="60"/>
-              <w:ind w:left="454"/>
-              <w:jc w:val="both"/>
-            </w:pPr>
-            <w:r>
-              <w:rPr>
-                <w:rFonts w:ascii="Times New Roman" w:hAnsi="Times New Roman"/>
-                <w:sz w:val="24"/>
-              </w:rPr>
-              <w:t>Compare against regularised linear models, gradient-boosted trees, recurrent/attention networks, a tabular foundation model [14], zero-shot time-series foundation models [11], and forecast combinations, under an identical information set and refit frequency.</w:t>
-            </w:r>
-          </w:p>
-          <w:p>
-            <w:pPr>
-              <w:pStyle w:val="ListBullet"/>
-              <w:spacing w:after="60"/>
-              <w:ind w:left="454"/>
-              <w:jc w:val="both"/>
-            </w:pPr>
-            <w:r>
-              <w:rPr>
-                <w:rFonts w:ascii="Times New Roman" w:hAnsi="Times New Roman"/>
-                <w:sz w:val="24"/>
-              </w:rPr>
-              <w:t>Evaluate with scale-invariant QLIKE [15], CRPS, and log/Brier scores [16]; assess significance with Diebold–Mariano tests [17] and Model Confidence Sets [12].</w:t>
-            </w:r>
-          </w:p>
-          <w:p>
-            <w:pPr>
-              <w:spacing w:before="140" w:after="60"/>
-            </w:pPr>
-            <w:r>
-              <w:rPr>
-                <w:rFonts w:ascii="Times New Roman" w:hAnsi="Times New Roman"/>
-                <w:b/>
-                <w:i/>
-                <w:sz w:val="24"/>
-              </w:rPr>
-              <w:t>Pattern, Exogenous, and Causal Analysis</w:t>
-            </w:r>
-          </w:p>
-          <w:p>
-            <w:pPr>
-              <w:pStyle w:val="ListBullet"/>
-              <w:spacing w:after="60"/>
-              <w:ind w:left="454"/>
-              <w:jc w:val="both"/>
-            </w:pPr>
-            <w:r>
-              <w:rPr>
-                <w:rFonts w:ascii="Times New Roman" w:hAnsi="Times New Roman"/>
-                <w:sz w:val="24"/>
-              </w:rPr>
-              <w:t>Enumerate the hypothesis space in advance per discovery family and apply step-down max-</w:t>
-            </w:r>
-            <w:r>
-              <w:rPr>
-                <w:rFonts w:ascii="Times New Roman" w:hAnsi="Times New Roman"/>
-                <w:i/>
-                <w:sz w:val="24"/>
-              </w:rPr>
-              <w:t>T</w:t>
-            </w:r>
-            <w:r>
-              <w:rPr>
-                <w:rFonts w:ascii="Times New Roman" w:hAnsi="Times New Roman"/>
-                <w:sz w:val="24"/>
-              </w:rPr>
-              <w:t xml:space="preserve"> resampling with block-preserving nulls [4]; remaining work is limited to pre-registered evaluations at horizons/axes not yet scored — no new family is introduced after the protocol is frozen.</w:t>
-            </w:r>
-          </w:p>
-          <w:p>
-            <w:pPr>
-              <w:pStyle w:val="ListBullet"/>
-              <w:spacing w:after="60"/>
-              <w:ind w:left="454"/>
-              <w:jc w:val="both"/>
-            </w:pPr>
-            <w:r>
-              <w:rPr>
-                <w:rFonts w:ascii="Times New Roman" w:hAnsi="Times New Roman"/>
-                <w:sz w:val="24"/>
-              </w:rPr>
-              <w:t>Condition every candidate on the strongest available null (production volatility forecast for magnitude; time-series momentum for direction [3]).</w:t>
-            </w:r>
-          </w:p>
-          <w:p>
-            <w:pPr>
-              <w:pStyle w:val="ListBullet"/>
-              <w:spacing w:after="60"/>
-              <w:ind w:left="454"/>
-              <w:jc w:val="both"/>
-            </w:pPr>
-            <w:r>
-              <w:rPr>
-                <w:rFonts w:ascii="Times New Roman" w:hAnsi="Times New Roman"/>
-                <w:sz w:val="24"/>
-              </w:rPr>
-              <w:t>For the exogenous layer, contrast all-variable, validation-selected, and causally-filtered feature sets (Granger+Westfall–Young, triangulated against PCMCI [18], Double Machine Learning [33], Causal Forest [34], and CausalImpact [28] — Proposed Method, Causal Discovery Method) under an identical model class and parameter budget. This layer, including the triangulation, is complete; remaining work is limited to writing up the findings (Week 9–10), and the causal-conditioned forecast overlay is deferred (Deferred / Future Work) rather than pursued further here.</w:t>
-            </w:r>
-          </w:p>
-          <w:p>
-            <w:pPr>
-              <w:pStyle w:val="ListBullet"/>
-              <w:spacing w:after="60"/>
-              <w:ind w:left="454"/>
-              <w:jc w:val="both"/>
-            </w:pPr>
-            <w:r>
-              <w:rPr>
-                <w:rFonts w:ascii="Times New Roman" w:hAnsi="Times New Roman"/>
-                <w:sz w:val="24"/>
-              </w:rPr>
-              <w:t>Screen for sign consistency across pairs and years, and require leave-one-pair-out transfer before any candidate is admitted.</w:t>
-            </w:r>
-          </w:p>
-          <w:p>
-            <w:pPr>
-              <w:spacing w:before="140" w:after="60"/>
-            </w:pPr>
-            <w:r>
-              <w:rPr>
-                <w:rFonts w:ascii="Times New Roman" w:hAnsi="Times New Roman"/>
-                <w:b/>
-                <w:i/>
-                <w:sz w:val="24"/>
-              </w:rPr>
-              <w:t>Calibration, Risk, and Decision Layer</w:t>
-            </w:r>
-          </w:p>
-          <w:p>
-            <w:pPr>
-              <w:pStyle w:val="ListBullet"/>
-              <w:spacing w:after="60"/>
-              <w:ind w:left="454"/>
-              <w:jc w:val="both"/>
-            </w:pPr>
-            <w:r>
-              <w:rPr>
-                <w:rFonts w:ascii="Times New Roman" w:hAnsi="Times New Roman"/>
-                <w:sz w:val="24"/>
-              </w:rPr>
-              <w:t>Adaptive conformal inference with Mondrian stratification by volatility regime [19], [20]; verify empirical coverage overall and by regime.</w:t>
-            </w:r>
-          </w:p>
-          <w:p>
-            <w:pPr>
-              <w:pStyle w:val="ListBullet"/>
-              <w:spacing w:after="60"/>
-              <w:ind w:left="454"/>
-              <w:jc w:val="both"/>
-            </w:pPr>
-            <w:r>
-              <w:rPr>
-                <w:rFonts w:ascii="Times New Roman" w:hAnsi="Times New Roman"/>
-                <w:sz w:val="24"/>
-              </w:rPr>
-              <w:t>Estimate VaR/ES from empirical quantiles of standardised returns; backtest per pair with unconditional [21], conditional [22], and dynamic-quantile [23] tests; assess the joint (VaR, ES) pair with a strictly consistent scoring function [24].</w:t>
-            </w:r>
-          </w:p>
-          <w:p>
-            <w:pPr>
-              <w:pStyle w:val="ListBullet"/>
-              <w:spacing w:after="60"/>
-              <w:ind w:left="454"/>
-              <w:jc w:val="both"/>
-            </w:pPr>
-            <w:r>
-              <w:rPr>
-                <w:rFonts w:ascii="Times New Roman" w:hAnsi="Times New Roman"/>
-                <w:sz w:val="24"/>
-              </w:rPr>
-              <w:t>Compute position size as the minimum of a growth-optimal fraction [25] and a ruin-constrained cap, adjusted by regime, drawdown, portfolio correlation, and a measured slippage coefficient.</w:t>
-            </w:r>
-          </w:p>
-          <w:p>
-            <w:pPr>
-              <w:spacing w:before="140" w:after="60"/>
-            </w:pPr>
-            <w:r>
-              <w:rPr>
-                <w:rFonts w:ascii="Times New Roman" w:hAnsi="Times New Roman"/>
-                <w:b/>
-                <w:i/>
-                <w:sz w:val="24"/>
-              </w:rPr>
-              <w:t>Power Analysis and Sealed Validation</w:t>
-            </w:r>
-          </w:p>
-          <w:p>
-            <w:pPr>
-              <w:pStyle w:val="ListBullet"/>
-              <w:spacing w:after="60"/>
-              <w:ind w:left="454"/>
-              <w:jc w:val="both"/>
-            </w:pPr>
-            <w:r>
-              <w:rPr>
-                <w:rFonts w:ascii="Times New Roman" w:hAnsi="Times New Roman"/>
-                <w:sz w:val="24"/>
-              </w:rPr>
-              <w:t>For every negative finding, inject synthetic effects through the actual testing funnel and report the effect size detected at 80% power, with a negative control for the false-positive rate under pure noise.</w:t>
-            </w:r>
-          </w:p>
-          <w:p>
-            <w:pPr>
-              <w:pStyle w:val="ListBullet"/>
-              <w:spacing w:after="60"/>
-              <w:ind w:left="454"/>
-              <w:jc w:val="both"/>
-            </w:pPr>
-            <w:r>
-              <w:rPr>
-                <w:rFonts w:ascii="Times New Roman" w:hAnsi="Times New Roman"/>
-                <w:sz w:val="24"/>
-              </w:rPr>
-              <w:t>Freeze the final configuration in writing, then open the sealed evaluation set exactly once and report the resulting numbers without modification.</w:t>
-            </w:r>
-          </w:p>
-          <w:p>
-            <w:pPr>
-              <w:spacing w:before="140" w:after="60"/>
-            </w:pPr>
-            <w:r>
-              <w:rPr>
-                <w:rFonts w:ascii="Times New Roman" w:hAnsi="Times New Roman"/>
-                <w:b/>
-                <w:i/>
-                <w:sz w:val="24"/>
-              </w:rPr>
-              <w:t>System Implementation and Analysis</w:t>
-            </w:r>
-          </w:p>
-          <w:p>
-            <w:pPr>
-              <w:pStyle w:val="ListBullet"/>
-              <w:spacing w:after="60"/>
-              <w:ind w:left="454"/>
-              <w:jc w:val="both"/>
-            </w:pPr>
-            <w:r>
-              <w:rPr>
-                <w:rFonts w:ascii="Times New Roman" w:hAnsi="Times New Roman"/>
-                <w:sz w:val="24"/>
-              </w:rPr>
-              <w:t>Maintain the operating end-to-end product path (Proposed Method and System Architecture) throughout the study, integrating each research layer as a versioned artefact the week it is completed (per-week deliverables in the Research Plan); harden the system in the final weeks with full provenance for every displayed quantity.</w:t>
-            </w:r>
-          </w:p>
-          <w:p>
-            <w:pPr>
-              <w:pStyle w:val="ListBullet"/>
-              <w:spacing w:after="60"/>
-              <w:ind w:left="454"/>
-              <w:jc w:val="both"/>
-            </w:pPr>
-            <w:r>
-              <w:rPr>
-                <w:rFonts w:ascii="Times New Roman" w:hAnsi="Times New Roman"/>
-                <w:sz w:val="24"/>
-              </w:rPr>
-              <w:t>Analyse failure cases and limitations — pairs failing tail backtests, horizons where calibration degrades — and report them within the interface rather than omitting them.</w:t>
+              <w:t xml:space="preserve"> Maintain the operating product path throughout, integrating each layer as a versioned artefact the week it completes; harden the system in the final weeks with full provenance; analyse failure cases and calibration degradation in the interface rather than omitting them.</w:t>
             </w:r>
           </w:p>
         </w:tc>
@@ -3594,7 +2951,7 @@
                 <w:rFonts w:ascii="Times New Roman" w:hAnsi="Times New Roman"/>
                 <w:sz w:val="24"/>
               </w:rPr>
-              <w:t xml:space="preserve"> issuing, per session and pair, a volatility forecast, a calibrated three-class probability with a conformal prediction set, an event-risk assessment, and a ruin-constrained position-sizing recommendation, with every displayed quantity traceable to a specific measurement.</w:t>
+              <w:t xml:space="preserve"> issuing, per session and pair, a volatility forecast, calibrated three-class probability with a conformal set, event-risk assessment, and ruin-constrained sizing, every quantity traceable to a measurement.</w:t>
             </w:r>
           </w:p>
           <w:p>
@@ -3610,14 +2967,14 @@
                 <w:b/>
                 <w:sz w:val="24"/>
               </w:rPr>
-              <w:t>An axis-resolved characterisation of daily FX predictability.</w:t>
+              <w:t>An axis-resolved characterisation of predictability</w:t>
             </w:r>
             <w:r>
               <w:rPr>
                 <w:rFonts w:ascii="Times New Roman" w:hAnsi="Times New Roman"/>
                 <w:sz w:val="24"/>
               </w:rPr>
-              <w:t xml:space="preserve"> Results frozen to date show positive, statistically significant skill on the magnitude axis and none on direction across twelve independent discovery branches; the thesis completes the remaining horizons and confirms this on the sealed evaluation set, not yet opened.</w:t>
+              <w:t xml:space="preserve"> — significant skill on magnitude, none on direction across twelve branches; remaining horizons and the sealed set (not yet opened) complete the picture.</w:t>
             </w:r>
           </w:p>
           <w:p>
@@ -3633,14 +2990,14 @@
                 <w:b/>
                 <w:sz w:val="24"/>
               </w:rPr>
-              <w:t>A systematic benchmark of model complexity for FX volatility forecasting</w:t>
+              <w:t>A systematic model-complexity benchmark</w:t>
             </w:r>
             <w:r>
               <w:rPr>
                 <w:rFonts w:ascii="Times New Roman" w:hAnsi="Times New Roman"/>
                 <w:sz w:val="24"/>
               </w:rPr>
-              <w:t xml:space="preserve"> — linear, tree-based, recurrent, attention-based, and foundation models, plus exhaustive forecast combinations, evaluated with proper scoring rules and model confidence sets.</w:t>
+              <w:t xml:space="preserve"> for volatility forecasting across model families, with proper scoring rules and model confidence sets.</w:t>
             </w:r>
           </w:p>
           <w:p>
@@ -3656,14 +3013,14 @@
                 <w:b/>
                 <w:sz w:val="24"/>
               </w:rPr>
-              <w:t>An empirical comparison of causal filtering against ordinary feature selection, and a five-method causal triangulation with an honest split between its two roles.</w:t>
+              <w:t>A five-method causal triangulation and ablation with an honest two-role split.</w:t>
             </w:r>
             <w:r>
               <w:rPr>
                 <w:rFonts w:ascii="Times New Roman" w:hAnsi="Times New Roman"/>
                 <w:sz w:val="24"/>
               </w:rPr>
-              <w:t xml:space="preserve"> A completed, frozen ablation — its sealed-set evaluation deliberately not opened, per the pre-registered rule that a non-positive verdict does not warrant it — shows causally-filtered variables degrade substantially less out of sample than validation-selected ones, the mechanism measured as distribution drift in the latter. Separately, Granger+Westfall–Young, PCMCI, Double ML, Causal Forest, and CausalImpact independently converge on VIX and demonstrate concretely (PCMCI's simultaneous conditioning) how it is distinguished from a confound. The triangulation's validation role (deciding which variable is trusted) is complete and load-bearing; its forecast-performance role was tested and found not yet effective, reported as a negative finding rather than an overstated gain.</w:t>
+              <w:t xml:space="preserve"> Causally-filtered variables degrade less out of sample than validation-selected ones (mechanism: distribution drift in the latter); the triangulation's validation role is load-bearing, its forecast-performance role tested and reported negative rather than overstated.</w:t>
             </w:r>
           </w:p>
           <w:p>
@@ -3686,7 +3043,7 @@
                 <w:rFonts w:ascii="Times New Roman" w:hAnsi="Times New Roman"/>
                 <w:sz w:val="24"/>
               </w:rPr>
-              <w:t xml:space="preserve"> — every negative finding reported with the minimum effect size its procedure could detect, converting "no relationship was found" into "no relationship stronger than </w:t>
+              <w:t xml:space="preserve"> — every negative finding with its MDES, turning "no relationship found" into "no relationship stronger than </w:t>
             </w:r>
             <w:r>
               <w:rPr>
@@ -3701,7 +3058,7 @@
                 <w:rFonts w:ascii="Times New Roman" w:hAnsi="Times New Roman"/>
                 <w:sz w:val="24"/>
               </w:rPr>
-              <w:t xml:space="preserve"> exists in these data".</w:t>
+              <w:t>".</w:t>
             </w:r>
           </w:p>
           <w:p>
@@ -3717,14 +3074,14 @@
                 <w:b/>
                 <w:sz w:val="24"/>
               </w:rPr>
-              <w:t>Three applied contributions to risk-aware decision support</w:t>
+              <w:t>Three applied risk-decision contributions</w:t>
             </w:r>
             <w:r>
               <w:rPr>
                 <w:rFonts w:ascii="Times New Roman" w:hAnsi="Times New Roman"/>
                 <w:sz w:val="24"/>
               </w:rPr>
-              <w:t>: a portfolio correlation factor quantifying the gap between nominal and realised ruin probability under correlated positions; a holding-horizon table addressing systematic misreading of single-session stop-out probabilities; and a slippage coefficient estimated from observed stop-loss executions rather than assumed.</w:t>
+              <w:t>: a portfolio correlation factor for ruin-constrained sizing, a holding-horizon table against stop-out misreading, and a slippage coefficient measured from real executions.</w:t>
             </w:r>
           </w:p>
           <w:p>
@@ -3747,7 +3104,7 @@
                 <w:rFonts w:ascii="Times New Roman" w:hAnsi="Times New Roman"/>
                 <w:sz w:val="24"/>
               </w:rPr>
-              <w:t xml:space="preserve"> — the full data dictionary, sealed-set protocol, a registry of every configuration and hypothesis evaluated, and reproduction commands for every reported number, including negative results.</w:t>
+              <w:t xml:space="preserve"> — data dictionary, sealed-set protocol, full configuration registry, reproduction commands including negative results.</w:t>
             </w:r>
           </w:p>
           <w:p>
@@ -3770,7 +3127,7 @@
                 <w:rFonts w:ascii="Times New Roman" w:hAnsi="Times New Roman"/>
                 <w:sz w:val="24"/>
               </w:rPr>
-              <w:t xml:space="preserve"> — the five-layer pipeline, computation layer, API, and web application with an explicit module contract between every layer, so the engineering contribution (how numbers are produced, versioned, and served without the static and live deployments diverging) is itself reported and defensible, not only the numbers it serves.</w:t>
+              <w:t xml:space="preserve"> — the five-layer pipeline/API/web application with an explicit module contract, so the engineering contribution is itself reported and defensible.</w:t>
             </w:r>
           </w:p>
         </w:tc>
@@ -3899,7 +3256,7 @@
                 <w:i/>
                 <w:sz w:val="24"/>
               </w:rPr>
-              <w:t>Resampling-Based Multiple Testing: Examples and Methods for p-Value Adjustment</w:t>
+              <w:t>Resampling-Based Multiple Testing</w:t>
             </w:r>
             <w:r>
               <w:rPr>
@@ -4007,7 +3364,7 @@
                 <w:rFonts w:ascii="Times New Roman" w:hAnsi="Times New Roman"/>
                 <w:sz w:val="24"/>
               </w:rPr>
-              <w:t xml:space="preserve">[8] T. Bollerslev, A. J. Patton, and R. Quaedvlieg, "Exploiting the errors: A simple approach for improved volatility forecasting," </w:t>
+              <w:t xml:space="preserve">[8] T. Bollerslev, A. J. Patton, and R. Quaedvlieg, "Exploiting the errors," </w:t>
             </w:r>
             <w:r>
               <w:rPr>
@@ -4094,7 +3451,7 @@
                 <w:rFonts w:ascii="Times New Roman" w:hAnsi="Times New Roman"/>
                 <w:sz w:val="24"/>
               </w:rPr>
-              <w:t>[11] A. Brini, "Forecasting realized volatility with time series foundation models: A comparison with econometric benchmarks," arXiv:2607.05291, 2026. [Online]. Available: https://arxiv.org/abs/2607.05291</w:t>
+              <w:t>[11] A. Brini, "Forecasting realized volatility with time series foundation models," arXiv:2607.05291, 2026.</w:t>
             </w:r>
           </w:p>
           <w:p>
@@ -4137,7 +3494,7 @@
                 <w:rFonts w:ascii="Times New Roman" w:hAnsi="Times New Roman"/>
                 <w:sz w:val="24"/>
               </w:rPr>
-              <w:t xml:space="preserve">[13] Y. Freund and R. E. Schapire, "A decision-theoretic generalization of on-line learning and an application to boosting," </w:t>
+              <w:t xml:space="preserve">[13] Y. Freund and R. E. Schapire, "A decision-theoretic generalization of on-line learning," </w:t>
             </w:r>
             <w:r>
               <w:rPr>
@@ -4166,7 +3523,22 @@
                 <w:rFonts w:ascii="Times New Roman" w:hAnsi="Times New Roman"/>
                 <w:sz w:val="24"/>
               </w:rPr>
-              <w:t xml:space="preserve">[14] N. Hollmann, S. Müller, L. Purucker, A. Krishnakumar, M. Körfer, S. B. Hoo, R. T. Schirrmeister, and F. Hutter, "Accurate predictions on small data with a tabular foundation model," </w:t>
+              <w:t xml:space="preserve">[14] N. Hollmann </w:t>
+            </w:r>
+            <w:r>
+              <w:rPr>
+                <w:rFonts w:ascii="Times New Roman" w:hAnsi="Times New Roman"/>
+                <w:i/>
+                <w:sz w:val="24"/>
+              </w:rPr>
+              <w:t>et al.</w:t>
+            </w:r>
+            <w:r>
+              <w:rPr>
+                <w:rFonts w:ascii="Times New Roman" w:hAnsi="Times New Roman"/>
+                <w:sz w:val="24"/>
+              </w:rPr>
+              <w:t xml:space="preserve">, "Accurate predictions on small data with a tabular foundation model," </w:t>
             </w:r>
             <w:r>
               <w:rPr>
@@ -4232,7 +3604,7 @@
                 <w:i/>
                 <w:sz w:val="24"/>
               </w:rPr>
-              <w:t>Journal of the American Statistical Association</w:t>
+              <w:t>JASA</w:t>
             </w:r>
             <w:r>
               <w:rPr>
@@ -4311,7 +3683,7 @@
                 <w:rFonts w:ascii="Times New Roman" w:hAnsi="Times New Roman"/>
                 <w:sz w:val="24"/>
               </w:rPr>
-              <w:t xml:space="preserve">[19] I. Gibbs and E. Candès, "Adaptive conformal inference under distribution shift," in </w:t>
+              <w:t xml:space="preserve">[19] I. Gibbs and E. Candès, "Adaptive conformal inference under distribution shift," </w:t>
             </w:r>
             <w:r>
               <w:rPr>
@@ -4319,7 +3691,7 @@
                 <w:i/>
                 <w:sz w:val="24"/>
               </w:rPr>
-              <w:t>Proc. 35th Conf. Neural Information Processing Systems (NeurIPS)</w:t>
+              <w:t>NeurIPS 35</w:t>
             </w:r>
             <w:r>
               <w:rPr>
@@ -4427,7 +3799,7 @@
                 <w:rFonts w:ascii="Times New Roman" w:hAnsi="Times New Roman"/>
                 <w:sz w:val="24"/>
               </w:rPr>
-              <w:t xml:space="preserve">[23] R. F. Engle and S. Manganelli, "CAViaR: Conditional autoregressive value at risk by regression quantiles," </w:t>
+              <w:t xml:space="preserve">[23] R. F. Engle and S. Manganelli, "CAViaR," </w:t>
             </w:r>
             <w:r>
               <w:rPr>
@@ -4514,7 +3886,7 @@
                 <w:rFonts w:ascii="Times New Roman" w:hAnsi="Times New Roman"/>
                 <w:sz w:val="24"/>
               </w:rPr>
-              <w:t xml:space="preserve">[26] I. Orquín-Serrano, "Predictive power of adaptive candlestick patterns in Forex market. EURUSD case," </w:t>
+              <w:t xml:space="preserve">[26] I. Orquín-Serrano, "Predictive power of adaptive candlestick patterns in Forex market," </w:t>
             </w:r>
             <w:r>
               <w:rPr>
@@ -4630,7 +4002,7 @@
                 <w:rFonts w:ascii="Times New Roman" w:hAnsi="Times New Roman"/>
                 <w:sz w:val="24"/>
               </w:rPr>
-              <w:t xml:space="preserve">[30] A. N. Angelopoulos, E. J. Candès, and R. J. Tibshirani, "Conformal PID control for time series prediction," in </w:t>
+              <w:t xml:space="preserve">[30] A. N. Angelopoulos, E. J. Candès, and R. J. Tibshirani, "Conformal PID control for time series prediction," </w:t>
             </w:r>
             <w:r>
               <w:rPr>
@@ -4638,14 +4010,14 @@
                 <w:i/>
                 <w:sz w:val="24"/>
               </w:rPr>
-              <w:t>Advances in Neural Information Processing Systems (NeurIPS)</w:t>
+              <w:t>NeurIPS 36</w:t>
             </w:r>
             <w:r>
               <w:rPr>
                 <w:rFonts w:ascii="Times New Roman" w:hAnsi="Times New Roman"/>
                 <w:sz w:val="24"/>
               </w:rPr>
-              <w:t>, vol. 36, 2023. arXiv:2307.16895.</w:t>
+              <w:t>, 2023. arXiv:2307.16895.</w:t>
             </w:r>
           </w:p>
           <w:p>
@@ -4687,7 +4059,22 @@
                 <w:rFonts w:ascii="Times New Roman" w:hAnsi="Times New Roman"/>
                 <w:sz w:val="24"/>
               </w:rPr>
-              <w:t xml:space="preserve">[33] V. Chernozhukov, D. Chetverikov, M. Demirer, E. Duflo, C. Hansen, W. Newey, and J. Robins, "Double/debiased machine learning for treatment and structural parameters," </w:t>
+              <w:t xml:space="preserve">[33] V. Chernozhukov </w:t>
+            </w:r>
+            <w:r>
+              <w:rPr>
+                <w:rFonts w:ascii="Times New Roman" w:hAnsi="Times New Roman"/>
+                <w:i/>
+                <w:sz w:val="24"/>
+              </w:rPr>
+              <w:t>et al.</w:t>
+            </w:r>
+            <w:r>
+              <w:rPr>
+                <w:rFonts w:ascii="Times New Roman" w:hAnsi="Times New Roman"/>
+                <w:sz w:val="24"/>
+              </w:rPr>
+              <w:t xml:space="preserve">, "Double/debiased machine learning for treatment and structural parameters," </w:t>
             </w:r>
             <w:r>
               <w:rPr>
@@ -4724,7 +4111,7 @@
                 <w:i/>
                 <w:sz w:val="24"/>
               </w:rPr>
-              <w:t>Journal of the American Statistical Association</w:t>
+              <w:t>JASA</w:t>
             </w:r>
             <w:r>
               <w:rPr>
@@ -4765,7 +4152,22 @@
                 <w:rFonts w:ascii="Times New Roman" w:hAnsi="Times New Roman"/>
                 <w:sz w:val="24"/>
               </w:rPr>
-              <w:t>Research timeline: 16 weeks.</w:t>
+              <w:t xml:space="preserve">Research timeline: 16 weeks. Every week pairs a research task with an </w:t>
+            </w:r>
+            <w:r>
+              <w:rPr>
+                <w:rFonts w:ascii="Times New Roman" w:hAnsi="Times New Roman"/>
+                <w:b/>
+                <w:sz w:val="24"/>
+              </w:rPr>
+              <w:t>Engineering</w:t>
+            </w:r>
+            <w:r>
+              <w:rPr>
+                <w:rFonts w:ascii="Times New Roman" w:hAnsi="Times New Roman"/>
+                <w:sz w:val="24"/>
+              </w:rPr>
+              <w:t xml:space="preserve"> deliverable, so the API/web application is extended continuously rather than only at the end.</w:t>
             </w:r>
           </w:p>
           <w:tbl>
@@ -4899,33 +4301,7 @@
                       <w:rFonts w:ascii="Times New Roman" w:hAnsi="Times New Roman"/>
                       <w:sz w:val="21"/>
                     </w:rPr>
-                    <w:t>– Consolidate the data pipeline; verify contiguity, session conventions, and time-zone handling.</w:t>
-                  </w:r>
-                </w:p>
-                <w:p>
-                  <w:pPr>
-                    <w:spacing w:after="20"/>
-                    <w:jc w:val="left"/>
-                  </w:pPr>
-                  <w:r>
-                    <w:rPr>
-                      <w:rFonts w:ascii="Times New Roman" w:hAnsi="Times New Roman"/>
-                      <w:sz w:val="21"/>
-                    </w:rPr>
-                    <w:t>– Fix the evaluation protocol: partition, per-axis metrics, multiple-testing procedure, sealed-set policy.</w:t>
-                  </w:r>
-                </w:p>
-                <w:p>
-                  <w:pPr>
-                    <w:spacing w:after="20"/>
-                    <w:jc w:val="left"/>
-                  </w:pPr>
-                  <w:r>
-                    <w:rPr>
-                      <w:rFonts w:ascii="Times New Roman" w:hAnsi="Times New Roman"/>
-                      <w:sz w:val="21"/>
-                    </w:rPr>
-                    <w:t>– Reproduce all baseline results from a clean checkout.</w:t>
+                    <w:t>– Consolidate the pipeline; fix the evaluation protocol; reproduce baselines.</w:t>
                   </w:r>
                 </w:p>
                 <w:p>
@@ -4946,14 +4322,14 @@
                       <w:b/>
                       <w:sz w:val="21"/>
                     </w:rPr>
-                    <w:t>Engineering:</w:t>
+                    <w:t>Eng:</w:t>
                   </w:r>
                   <w:r>
                     <w:rPr>
                       <w:rFonts w:ascii="Times New Roman" w:hAnsi="Times New Roman"/>
                       <w:sz w:val="21"/>
                     </w:rPr>
-                    <w:t xml:space="preserve"> verify the daily pipeline job and </w:t>
+                    <w:t xml:space="preserve"> verify </w:t>
                   </w:r>
                   <w:r>
                     <w:rPr>
@@ -4981,7 +4357,7 @@
                       <w:rFonts w:ascii="Times New Roman" w:hAnsi="Times New Roman"/>
                       <w:sz w:val="21"/>
                     </w:rPr>
-                    <w:t xml:space="preserve"> diagnostics against the reproduced baseline; tag this state as the architecture's starting version.</w:t>
+                    <w:t xml:space="preserve"> diagnostics; tag the architecture's starting version.</w:t>
                   </w:r>
                 </w:p>
               </w:tc>
@@ -5043,33 +4419,7 @@
                       <w:rFonts w:ascii="Times New Roman" w:hAnsi="Times New Roman"/>
                       <w:sz w:val="21"/>
                     </w:rPr>
-                    <w:t>– Complete the pattern-discovery families at the five- and twenty-session horizons.</w:t>
-                  </w:r>
-                </w:p>
-                <w:p>
-                  <w:pPr>
-                    <w:spacing w:after="20"/>
-                    <w:jc w:val="left"/>
-                  </w:pPr>
-                  <w:r>
-                    <w:rPr>
-                      <w:rFonts w:ascii="Times New Roman" w:hAnsi="Times New Roman"/>
-                      <w:sz w:val="21"/>
-                    </w:rPr>
-                    <w:t>– Apply superior predictive ability testing at the family level.</w:t>
-                  </w:r>
-                </w:p>
-                <w:p>
-                  <w:pPr>
-                    <w:spacing w:after="20"/>
-                    <w:jc w:val="left"/>
-                  </w:pPr>
-                  <w:r>
-                    <w:rPr>
-                      <w:rFonts w:ascii="Times New Roman" w:hAnsi="Times New Roman"/>
-                      <w:sz w:val="21"/>
-                    </w:rPr>
-                    <w:t>– Document the enumerated hypothesis space in full.</w:t>
+                    <w:t>– Complete pattern-discovery families at h=5/20; document the hypothesis space.</w:t>
                   </w:r>
                 </w:p>
                 <w:p>
@@ -5090,14 +4440,14 @@
                       <w:b/>
                       <w:sz w:val="21"/>
                     </w:rPr>
-                    <w:t>Engineering:</w:t>
+                    <w:t>Eng:</w:t>
                   </w:r>
                   <w:r>
                     <w:rPr>
                       <w:rFonts w:ascii="Times New Roman" w:hAnsi="Times New Roman"/>
                       <w:sz w:val="21"/>
                     </w:rPr>
-                    <w:t xml:space="preserve"> register the new discovery-family results in the model registry served by </w:t>
+                    <w:t xml:space="preserve"> register results in the </w:t>
                   </w:r>
                   <w:r>
                     <w:rPr>
@@ -5111,7 +4461,7 @@
                       <w:rFonts w:ascii="Times New Roman" w:hAnsi="Times New Roman"/>
                       <w:sz w:val="21"/>
                     </w:rPr>
-                    <w:t>.</w:t>
+                    <w:t xml:space="preserve"> registry.</w:t>
                   </w:r>
                 </w:p>
               </w:tc>
@@ -5173,33 +4523,7 @@
                       <w:rFonts w:ascii="Times New Roman" w:hAnsi="Times New Roman"/>
                       <w:sz w:val="21"/>
                     </w:rPr>
-                    <w:t>– Conduct minimum detectable effect size analysis for every negative finding.</w:t>
-                  </w:r>
-                </w:p>
-                <w:p>
-                  <w:pPr>
-                    <w:spacing w:after="20"/>
-                    <w:jc w:val="left"/>
-                  </w:pPr>
-                  <w:r>
-                    <w:rPr>
-                      <w:rFonts w:ascii="Times New Roman" w:hAnsi="Times New Roman"/>
-                      <w:sz w:val="21"/>
-                    </w:rPr>
-                    <w:t>– Validate the discovery funnel with negative controls and known-effect injection.</w:t>
-                  </w:r>
-                </w:p>
-                <w:p>
-                  <w:pPr>
-                    <w:spacing w:after="20"/>
-                    <w:jc w:val="left"/>
-                  </w:pPr>
-                  <w:r>
-                    <w:rPr>
-                      <w:rFonts w:ascii="Times New Roman" w:hAnsi="Times New Roman"/>
-                      <w:sz w:val="21"/>
-                    </w:rPr>
-                    <w:t>– Formalise the power-bounded reporting template.</w:t>
+                    <w:t>– MDES analysis for every negative finding; validate the funnel with negative controls.</w:t>
                   </w:r>
                 </w:p>
                 <w:p>
@@ -5220,14 +4544,14 @@
                       <w:b/>
                       <w:sz w:val="21"/>
                     </w:rPr>
-                    <w:t>Engineering:</w:t>
+                    <w:t>Eng:</w:t>
                   </w:r>
                   <w:r>
                     <w:rPr>
                       <w:rFonts w:ascii="Times New Roman" w:hAnsi="Times New Roman"/>
                       <w:sz w:val="21"/>
                     </w:rPr>
-                    <w:t xml:space="preserve"> extend </w:t>
+                    <w:t xml:space="preserve"> add MDES to </w:t>
                   </w:r>
                   <w:r>
                     <w:rPr>
@@ -5241,7 +4565,7 @@
                       <w:rFonts w:ascii="Times New Roman" w:hAnsi="Times New Roman"/>
                       <w:sz w:val="21"/>
                     </w:rPr>
-                    <w:t xml:space="preserve"> with the MDES figure for every negative finding.</w:t>
+                    <w:t>.</w:t>
                   </w:r>
                 </w:p>
               </w:tc>
@@ -5303,20 +4627,7 @@
                       <w:rFonts w:ascii="Times New Roman" w:hAnsi="Times New Roman"/>
                       <w:sz w:val="21"/>
                     </w:rPr>
-                    <w:t>– Address tail-risk failures for the two pairs failing VaR/ES backtests at the 99% level, using conditional and extreme-value approaches.</w:t>
-                  </w:r>
-                </w:p>
-                <w:p>
-                  <w:pPr>
-                    <w:spacing w:after="20"/>
-                    <w:jc w:val="left"/>
-                  </w:pPr>
-                  <w:r>
-                    <w:rPr>
-                      <w:rFonts w:ascii="Times New Roman" w:hAnsi="Times New Roman"/>
-                      <w:sz w:val="21"/>
-                    </w:rPr>
-                    <w:t>– Recalibrate the twenty-session horizon.</w:t>
+                    <w:t>– Address tail-risk failures (two pairs, 99% VaR/ES); recalibrate h=20.</w:t>
                   </w:r>
                 </w:p>
                 <w:p>
@@ -5337,7 +4648,7 @@
                       <w:b/>
                       <w:sz w:val="21"/>
                     </w:rPr>
-                    <w:t>Engineering:</w:t>
+                    <w:t>Eng:</w:t>
                   </w:r>
                   <w:r>
                     <w:rPr>
@@ -5358,7 +4669,7 @@
                       <w:rFonts w:ascii="Times New Roman" w:hAnsi="Times New Roman"/>
                       <w:sz w:val="21"/>
                     </w:rPr>
-                    <w:t xml:space="preserve">'s VaR/ES fields for the affected pairs and </w:t>
+                    <w:t xml:space="preserve"> and </w:t>
                   </w:r>
                   <w:r>
                     <w:rPr>
@@ -5372,7 +4683,7 @@
                       <w:rFonts w:ascii="Times New Roman" w:hAnsi="Times New Roman"/>
                       <w:sz w:val="21"/>
                     </w:rPr>
-                    <w:t>'s twenty-session horizon.</w:t>
+                    <w:t xml:space="preserve"> fields.</w:t>
                   </w:r>
                 </w:p>
               </w:tc>
@@ -5434,20 +4745,7 @@
                       <w:rFonts w:ascii="Times New Roman" w:hAnsi="Times New Roman"/>
                       <w:sz w:val="21"/>
                     </w:rPr>
-                    <w:t>– Write up the completed exogenous/causal analysis: the ablation and the five-method triangulation (already done, not run here).</w:t>
-                  </w:r>
-                </w:p>
-                <w:p>
-                  <w:pPr>
-                    <w:spacing w:after="20"/>
-                    <w:jc w:val="left"/>
-                  </w:pPr>
-                  <w:r>
-                    <w:rPr>
-                      <w:rFonts w:ascii="Times New Roman" w:hAnsi="Times New Roman"/>
-                      <w:sz w:val="21"/>
-                    </w:rPr>
-                    <w:t>– Report results separately per axis, as already measured.</w:t>
+                    <w:t>– Write up the completed exogenous/causal analysis, per axis.</w:t>
                   </w:r>
                 </w:p>
                 <w:p>
@@ -5468,7 +4766,7 @@
                       <w:b/>
                       <w:sz w:val="21"/>
                     </w:rPr>
-                    <w:t>Engineering:</w:t>
+                    <w:t>Eng:</w:t>
                   </w:r>
                   <w:r>
                     <w:rPr>
@@ -5489,7 +4787,7 @@
                       <w:rFonts w:ascii="Times New Roman" w:hAnsi="Times New Roman"/>
                       <w:sz w:val="21"/>
                     </w:rPr>
-                    <w:t xml:space="preserve"> diagnostic field — not used to alter the forecast value.</w:t>
+                    <w:t xml:space="preserve"> field.</w:t>
                   </w:r>
                 </w:p>
               </w:tc>
@@ -5551,20 +4849,7 @@
                       <w:rFonts w:ascii="Times New Roman" w:hAnsi="Times New Roman"/>
                       <w:sz w:val="21"/>
                     </w:rPr>
-                    <w:t>– Evaluate the end-to-end economic result after measured transaction costs and slippage.</w:t>
-                  </w:r>
-                </w:p>
-                <w:p>
-                  <w:pPr>
-                    <w:spacing w:after="20"/>
-                    <w:jc w:val="left"/>
-                  </w:pPr>
-                  <w:r>
-                    <w:rPr>
-                      <w:rFonts w:ascii="Times New Roman" w:hAnsi="Times New Roman"/>
-                      <w:sz w:val="21"/>
-                    </w:rPr>
-                    <w:t>– Accumulate the forecast journal; compute rolling calibration.</w:t>
+                    <w:t>– End-to-end economic result after costs/slippage; accumulate the forecast journal.</w:t>
                   </w:r>
                 </w:p>
                 <w:p>
@@ -5585,7 +4870,7 @@
                       <w:b/>
                       <w:sz w:val="21"/>
                     </w:rPr>
-                    <w:t>Engineering:</w:t>
+                    <w:t>Eng:</w:t>
                   </w:r>
                   <w:r>
                     <w:rPr>
@@ -5606,7 +4891,7 @@
                       <w:rFonts w:ascii="Times New Roman" w:hAnsi="Times New Roman"/>
                       <w:sz w:val="21"/>
                     </w:rPr>
-                    <w:t xml:space="preserve"> with cost-adjusted performance and rolling calibration diagnostics.</w:t>
+                    <w:t xml:space="preserve"> with rolling calibration.</w:t>
                   </w:r>
                 </w:p>
               </w:tc>
@@ -5668,20 +4953,7 @@
                       <w:rFonts w:ascii="Times New Roman" w:hAnsi="Times New Roman"/>
                       <w:sz w:val="21"/>
                     </w:rPr>
-                    <w:t>– Freeze the final configuration in writing: variables, selection method, models, metrics, decision rules.</w:t>
-                  </w:r>
-                </w:p>
-                <w:p>
-                  <w:pPr>
-                    <w:spacing w:after="20"/>
-                    <w:jc w:val="left"/>
-                  </w:pPr>
-                  <w:r>
-                    <w:rPr>
-                      <w:rFonts w:ascii="Times New Roman" w:hAnsi="Times New Roman"/>
-                      <w:sz w:val="21"/>
-                    </w:rPr>
-                    <w:t>– Prepare the sealed-set evaluation record.</w:t>
+                    <w:t>– Freeze the final configuration in writing; prepare the sealed-set record.</w:t>
                   </w:r>
                 </w:p>
                 <w:p>
@@ -5702,14 +4974,14 @@
                       <w:b/>
                       <w:sz w:val="21"/>
                     </w:rPr>
-                    <w:t>Engineering:</w:t>
+                    <w:t>Eng:</w:t>
                   </w:r>
                   <w:r>
                     <w:rPr>
                       <w:rFonts w:ascii="Times New Roman" w:hAnsi="Times New Roman"/>
                       <w:sz w:val="21"/>
                     </w:rPr>
-                    <w:t xml:space="preserve"> tag and freeze the API response schemas and forecast-artefact version.</w:t>
+                    <w:t xml:space="preserve"> tag and freeze API schemas and the artefact version.</w:t>
                   </w:r>
                 </w:p>
               </w:tc>
@@ -5771,20 +5043,7 @@
                       <w:rFonts w:ascii="Times New Roman" w:hAnsi="Times New Roman"/>
                       <w:sz w:val="21"/>
                     </w:rPr>
-                    <w:t>– Open the sealed evaluation set exactly once; score the frozen configuration.</w:t>
-                  </w:r>
-                </w:p>
-                <w:p>
-                  <w:pPr>
-                    <w:spacing w:after="20"/>
-                    <w:jc w:val="left"/>
-                  </w:pPr>
-                  <w:r>
-                    <w:rPr>
-                      <w:rFonts w:ascii="Times New Roman" w:hAnsi="Times New Roman"/>
-                      <w:sz w:val="21"/>
-                    </w:rPr>
-                    <w:t>– Report results without modification or retuning.</w:t>
+                    <w:t>– Open the sealed set once; score without retuning.</w:t>
                   </w:r>
                 </w:p>
                 <w:p>
@@ -5805,14 +5064,14 @@
                       <w:b/>
                       <w:sz w:val="21"/>
                     </w:rPr>
-                    <w:t>Engineering:</w:t>
+                    <w:t>Eng:</w:t>
                   </w:r>
                   <w:r>
                     <w:rPr>
                       <w:rFonts w:ascii="Times New Roman" w:hAnsi="Times New Roman"/>
                       <w:sz w:val="21"/>
                     </w:rPr>
-                    <w:t xml:space="preserve"> serve sealed-set results through the same frozen endpoints used throughout — no separate reporting path.</w:t>
+                    <w:t xml:space="preserve"> serve results through the same frozen endpoints.</w:t>
                   </w:r>
                 </w:p>
               </w:tc>
@@ -5874,20 +5133,7 @@
                       <w:rFonts w:ascii="Times New Roman" w:hAnsi="Times New Roman"/>
                       <w:sz w:val="21"/>
                     </w:rPr>
-                    <w:t>– Complete the system: computation layer, versioned forecast artefacts, API, and UI with full provenance for every displayed quantity.</w:t>
-                  </w:r>
-                </w:p>
-                <w:p>
-                  <w:pPr>
-                    <w:spacing w:after="20"/>
-                    <w:jc w:val="left"/>
-                  </w:pPr>
-                  <w:r>
-                    <w:rPr>
-                      <w:rFonts w:ascii="Times New Roman" w:hAnsi="Times New Roman"/>
-                      <w:sz w:val="21"/>
-                    </w:rPr>
-                    <w:t>– Verify continuous daily operation.</w:t>
+                    <w:t>– Complete the system: computation layer, versioned artefacts, API, UI with full provenance; verify continuous operation.</w:t>
                   </w:r>
                 </w:p>
               </w:tc>
@@ -5949,7 +5195,7 @@
                       <w:rFonts w:ascii="Times New Roman" w:hAnsi="Times New Roman"/>
                       <w:sz w:val="21"/>
                     </w:rPr>
-                    <w:t>– Analyse model behaviour by regime, pair, and year; examine failure cases and document limitations.</w:t>
+                    <w:t>– Analyse behaviour by regime/pair/year; document failure cases.</w:t>
                   </w:r>
                 </w:p>
                 <w:p>
@@ -5970,14 +5216,14 @@
                       <w:b/>
                       <w:sz w:val="21"/>
                     </w:rPr>
-                    <w:t>Engineering:</w:t>
+                    <w:t>Eng:</w:t>
                   </w:r>
                   <w:r>
                     <w:rPr>
                       <w:rFonts w:ascii="Times New Roman" w:hAnsi="Times New Roman"/>
                       <w:sz w:val="21"/>
                     </w:rPr>
-                    <w:t xml:space="preserve"> add regime-, pair-, and year-conditional breakdowns to the risk and calibration views.</w:t>
+                    <w:t xml:space="preserve"> add regime/pair/year breakdowns to the UI.</w:t>
                   </w:r>
                 </w:p>
               </w:tc>
@@ -6039,7 +5285,7 @@
                       <w:rFonts w:ascii="Times New Roman" w:hAnsi="Times New Roman"/>
                       <w:sz w:val="21"/>
                     </w:rPr>
-                    <w:t>– Complete the thesis report; revise content per advisor feedback; prepare for the final defence.</w:t>
+                    <w:t>– Complete the thesis report; revise per feedback; prepare the defence.</w:t>
                   </w:r>
                 </w:p>
               </w:tc>
@@ -6075,6 +5321,118 @@
               </w:rPr>
             </w:r>
           </w:p>
+        </w:tc>
+      </w:tr>
+      <w:tr>
+        <w:tc>
+          <w:tcPr>
+            <w:tcW w:type="dxa" w:w="9973"/>
+          </w:tcPr>
+          <w:p>
+            <w:pPr>
+              <w:spacing w:after="100"/>
+            </w:pPr>
+            <w:r>
+              <w:rPr>
+                <w:rFonts w:ascii="Times New Roman" w:hAnsi="Times New Roman"/>
+                <w:b/>
+                <w:sz w:val="24"/>
+              </w:rPr>
+              <w:t>Deferred / Future Work (Not Scheduled):</w:t>
+            </w:r>
+          </w:p>
+          <w:p>
+            <w:pPr>
+              <w:pStyle w:val="ListBullet"/>
+              <w:spacing w:after="60"/>
+              <w:ind w:left="454"/>
+              <w:jc w:val="both"/>
+            </w:pPr>
+            <w:r>
+              <w:rPr>
+                <w:rFonts w:ascii="Times New Roman" w:hAnsi="Times New Roman"/>
+                <w:b/>
+                <w:sz w:val="24"/>
+              </w:rPr>
+              <w:t>Causal-conditioned forecast overlay.</w:t>
+            </w:r>
+            <w:r>
+              <w:rPr>
+                <w:rFonts w:ascii="Times New Roman" w:hAnsi="Times New Roman"/>
+                <w:sz w:val="24"/>
+              </w:rPr>
+              <w:t xml:space="preserve"> The VIX effect is robust (6/6 pairs), but overlaying it on the HAR forecast gave no significant QLIKE gain — deferred pending a better functional form.</w:t>
+            </w:r>
+          </w:p>
+          <w:p>
+            <w:pPr>
+              <w:pStyle w:val="ListBullet"/>
+              <w:spacing w:after="60"/>
+              <w:ind w:left="454"/>
+              <w:jc w:val="both"/>
+            </w:pPr>
+            <w:r>
+              <w:rPr>
+                <w:rFonts w:ascii="Times New Roman" w:hAnsi="Times New Roman"/>
+                <w:b/>
+                <w:sz w:val="24"/>
+              </w:rPr>
+              <w:t>Contemporaneous causal edges (PCMCI+, τ=0).</w:t>
+            </w:r>
+            <w:r>
+              <w:rPr>
+                <w:rFonts w:ascii="Times New Roman" w:hAnsi="Times New Roman"/>
+                <w:sz w:val="24"/>
+              </w:rPr>
+              <w:t xml:space="preserve"> Sign-ambiguous edges inconsistent with the frozen lagged result — needs a larger sample or a nonlinear test.</w:t>
+            </w:r>
+          </w:p>
+          <w:p>
+            <w:pPr>
+              <w:pStyle w:val="ListBullet"/>
+              <w:spacing w:after="60"/>
+              <w:ind w:left="454"/>
+              <w:jc w:val="both"/>
+            </w:pPr>
+            <w:r>
+              <w:rPr>
+                <w:rFonts w:ascii="Times New Roman" w:hAnsi="Times New Roman"/>
+                <w:b/>
+                <w:sz w:val="24"/>
+              </w:rPr>
+              <w:t>Cross-pair volatility spillover (DYNOTEARS).</w:t>
+            </w:r>
+            <w:r>
+              <w:rPr>
+                <w:rFonts w:ascii="Times New Roman" w:hAnsi="Times New Roman"/>
+                <w:sz w:val="24"/>
+              </w:rPr>
+              <w:t xml:space="preserve"> Real structure detected but does not improve test-set QLIKE as an added feature — not yet forecastable at a daily horizon.</w:t>
+            </w:r>
+          </w:p>
+          <w:p>
+            <w:pPr>
+              <w:pStyle w:val="ListBullet"/>
+              <w:spacing w:after="60"/>
+              <w:ind w:left="454"/>
+              <w:jc w:val="both"/>
+            </w:pPr>
+            <w:r>
+              <w:rPr>
+                <w:rFonts w:ascii="Times New Roman" w:hAnsi="Times New Roman"/>
+                <w:b/>
+                <w:sz w:val="24"/>
+              </w:rPr>
+              <w:t>FX-specific implied volatility (`EVZCLS`)</w:t>
+            </w:r>
+            <w:r>
+              <w:rPr>
+                <w:rFonts w:ascii="Times New Roman" w:hAnsi="Times New Roman"/>
+                <w:sz w:val="24"/>
+              </w:rPr>
+              <w:t xml:space="preserve"> was discontinued in March 2025 and is unavailable.</w:t>
+            </w:r>
+          </w:p>
           <w:p>
             <w:pPr>
               <w:spacing w:after="100"/>
@@ -6086,7 +5444,7 @@
                 <w:rFonts w:ascii="Times New Roman" w:hAnsi="Times New Roman"/>
                 <w:sz w:val="24"/>
               </w:rPr>
-              <w:t>Software-architecture work therefore runs across Weeks 1–15, extending the operating API and web application one layer at a time as each research result is frozen, rather than being concentrated at the end.</w:t>
+              <w:t>None of the above blocks the sealed-set evaluation or system hardening in Weeks 12–15.</w:t>
             </w:r>
           </w:p>
         </w:tc>
@@ -6106,7 +5464,7 @@
                 <w:b/>
                 <w:sz w:val="24"/>
               </w:rPr>
-              <w:t>Deferred / Future Work (Not Scheduled in This Thesis):</w:t>
+              <w:t>Work Assignment:</w:t>
             </w:r>
           </w:p>
           <w:p>
@@ -6118,179 +5476,10 @@
             <w:r>
               <w:rPr>
                 <w:rFonts w:ascii="Times New Roman" w:hAnsi="Times New Roman"/>
-                <w:sz w:val="24"/>
-              </w:rPr>
-              <w:t xml:space="preserve">Directions surfaced by completed experiments that are explicitly </w:t>
-            </w:r>
-            <w:r>
-              <w:rPr>
-                <w:rFonts w:ascii="Times New Roman" w:hAnsi="Times New Roman"/>
-                <w:b/>
-                <w:sz w:val="24"/>
-              </w:rPr>
-              <w:t>not</w:t>
-            </w:r>
-            <w:r>
-              <w:rPr>
-                <w:rFonts w:ascii="Times New Roman" w:hAnsi="Times New Roman"/>
-                <w:sz w:val="24"/>
-              </w:rPr>
-              <w:t xml:space="preserve"> part of the sixteen-week plan, kept separate from Proposed Method so the timeline stays honest about what is actually committed:</w:t>
-            </w:r>
-          </w:p>
-          <w:p>
-            <w:pPr>
-              <w:pStyle w:val="ListBullet"/>
-              <w:spacing w:after="60"/>
-              <w:ind w:left="454"/>
-              <w:jc w:val="both"/>
-            </w:pPr>
-            <w:r>
-              <w:rPr>
-                <w:rFonts w:ascii="Times New Roman" w:hAnsi="Times New Roman"/>
-                <w:b/>
-                <w:sz w:val="24"/>
-              </w:rPr>
-              <w:t>Causal-conditioned forecast overlay.</w:t>
-            </w:r>
-            <w:r>
-              <w:rPr>
-                <w:rFonts w:ascii="Times New Roman" w:hAnsi="Times New Roman"/>
-                <w:sz w:val="24"/>
-              </w:rPr>
-              <w:t xml:space="preserve"> The VIX effect is real and robust (Double ML, 6/6 pairs significant after Holm correction), but a constant or Causal-Forest regime-conditional overlay on the HAR forecast gave no significant QLIKE improvement in any pair. Deferred pending a better functional form, or acceptance that the baseline already absorbs it.</w:t>
-            </w:r>
-          </w:p>
-          <w:p>
-            <w:pPr>
-              <w:pStyle w:val="ListBullet"/>
-              <w:spacing w:after="60"/>
-              <w:ind w:left="454"/>
-              <w:jc w:val="both"/>
-            </w:pPr>
-            <w:r>
-              <w:rPr>
-                <w:rFonts w:ascii="Times New Roman" w:hAnsi="Times New Roman"/>
-                <w:b/>
-                <w:sz w:val="24"/>
-              </w:rPr>
-              <w:t>Contemporaneous causal edges (PCMCI+, τ = 0).</w:t>
-            </w:r>
-            <w:r>
-              <w:rPr>
-                <w:rFonts w:ascii="Times New Roman" w:hAnsi="Times New Roman"/>
-                <w:sz w:val="24"/>
-              </w:rPr>
-              <w:t xml:space="preserve"> Undirected or sign-ambiguous edges between implied-volatility variables and FX volatility, inconsistent with the frozen lagged result — resolving this needs a larger sample or a nonlinear conditional-independence test.</w:t>
-            </w:r>
-          </w:p>
-          <w:p>
-            <w:pPr>
-              <w:pStyle w:val="ListBullet"/>
-              <w:spacing w:after="60"/>
-              <w:ind w:left="454"/>
-              <w:jc w:val="both"/>
-            </w:pPr>
-            <w:r>
-              <w:rPr>
-                <w:rFonts w:ascii="Times New Roman" w:hAnsi="Times New Roman"/>
-                <w:b/>
-                <w:sz w:val="24"/>
-              </w:rPr>
-              <w:t>Cross-pair volatility spillover (DYNOTEARS).</w:t>
-            </w:r>
-            <w:r>
-              <w:rPr>
-                <w:rFonts w:ascii="Times New Roman" w:hAnsi="Times New Roman"/>
-                <w:sz w:val="24"/>
-              </w:rPr>
-              <w:t xml:space="preserve"> A self-implemented DYNOTEARS network detects contemporaneous spillover (e.g., AUD/USD↔USD/CAD, EUR/USD→USD/CHF) consistent with an independently run linear Diebold–Yilmaz measure, but neither improves test-set QLIKE when added as an extra HAR feature (six-pair average 0.1281 vs. 0.1285) — real structure, not yet forecastable at a daily horizon.</w:t>
-            </w:r>
-          </w:p>
-          <w:p>
-            <w:pPr>
-              <w:pStyle w:val="ListBullet"/>
-              <w:spacing w:after="60"/>
-              <w:ind w:left="454"/>
-              <w:jc w:val="both"/>
-            </w:pPr>
-            <w:r>
-              <w:rPr>
-                <w:rFonts w:ascii="Times New Roman" w:hAnsi="Times New Roman"/>
-                <w:b/>
-                <w:sz w:val="24"/>
-              </w:rPr>
-              <w:t>FX-specific implied volatility.</w:t>
-            </w:r>
-            <w:r>
-              <w:rPr>
-                <w:rFonts w:ascii="Times New Roman" w:hAnsi="Times New Roman"/>
-                <w:sz w:val="24"/>
-              </w:rPr>
-              <w:t xml:space="preserve"> </w:t>
-            </w:r>
-            <w:r>
-              <w:rPr>
-                <w:rFonts w:ascii="Consolas" w:hAnsi="Consolas"/>
-                <w:sz w:val="24"/>
-              </w:rPr>
-              <w:t>EVZCLS</w:t>
-            </w:r>
-            <w:r>
-              <w:rPr>
-                <w:rFonts w:ascii="Times New Roman" w:hAnsi="Times New Roman"/>
-                <w:sz w:val="24"/>
-              </w:rPr>
-              <w:t>, the single most promising untested candidate, was discontinued by CBOE in March 2025 and is unavailable for this sample.</w:t>
-            </w:r>
-          </w:p>
-          <w:p>
-            <w:pPr>
-              <w:spacing w:after="100"/>
-              <w:ind w:firstLine="340"/>
-              <w:jc w:val="both"/>
-            </w:pPr>
-            <w:r>
-              <w:rPr>
-                <w:rFonts w:ascii="Times New Roman" w:hAnsi="Times New Roman"/>
-                <w:sz w:val="24"/>
-              </w:rPr>
-              <w:t>None of the above blocks the sealed-set evaluation or system hardening in Weeks 12–15: the production magnitude forecast continues to rely on the extended-HAR baseline alone, with the causal layer contributing to feature-trust validation but not to the forecast value itself.</w:t>
-            </w:r>
-          </w:p>
-        </w:tc>
-      </w:tr>
-      <w:tr>
-        <w:tc>
-          <w:tcPr>
-            <w:tcW w:type="dxa" w:w="9973"/>
-          </w:tcPr>
-          <w:p>
-            <w:pPr>
-              <w:spacing w:after="100"/>
-            </w:pPr>
-            <w:r>
-              <w:rPr>
-                <w:rFonts w:ascii="Times New Roman" w:hAnsi="Times New Roman"/>
-                <w:b/>
-                <w:sz w:val="24"/>
-              </w:rPr>
-              <w:t>Work Assignment:</w:t>
-            </w:r>
-          </w:p>
-          <w:p>
-            <w:pPr>
-              <w:spacing w:after="100"/>
-              <w:ind w:firstLine="340"/>
-              <w:jc w:val="both"/>
-            </w:pPr>
-            <w:r>
-              <w:rPr>
-                <w:rFonts w:ascii="Times New Roman" w:hAnsi="Times New Roman"/>
                 <w:i/>
                 <w:sz w:val="24"/>
               </w:rPr>
-              <w:t>(Percentage split confirmed against the two members' actual division of labour, not the undifferentiated 50/50 the advisor explicitly rejected. Both members remain jointly responsible for the correctness of the full system regardless of the split below.)</w:t>
+              <w:t>(Percentage split confirmed against actual division of labour, not the undifferentiated 50/50 the advisor rejected. Both members remain jointly responsible for the whole system.)</w:t>
             </w:r>
           </w:p>
           <w:tbl>
@@ -6839,7 +6028,7 @@
                       <w:rFonts w:ascii="Times New Roman" w:hAnsi="Times New Roman"/>
                       <w:sz w:val="21"/>
                     </w:rPr>
-                    <w:t>Develop the exogenous, causal (five-method triangulation), and cross-asset information layers</w:t>
+                    <w:t>Develop the exogenous, causal, and cross-asset information layers</w:t>
                   </w:r>
                 </w:p>
               </w:tc>

</xml_diff>

<commit_message>
Bo sung 2 muc thuc nghiem tam thoi (proposed) vao proposal
Tail-risk recalibration (USDJPY covariate-shift, USDCHF SNB-window
exclusion) va meta-labeling+VIX confidence layer bi cat trong ban rut
gon 11 trang truoc, nay them lai voi nhan (proposed) de phan biet ro
voi phan da implement, dung quy uoc da dung cho causal overlay.

Co-Authored-By: Claude Sonnet 5 <noreply@anthropic.com>
</commit_message>
<xml_diff>
--- a/docs/THESIS_PROPOSAL.docx
+++ b/docs/THESIS_PROPOSAL.docx
@@ -1131,7 +1131,45 @@
                 <w:rFonts w:ascii="Times New Roman" w:hAnsi="Times New Roman"/>
                 <w:sz w:val="24"/>
               </w:rPr>
-              <w:t xml:space="preserve"> Portfolio-correlation adjustment and a measured slippage coefficient.</w:t>
+              <w:t xml:space="preserve"> Two pair-specific tail-risk recalibrations, each diagnosed but not yet frozen: covariate-shift-weighted conformal/EVT quantiles for USD/JPY's confirmed distribution drift, and change-point-isolated exclusion of USD/CHF's 2015 SNB shock window; plus a portfolio-correlation adjustment and a measured slippage coefficient.</w:t>
+            </w:r>
+          </w:p>
+          <w:p>
+            <w:pPr>
+              <w:pStyle w:val="ListBullet"/>
+              <w:spacing w:after="60"/>
+              <w:ind w:left="454"/>
+              <w:jc w:val="both"/>
+            </w:pPr>
+            <w:r>
+              <w:rPr>
+                <w:rFonts w:ascii="Times New Roman" w:hAnsi="Times New Roman"/>
+                <w:b/>
+                <w:sz w:val="24"/>
+              </w:rPr>
+              <w:t>Meta-labeling confidence layer.</w:t>
+            </w:r>
+            <w:r>
+              <w:rPr>
+                <w:rFonts w:ascii="Times New Roman" w:hAnsi="Times New Roman"/>
+                <w:sz w:val="24"/>
+              </w:rPr>
+              <w:t xml:space="preserve"> </w:t>
+            </w:r>
+            <w:r>
+              <w:rPr>
+                <w:rFonts w:ascii="Times New Roman" w:hAnsi="Times New Roman"/>
+                <w:i/>
+                <w:sz w:val="24"/>
+              </w:rPr>
+              <w:t>(proposed)</w:t>
+            </w:r>
+            <w:r>
+              <w:rPr>
+                <w:rFonts w:ascii="Times New Roman" w:hAnsi="Times New Roman"/>
+                <w:sz w:val="24"/>
+              </w:rPr>
+              <w:t xml:space="preserve"> A secondary model that decides sizing/confidence rather than re-predicting direction [35]. After removing a circular-feature leak, preliminary skill (Brier skill score) is positive in 3/6 pairs, rising to 5/6 when the feature set is augmented with an exogenous implied-volatility index — a candidate risk-layer addition, integration not yet finalized.</w:t>
             </w:r>
           </w:p>
           <w:p>
@@ -4119,6 +4157,35 @@
                 <w:sz w:val="24"/>
               </w:rPr>
               <w:t>, vol. 113, no. 523, pp. 1228–1242, 2018, doi: 10.1080/01621459.2017.1319839.</w:t>
+            </w:r>
+          </w:p>
+          <w:p>
+            <w:pPr>
+              <w:spacing w:after="100"/>
+              <w:ind w:firstLine="340"/>
+              <w:jc w:val="both"/>
+            </w:pPr>
+            <w:r>
+              <w:rPr>
+                <w:rFonts w:ascii="Times New Roman" w:hAnsi="Times New Roman"/>
+                <w:sz w:val="24"/>
+              </w:rPr>
+              <w:t xml:space="preserve">[35] M. López de Prado, </w:t>
+            </w:r>
+            <w:r>
+              <w:rPr>
+                <w:rFonts w:ascii="Times New Roman" w:hAnsi="Times New Roman"/>
+                <w:i/>
+                <w:sz w:val="24"/>
+              </w:rPr>
+              <w:t>Advances in Financial Machine Learning</w:t>
+            </w:r>
+            <w:r>
+              <w:rPr>
+                <w:rFonts w:ascii="Times New Roman" w:hAnsi="Times New Roman"/>
+                <w:sz w:val="24"/>
+              </w:rPr>
+              <w:t>. Hoboken, NJ, USA: John Wiley &amp; Sons, 2018.</w:t>
             </w:r>
           </w:p>
         </w:tc>
@@ -4849,7 +4916,7 @@
                       <w:rFonts w:ascii="Times New Roman" w:hAnsi="Times New Roman"/>
                       <w:sz w:val="21"/>
                     </w:rPr>
-                    <w:t>– End-to-end economic result after costs/slippage; accumulate the forecast journal.</w:t>
+                    <w:t>– End-to-end economic result after costs/slippage; evaluate the meta-labeling confidence layer as a candidate sizing adjustment.</w:t>
                   </w:r>
                 </w:p>
                 <w:p>

</xml_diff>

<commit_message>
Doi bang module-contract sang van xuoi cho tu nhien hon
Bang tu-cot voi duong dan file/bien code (collect/*.py, api/cache.py,
pan/xs/sig...) doc giong tai lieu code noi bo hon la de cuong hoc thuat.
Gop lai thanh 2 cau, giu nguyen y (contract giua cac tang, daily job
khong tinh lai qua duong code thu hai), bo cu phap code.

Co-Authored-By: Claude Sonnet 5 <noreply@anthropic.com>
</commit_message>
<xml_diff>
--- a/docs/THESIS_PROPOSAL.docx
+++ b/docs/THESIS_PROPOSAL.docx
@@ -2024,673 +2024,14 @@
                 <w:b/>
                 <w:sz w:val="24"/>
               </w:rPr>
-              <w:t>Module contract</w:t>
-            </w:r>
-            <w:r>
-              <w:rPr>
-                <w:rFonts w:ascii="Times New Roman" w:hAnsi="Times New Roman"/>
-                <w:sz w:val="24"/>
-              </w:rPr>
-              <w:t>, enforced in code, not an informal call:</w:t>
-            </w:r>
-          </w:p>
-          <w:tbl>
-            <w:tblPr>
-              <w:tblW w:type="auto" w:w="0"/>
-              <w:jc w:val="center"/>
-              <w:tblLook w:firstColumn="1" w:firstRow="1" w:lastColumn="0" w:lastRow="0" w:noHBand="0" w:noVBand="1" w:val="04A0"/>
-              <w:tblBorders>
-                <w:top w:val="single" w:sz="8" w:color="000000"/>
-                <w:left w:val="single" w:sz="8" w:color="000000"/>
-                <w:bottom w:val="single" w:sz="8" w:color="000000"/>
-                <w:right w:val="single" w:sz="8" w:color="000000"/>
-                <w:insideH w:val="single" w:sz="8" w:color="000000"/>
-                <w:insideV w:val="single" w:sz="8" w:color="000000"/>
-              </w:tblBorders>
-              <w:tblCellMar>
-                <w:top w:w="40" w:type="dxa"/>
-                <w:bottom w:w="40" w:type="dxa"/>
-                <w:left w:w="80" w:type="dxa"/>
-                <w:right w:w="80" w:type="dxa"/>
-              </w:tblCellMar>
-            </w:tblPr>
-            <w:tblGrid>
-              <w:gridCol w:w="2493"/>
-              <w:gridCol w:w="2493"/>
-              <w:gridCol w:w="2493"/>
-              <w:gridCol w:w="2493"/>
-            </w:tblGrid>
-            <w:tr>
-              <w:trPr>
-                <w:cantSplit/>
-                <w:tblHeader/>
-              </w:trPr>
-              <w:tc>
-                <w:tcPr>
-                  <w:tcW w:type="dxa" w:w="2493"/>
-                </w:tcPr>
-                <w:p>
-                  <w:pPr>
-                    <w:spacing w:after="20"/>
-                    <w:jc w:val="left"/>
-                  </w:pPr>
-                  <w:r/>
-                  <w:r>
-                    <w:rPr>
-                      <w:rFonts w:ascii="Times New Roman" w:hAnsi="Times New Roman"/>
-                      <w:b/>
-                      <w:sz w:val="21"/>
-                    </w:rPr>
-                    <w:t>From</w:t>
-                  </w:r>
-                </w:p>
-              </w:tc>
-              <w:tc>
-                <w:tcPr>
-                  <w:tcW w:type="dxa" w:w="2493"/>
-                </w:tcPr>
-                <w:p>
-                  <w:pPr>
-                    <w:spacing w:after="20"/>
-                    <w:jc w:val="left"/>
-                  </w:pPr>
-                  <w:r/>
-                  <w:r>
-                    <w:rPr>
-                      <w:rFonts w:ascii="Times New Roman" w:hAnsi="Times New Roman"/>
-                      <w:b/>
-                      <w:sz w:val="21"/>
-                    </w:rPr>
-                    <w:t>To</w:t>
-                  </w:r>
-                </w:p>
-              </w:tc>
-              <w:tc>
-                <w:tcPr>
-                  <w:tcW w:type="dxa" w:w="2493"/>
-                </w:tcPr>
-                <w:p>
-                  <w:pPr>
-                    <w:spacing w:after="20"/>
-                    <w:jc w:val="left"/>
-                  </w:pPr>
-                  <w:r/>
-                  <w:r>
-                    <w:rPr>
-                      <w:rFonts w:ascii="Times New Roman" w:hAnsi="Times New Roman"/>
-                      <w:b/>
-                      <w:sz w:val="21"/>
-                    </w:rPr>
-                    <w:t>Via</w:t>
-                  </w:r>
-                </w:p>
-              </w:tc>
-              <w:tc>
-                <w:tcPr>
-                  <w:tcW w:type="dxa" w:w="2493"/>
-                </w:tcPr>
-                <w:p>
-                  <w:pPr>
-                    <w:spacing w:after="20"/>
-                    <w:jc w:val="left"/>
-                  </w:pPr>
-                  <w:r/>
-                  <w:r>
-                    <w:rPr>
-                      <w:rFonts w:ascii="Times New Roman" w:hAnsi="Times New Roman"/>
-                      <w:b/>
-                      <w:sz w:val="21"/>
-                    </w:rPr>
-                    <w:t>Format</w:t>
-                  </w:r>
-                </w:p>
-              </w:tc>
-            </w:tr>
-            <w:tr>
-              <w:trPr>
-                <w:cantSplit/>
-              </w:trPr>
-              <w:tc>
-                <w:tcPr>
-                  <w:tcW w:type="dxa" w:w="2493"/>
-                </w:tcPr>
-                <w:p>
-                  <w:pPr>
-                    <w:spacing w:after="20"/>
-                    <w:jc w:val="left"/>
-                  </w:pPr>
-                  <w:r/>
-                  <w:r>
-                    <w:rPr>
-                      <w:rFonts w:ascii="Consolas" w:hAnsi="Consolas"/>
-                      <w:sz w:val="21"/>
-                    </w:rPr>
-                    <w:t>collect/*.py</w:t>
-                  </w:r>
-                </w:p>
-              </w:tc>
-              <w:tc>
-                <w:tcPr>
-                  <w:tcW w:type="dxa" w:w="2493"/>
-                </w:tcPr>
-                <w:p>
-                  <w:pPr>
-                    <w:spacing w:after="20"/>
-                    <w:jc w:val="left"/>
-                  </w:pPr>
-                  <w:r/>
-                  <w:r>
-                    <w:rPr>
-                      <w:rFonts w:ascii="Consolas" w:hAnsi="Consolas"/>
-                      <w:sz w:val="21"/>
-                    </w:rPr>
-                    <w:t>data/</w:t>
-                  </w:r>
-                </w:p>
-              </w:tc>
-              <w:tc>
-                <w:tcPr>
-                  <w:tcW w:type="dxa" w:w="2493"/>
-                </w:tcPr>
-                <w:p>
-                  <w:pPr>
-                    <w:spacing w:after="20"/>
-                    <w:jc w:val="left"/>
-                  </w:pPr>
-                  <w:r/>
-                  <w:r>
-                    <w:rPr>
-                      <w:rFonts w:ascii="Times New Roman" w:hAnsi="Times New Roman"/>
-                      <w:sz w:val="21"/>
-                    </w:rPr>
-                    <w:t>direct write</w:t>
-                  </w:r>
-                </w:p>
-              </w:tc>
-              <w:tc>
-                <w:tcPr>
-                  <w:tcW w:type="dxa" w:w="2493"/>
-                </w:tcPr>
-                <w:p>
-                  <w:pPr>
-                    <w:spacing w:after="20"/>
-                    <w:jc w:val="left"/>
-                  </w:pPr>
-                  <w:r/>
-                  <w:r>
-                    <w:rPr>
-                      <w:rFonts w:ascii="Times New Roman" w:hAnsi="Times New Roman"/>
-                      <w:sz w:val="21"/>
-                    </w:rPr>
-                    <w:t>fixed columns</w:t>
-                  </w:r>
-                </w:p>
-              </w:tc>
-            </w:tr>
-            <w:tr>
-              <w:trPr>
-                <w:cantSplit/>
-              </w:trPr>
-              <w:tc>
-                <w:tcPr>
-                  <w:tcW w:type="dxa" w:w="2493"/>
-                </w:tcPr>
-                <w:p>
-                  <w:pPr>
-                    <w:spacing w:after="20"/>
-                    <w:jc w:val="left"/>
-                  </w:pPr>
-                  <w:r/>
-                  <w:r>
-                    <w:rPr>
-                      <w:rFonts w:ascii="Consolas" w:hAnsi="Consolas"/>
-                      <w:sz w:val="21"/>
-                    </w:rPr>
-                    <w:t>data/</w:t>
-                  </w:r>
-                </w:p>
-              </w:tc>
-              <w:tc>
-                <w:tcPr>
-                  <w:tcW w:type="dxa" w:w="2493"/>
-                </w:tcPr>
-                <w:p>
-                  <w:pPr>
-                    <w:spacing w:after="20"/>
-                    <w:jc w:val="left"/>
-                  </w:pPr>
-                  <w:r/>
-                  <w:r>
-                    <w:rPr>
-                      <w:rFonts w:ascii="Consolas" w:hAnsi="Consolas"/>
-                      <w:sz w:val="21"/>
-                    </w:rPr>
-                    <w:t>api/cache.py</w:t>
-                  </w:r>
-                </w:p>
-              </w:tc>
-              <w:tc>
-                <w:tcPr>
-                  <w:tcW w:type="dxa" w:w="2493"/>
-                </w:tcPr>
-                <w:p>
-                  <w:pPr>
-                    <w:spacing w:after="20"/>
-                    <w:jc w:val="left"/>
-                  </w:pPr>
-                  <w:r/>
-                  <w:r>
-                    <w:rPr>
-                      <w:rFonts w:ascii="Times New Roman" w:hAnsi="Times New Roman"/>
-                      <w:sz w:val="21"/>
-                    </w:rPr>
-                    <w:t>fixed-path read</w:t>
-                  </w:r>
-                </w:p>
-              </w:tc>
-              <w:tc>
-                <w:tcPr>
-                  <w:tcW w:type="dxa" w:w="2493"/>
-                </w:tcPr>
-                <w:p>
-                  <w:pPr>
-                    <w:spacing w:after="20"/>
-                    <w:jc w:val="left"/>
-                  </w:pPr>
-                  <w:r/>
-                  <w:r>
-                    <w:rPr>
-                      <w:rFonts w:ascii="Consolas" w:hAnsi="Consolas"/>
-                      <w:sz w:val="21"/>
-                    </w:rPr>
-                    <w:t>Date, open, …, rv5</w:t>
-                  </w:r>
-                </w:p>
-              </w:tc>
-            </w:tr>
-            <w:tr>
-              <w:trPr>
-                <w:cantSplit/>
-              </w:trPr>
-              <w:tc>
-                <w:tcPr>
-                  <w:tcW w:type="dxa" w:w="2493"/>
-                </w:tcPr>
-                <w:p>
-                  <w:pPr>
-                    <w:spacing w:after="20"/>
-                    <w:jc w:val="left"/>
-                  </w:pPr>
-                  <w:r/>
-                  <w:r>
-                    <w:rPr>
-                      <w:rFonts w:ascii="Consolas" w:hAnsi="Consolas"/>
-                      <w:sz w:val="21"/>
-                    </w:rPr>
-                    <w:t>src/*.py</w:t>
-                  </w:r>
-                </w:p>
-              </w:tc>
-              <w:tc>
-                <w:tcPr>
-                  <w:tcW w:type="dxa" w:w="2493"/>
-                </w:tcPr>
-                <w:p>
-                  <w:pPr>
-                    <w:spacing w:after="20"/>
-                    <w:jc w:val="left"/>
-                  </w:pPr>
-                  <w:r/>
-                  <w:r>
-                    <w:rPr>
-                      <w:rFonts w:ascii="Consolas" w:hAnsi="Consolas"/>
-                      <w:sz w:val="21"/>
-                    </w:rPr>
-                    <w:t>api/cache.py</w:t>
-                  </w:r>
-                </w:p>
-              </w:tc>
-              <w:tc>
-                <w:tcPr>
-                  <w:tcW w:type="dxa" w:w="2493"/>
-                </w:tcPr>
-                <w:p>
-                  <w:pPr>
-                    <w:spacing w:after="20"/>
-                    <w:jc w:val="left"/>
-                  </w:pPr>
-                  <w:r/>
-                  <w:r>
-                    <w:rPr>
-                      <w:rFonts w:ascii="Times New Roman" w:hAnsi="Times New Roman"/>
-                      <w:sz w:val="21"/>
-                    </w:rPr>
-                    <w:t>in-process call</w:t>
-                  </w:r>
-                </w:p>
-              </w:tc>
-              <w:tc>
-                <w:tcPr>
-                  <w:tcW w:type="dxa" w:w="2493"/>
-                </w:tcPr>
-                <w:p>
-                  <w:pPr>
-                    <w:spacing w:after="20"/>
-                    <w:jc w:val="left"/>
-                  </w:pPr>
-                  <w:r/>
-                  <w:r>
-                    <w:rPr>
-                      <w:rFonts w:ascii="Times New Roman" w:hAnsi="Times New Roman"/>
-                      <w:sz w:val="21"/>
-                    </w:rPr>
-                    <w:t>DataFrame, no serialisation</w:t>
-                  </w:r>
-                </w:p>
-              </w:tc>
-            </w:tr>
-            <w:tr>
-              <w:trPr>
-                <w:cantSplit/>
-              </w:trPr>
-              <w:tc>
-                <w:tcPr>
-                  <w:tcW w:type="dxa" w:w="2493"/>
-                </w:tcPr>
-                <w:p>
-                  <w:pPr>
-                    <w:spacing w:after="20"/>
-                    <w:jc w:val="left"/>
-                  </w:pPr>
-                  <w:r/>
-                  <w:r>
-                    <w:rPr>
-                      <w:rFonts w:ascii="Consolas" w:hAnsi="Consolas"/>
-                      <w:sz w:val="21"/>
-                    </w:rPr>
-                    <w:t>api/cache.py</w:t>
-                  </w:r>
-                </w:p>
-              </w:tc>
-              <w:tc>
-                <w:tcPr>
-                  <w:tcW w:type="dxa" w:w="2493"/>
-                </w:tcPr>
-                <w:p>
-                  <w:pPr>
-                    <w:spacing w:after="20"/>
-                    <w:jc w:val="left"/>
-                  </w:pPr>
-                  <w:r/>
-                  <w:r>
-                    <w:rPr>
-                      <w:rFonts w:ascii="Consolas" w:hAnsi="Consolas"/>
-                      <w:sz w:val="21"/>
-                    </w:rPr>
-                    <w:t>api/routers/*.py</w:t>
-                  </w:r>
-                </w:p>
-              </w:tc>
-              <w:tc>
-                <w:tcPr>
-                  <w:tcW w:type="dxa" w:w="2493"/>
-                </w:tcPr>
-                <w:p>
-                  <w:pPr>
-                    <w:spacing w:after="20"/>
-                    <w:jc w:val="left"/>
-                  </w:pPr>
-                  <w:r/>
-                  <w:r>
-                    <w:rPr>
-                      <w:rFonts w:ascii="Times New Roman" w:hAnsi="Times New Roman"/>
-                      <w:sz w:val="21"/>
-                    </w:rPr>
-                    <w:t>in-memory dict</w:t>
-                  </w:r>
-                </w:p>
-              </w:tc>
-              <w:tc>
-                <w:tcPr>
-                  <w:tcW w:type="dxa" w:w="2493"/>
-                </w:tcPr>
-                <w:p>
-                  <w:pPr>
-                    <w:spacing w:after="20"/>
-                    <w:jc w:val="left"/>
-                  </w:pPr>
-                  <w:r/>
-                  <w:r>
-                    <w:rPr>
-                      <w:rFonts w:ascii="Consolas" w:hAnsi="Consolas"/>
-                      <w:sz w:val="21"/>
-                    </w:rPr>
-                    <w:t>pan</w:t>
-                  </w:r>
-                  <w:r>
-                    <w:rPr>
-                      <w:rFonts w:ascii="Times New Roman" w:hAnsi="Times New Roman"/>
-                      <w:sz w:val="21"/>
-                    </w:rPr>
-                    <w:t xml:space="preserve">, </w:t>
-                  </w:r>
-                  <w:r>
-                    <w:rPr>
-                      <w:rFonts w:ascii="Consolas" w:hAnsi="Consolas"/>
-                      <w:sz w:val="21"/>
-                    </w:rPr>
-                    <w:t>xs</w:t>
-                  </w:r>
-                  <w:r>
-                    <w:rPr>
-                      <w:rFonts w:ascii="Times New Roman" w:hAnsi="Times New Roman"/>
-                      <w:sz w:val="21"/>
-                    </w:rPr>
-                    <w:t xml:space="preserve">, </w:t>
-                  </w:r>
-                  <w:r>
-                    <w:rPr>
-                      <w:rFonts w:ascii="Consolas" w:hAnsi="Consolas"/>
-                      <w:sz w:val="21"/>
-                    </w:rPr>
-                    <w:t>sig</w:t>
-                  </w:r>
-                  <w:r>
-                    <w:rPr>
-                      <w:rFonts w:ascii="Times New Roman" w:hAnsi="Times New Roman"/>
-                      <w:sz w:val="21"/>
-                    </w:rPr>
-                    <w:t>, …</w:t>
-                  </w:r>
-                </w:p>
-              </w:tc>
-            </w:tr>
-            <w:tr>
-              <w:trPr>
-                <w:cantSplit/>
-              </w:trPr>
-              <w:tc>
-                <w:tcPr>
-                  <w:tcW w:type="dxa" w:w="2493"/>
-                </w:tcPr>
-                <w:p>
-                  <w:pPr>
-                    <w:spacing w:after="20"/>
-                    <w:jc w:val="left"/>
-                  </w:pPr>
-                  <w:r/>
-                  <w:r>
-                    <w:rPr>
-                      <w:rFonts w:ascii="Consolas" w:hAnsi="Consolas"/>
-                      <w:sz w:val="21"/>
-                    </w:rPr>
-                    <w:t>api/routers/*.py</w:t>
-                  </w:r>
-                </w:p>
-              </w:tc>
-              <w:tc>
-                <w:tcPr>
-                  <w:tcW w:type="dxa" w:w="2493"/>
-                </w:tcPr>
-                <w:p>
-                  <w:pPr>
-                    <w:spacing w:after="20"/>
-                    <w:jc w:val="left"/>
-                  </w:pPr>
-                  <w:r/>
-                  <w:r>
-                    <w:rPr>
-                      <w:rFonts w:ascii="Times New Roman" w:hAnsi="Times New Roman"/>
-                      <w:sz w:val="21"/>
-                    </w:rPr>
-                    <w:t>web client</w:t>
-                  </w:r>
-                </w:p>
-              </w:tc>
-              <w:tc>
-                <w:tcPr>
-                  <w:tcW w:type="dxa" w:w="2493"/>
-                </w:tcPr>
-                <w:p>
-                  <w:pPr>
-                    <w:spacing w:after="20"/>
-                    <w:jc w:val="left"/>
-                  </w:pPr>
-                  <w:r/>
-                  <w:r>
-                    <w:rPr>
-                      <w:rFonts w:ascii="Times New Roman" w:hAnsi="Times New Roman"/>
-                      <w:sz w:val="21"/>
-                    </w:rPr>
-                    <w:t>HTTP JSON</w:t>
-                  </w:r>
-                </w:p>
-              </w:tc>
-              <w:tc>
-                <w:tcPr>
-                  <w:tcW w:type="dxa" w:w="2493"/>
-                </w:tcPr>
-                <w:p>
-                  <w:pPr>
-                    <w:spacing w:after="20"/>
-                    <w:jc w:val="left"/>
-                  </w:pPr>
-                  <w:r/>
-                  <w:r>
-                    <w:rPr>
-                      <w:rFonts w:ascii="Consolas" w:hAnsi="Consolas"/>
-                      <w:sz w:val="21"/>
-                    </w:rPr>
-                    <w:t>response_model</w:t>
-                  </w:r>
-                </w:p>
-              </w:tc>
-            </w:tr>
-            <w:tr>
-              <w:trPr>
-                <w:cantSplit/>
-              </w:trPr>
-              <w:tc>
-                <w:tcPr>
-                  <w:tcW w:type="dxa" w:w="2493"/>
-                </w:tcPr>
-                <w:p>
-                  <w:pPr>
-                    <w:spacing w:after="20"/>
-                    <w:jc w:val="left"/>
-                  </w:pPr>
-                  <w:r/>
-                  <w:r>
-                    <w:rPr>
-                      <w:rFonts w:ascii="Times New Roman" w:hAnsi="Times New Roman"/>
-                      <w:sz w:val="21"/>
-                    </w:rPr>
-                    <w:t>daily job</w:t>
-                  </w:r>
-                </w:p>
-              </w:tc>
-              <w:tc>
-                <w:tcPr>
-                  <w:tcW w:type="dxa" w:w="2493"/>
-                </w:tcPr>
-                <w:p>
-                  <w:pPr>
-                    <w:spacing w:after="20"/>
-                    <w:jc w:val="left"/>
-                  </w:pPr>
-                  <w:r/>
-                  <w:r>
-                    <w:rPr>
-                      <w:rFonts w:ascii="Times New Roman" w:hAnsi="Times New Roman"/>
-                      <w:sz w:val="21"/>
-                    </w:rPr>
-                    <w:t>static site data</w:t>
-                  </w:r>
-                </w:p>
-              </w:tc>
-              <w:tc>
-                <w:tcPr>
-                  <w:tcW w:type="dxa" w:w="2493"/>
-                </w:tcPr>
-                <w:p>
-                  <w:pPr>
-                    <w:spacing w:after="20"/>
-                    <w:jc w:val="left"/>
-                  </w:pPr>
-                  <w:r/>
-                  <w:r>
-                    <w:rPr>
-                      <w:rFonts w:ascii="Times New Roman" w:hAnsi="Times New Roman"/>
-                      <w:sz w:val="21"/>
-                    </w:rPr>
-                    <w:t>HTTP call to API</w:t>
-                  </w:r>
-                </w:p>
-              </w:tc>
-              <w:tc>
-                <w:tcPr>
-                  <w:tcW w:type="dxa" w:w="2493"/>
-                </w:tcPr>
-                <w:p>
-                  <w:pPr>
-                    <w:spacing w:after="20"/>
-                    <w:jc w:val="left"/>
-                  </w:pPr>
-                  <w:r/>
-                  <w:r>
-                    <w:rPr>
-                      <w:rFonts w:ascii="Times New Roman" w:hAnsi="Times New Roman"/>
-                      <w:sz w:val="21"/>
-                    </w:rPr>
-                    <w:t>identical JSON, never recomputed</w:t>
-                  </w:r>
-                </w:p>
-              </w:tc>
-            </w:tr>
-          </w:tbl>
-          <w:p/>
-          <w:p>
-            <w:pPr>
-              <w:spacing w:after="0" w:before="0"/>
-            </w:pPr>
-            <w:r>
-              <w:rPr>
-                <w:sz w:val="2"/>
-              </w:rPr>
-            </w:r>
-          </w:p>
-          <w:p>
-            <w:pPr>
-              <w:spacing w:after="100"/>
-              <w:ind w:firstLine="340"/>
-              <w:jc w:val="both"/>
-            </w:pPr>
-            <w:r>
-              <w:rPr>
-                <w:rFonts w:ascii="Times New Roman" w:hAnsi="Times New Roman"/>
-                <w:sz w:val="24"/>
-              </w:rPr>
-              <w:t>The daily job never recomputes through a second code path — it calls the API and snapshots the response, the discipline [31] that keeps the static and live deployments from diverging, applied to every module added under the Research Plan.</w:t>
+              <w:t>Each layer boundary carries an explicit contract rather than an informal call</w:t>
+            </w:r>
+            <w:r>
+              <w:rPr>
+                <w:rFonts w:ascii="Times New Roman" w:hAnsi="Times New Roman"/>
+                <w:sz w:val="24"/>
+              </w:rPr>
+              <w:t>: the pipeline writes fixed-schema files, the computation layer reads and joins them in-process with no serialisation step, and the API exposes every downstream consumer — including the daily job that supplies the static site — through the same typed response models. That last link is enforced most strictly: the daily job never recomputes through a second code path, it calls the API and snapshots the response, the discipline [31] that keeps the static and live deployments from diverging, applied to every module added under the Research Plan.</w:t>
             </w:r>
           </w:p>
         </w:tc>

</xml_diff>

<commit_message>
Sua gay trang xau + rut gon cau chu, 14 -> 13 trang
- xuat_proposal.py: keep_with_next cho tieu de muc/tieu muc de khong
  con canh "References:"/"Deferred / Future Work"/"Research Scope:"
  treo cut o cuoi trang; siet le trang, dem o bang, khoang cach khoi
  ky de bu lai phan trang tang them.
- THESIS_PROPOSAL_EN.md: rut gon cau chu o Introduction, Market
  Survey, Research Scope, Proposed Method, Research Methodology,
  Expected Results — giu nguyen toan bo muc va noi dung chinh.

Co-Authored-By: Claude Sonnet 5 <noreply@anthropic.com>
</commit_message>
<xml_diff>
--- a/docs/THESIS_PROPOSAL.docx
+++ b/docs/THESIS_PROPOSAL.docx
@@ -157,10 +157,10 @@
           <w:insideV w:val="none" w:sz="0" w:color="000000"/>
         </w:tblBorders>
         <w:tblCellMar>
-          <w:top w:w="80" w:type="dxa"/>
-          <w:bottom w:w="80" w:type="dxa"/>
-          <w:left w:w="110" w:type="dxa"/>
-          <w:right w:w="110" w:type="dxa"/>
+          <w:top w:w="50" w:type="dxa"/>
+          <w:bottom w:w="50" w:type="dxa"/>
+          <w:left w:w="90" w:type="dxa"/>
+          <w:right w:w="90" w:type="dxa"/>
         </w:tblCellMar>
       </w:tblPr>
       <w:tblGrid>
@@ -284,6 +284,7 @@
           </w:tcPr>
           <w:p>
             <w:pPr>
+              <w:keepNext/>
               <w:spacing w:after="100"/>
             </w:pPr>
             <w:r>
@@ -306,7 +307,7 @@
                 <w:rFonts w:ascii="Times New Roman" w:hAnsi="Times New Roman"/>
                 <w:sz w:val="24"/>
               </w:rPr>
-              <w:t xml:space="preserve">Retail FX decision-support tools typically display a directional forecast and a confidence label whose empirical foundation is weaker than their presentation suggests: daily returns have resisted prediction since Meese and Rogoff [1], and technical-rule replications show in-sample profitability largely disappearing out of sample, absorbed by a momentum factor [2], [3]. The core difficulty is inference under a low signal-to-noise ratio with a large hypothesis space — evaluating thousands of candidate rules finds spurious relationships unless the hypothesis space is enumerated in advance and the family-wise error rate is controlled [4]–[6] — compounded by the fact that a negative finding is uninformative without its minimum detectable effect size (MDES). Predictability also differs by axis: the HAR model of realized volatility [7]–[9] gives well-established </w:t>
+              <w:t xml:space="preserve">Retail FX decision-support tools display a directional forecast and confidence label whose empirical foundation is weaker than their presentation suggests: daily returns have resisted prediction since Meese and Rogoff [1], and technical-rule profits largely vanish out of sample, absorbed by a momentum factor [2], [3]. The core difficulty is a low signal-to-noise ratio over a large hypothesis space — testing thousands of candidate rules finds spurious relationships unless the space is enumerated in advance and the family-wise error rate is controlled [4]–[6] — compounded by negative findings that are uninformative without a minimum detectable effect size (MDES). Predictability also differs by axis: HAR-modelled realized volatility [7]–[9] gives well-established </w:t>
             </w:r>
             <w:r>
               <w:rPr>
@@ -336,7 +337,7 @@
                 <w:rFonts w:ascii="Times New Roman" w:hAnsi="Times New Roman"/>
                 <w:sz w:val="24"/>
               </w:rPr>
-              <w:t xml:space="preserve"> remains contested [10], [11], so a system should state explicitly which axis it claims skill on.</w:t>
+              <w:t xml:space="preserve"> remains contested [10], [11], so a system should state which axis it claims skill on.</w:t>
             </w:r>
           </w:p>
           <w:p>
@@ -350,7 +351,7 @@
                 <w:rFonts w:ascii="Times New Roman" w:hAnsi="Times New Roman"/>
                 <w:sz w:val="24"/>
               </w:rPr>
-              <w:t>Preliminary work has established feasibility through three pre-registered phases, each closed with a written decision record. A complete pipeline covers six pairs (EUR/USD, GBP/USD, USD/JPY, AUD/USD, USD/CAD, USD/CHF) over 2010–2025 (≈34.9M one-minute bars); a production volatility layer, a three-class probability layer, and a risk layer run end to end through a web application updated daily. The extended HAR model attains test-set QLIKE 0.1585 vs. 0.2172 for the prior baseline, and 14 ML/DL alternatives plus 509 combinations fail to displace it from the Model Confidence Set [12]. On direction, 8,652 rule hypotheses across twelve discovery branches yield zero survivors after family-wise error control. A pre-registered causal-vs-validation feature-selection ablation is completed and frozen; its sealed-set evaluation was withheld because the pre-specified opening rule was not met.</w:t>
+              <w:t>Preliminary work has established feasibility through three pre-registered phases, each closed with a written decision record. A complete pipeline covers six pairs (EUR/USD, GBP/USD, USD/JPY, AUD/USD, USD/CAD, USD/CHF) over 2010–2025 (≈34.9M one-minute bars), with volatility, probability, and risk layers running end to end through a daily web application. The extended HAR model reaches test-set QLIKE 0.1585 vs. 0.2172 for the prior baseline, undisplaced by 14 ML/DL alternatives and 509 combinations in the Model Confidence Set [12]. On direction, 8,652 rule hypotheses across twelve discovery branches yield zero survivors after family-wise error control, and a pre-registered causal-vs-validation ablation is completed and frozen — its sealed-set evaluation withheld because the opening rule was not met.</w:t>
             </w:r>
           </w:p>
           <w:p>
@@ -379,7 +380,7 @@
                 <w:rFonts w:ascii="Times New Roman" w:hAnsi="Times New Roman"/>
                 <w:sz w:val="24"/>
               </w:rPr>
-              <w:t xml:space="preserve"> problem as a statistical one: a decision support system whose every number is traceable to a pre-registered measurement, delivered as software that runs continuously rather than a script for a report. The data pipeline, computation layer, API, and web application (see </w:t>
+              <w:t xml:space="preserve"> problem as a statistical one: a system whose every number is traceable to a pre-registered measurement, delivered as software that runs continuously rather than a report script. The data pipeline, computation layer, API, and web application (</w:t>
             </w:r>
             <w:r>
               <w:rPr>
@@ -394,7 +395,7 @@
                 <w:rFonts w:ascii="Times New Roman" w:hAnsi="Times New Roman"/>
                 <w:sz w:val="24"/>
               </w:rPr>
-              <w:t>) are a primary deliverable, developed across all sixteen weeks rather than assembled at the end.</w:t>
+              <w:t>) are a primary deliverable, built across all sixteen weeks rather than assembled at the end.</w:t>
             </w:r>
           </w:p>
         </w:tc>
@@ -406,6 +407,7 @@
           </w:tcPr>
           <w:p>
             <w:pPr>
+              <w:keepNext/>
               <w:spacing w:after="100"/>
             </w:pPr>
             <w:r>
@@ -473,7 +475,7 @@
                 <w:rFonts w:ascii="Times New Roman" w:hAnsi="Times New Roman"/>
                 <w:sz w:val="24"/>
               </w:rPr>
-              <w:t xml:space="preserve"> attach a qualitative label with no scoring rule. None discloses the hypothesis space searched, the multiple-testing correction, a calibration guarantee, or a quantified probability of ruin — gaps identified in decision support systems generally [27] and specifically targeted here.</w:t>
+              <w:t xml:space="preserve"> attach a qualitative label with no scoring rule. None discloses the hypothesis space, the multiple-testing correction, a calibration guarantee, or a probability of ruin — gaps this thesis targets directly [27].</w:t>
             </w:r>
           </w:p>
         </w:tc>
@@ -485,6 +487,7 @@
           </w:tcPr>
           <w:p>
             <w:pPr>
+              <w:keepNext/>
               <w:spacing w:after="100"/>
             </w:pPr>
             <w:r>
@@ -725,6 +728,7 @@
           </w:tcPr>
           <w:p>
             <w:pPr>
+              <w:keepNext/>
               <w:spacing w:after="100"/>
             </w:pPr>
             <w:r>
@@ -762,7 +766,7 @@
                 <w:rFonts w:ascii="Times New Roman" w:hAnsi="Times New Roman"/>
                 <w:sz w:val="24"/>
               </w:rPr>
-              <w:t xml:space="preserve"> — six cross pairs never used in development (EUR/GBP, EUR/JPY, GBP/JPY, AUD/JPY, EUR/CHF, NZD/USD) plus 2026 data for all twelve pairs — opens exactly once after the configuration is frozen, with no retuning after.</w:t>
+              <w:t xml:space="preserve"> — six cross pairs never used in development (EUR/GBP, EUR/JPY, GBP/JPY, AUD/JPY, EUR/CHF, NZD/USD) plus 2026 data for all twelve pairs — opens exactly once after the configuration is frozen, with no retuning.</w:t>
             </w:r>
           </w:p>
           <w:p>
@@ -776,7 +780,7 @@
                 <w:rFonts w:ascii="Times New Roman" w:hAnsi="Times New Roman"/>
                 <w:sz w:val="24"/>
               </w:rPr>
-              <w:t xml:space="preserve">The primary source is one-minute bar data, from which daily bars and five-minute realized measures are computed; supplementary sources include the central-bank/macro calendar, exogenous daily series, and tick-derived transaction costs. Horizons are one, five, and twenty sessions (one-session default). The study explicitly does </w:t>
+              <w:t xml:space="preserve">The primary source is one-minute bar data, from which daily bars and five-minute realized measures are computed; supplementary sources include the central-bank/macro calendar, exogenous series, and tick-derived costs. Horizons are one, five, and twenty sessions (default one). The study does </w:t>
             </w:r>
             <w:r>
               <w:rPr>
@@ -803,6 +807,7 @@
           </w:tcPr>
           <w:p>
             <w:pPr>
+              <w:keepNext/>
               <w:spacing w:after="100"/>
             </w:pPr>
             <w:r>
@@ -833,7 +838,7 @@
                 <w:rFonts w:ascii="Times New Roman" w:hAnsi="Times New Roman"/>
                 <w:sz w:val="24"/>
               </w:rPr>
-              <w:t>: how skill is attributed to an axis and an information layer; how multiple-testing control, power analysis, and sealed-set validation combine to produce replicable claims; how calibrated forecasts convert into risk limits with a measured ruin probability; and how this evidence should be presented so a user can separate what is measured from what is assumed.</w:t>
+              <w:t>: how skill is attributed to an axis and information layer; how multiple-testing control, power analysis, and sealed-set validation combine into replicable claims; how calibrated forecasts convert into risk limits with a measured ruin probability; and how this evidence is presented so a user can separate what is measured from what is assumed.</w:t>
             </w:r>
           </w:p>
         </w:tc>
@@ -845,6 +850,7 @@
           </w:tcPr>
           <w:p>
             <w:pPr>
+              <w:keepNext/>
               <w:spacing w:after="100"/>
             </w:pPr>
             <w:r>
@@ -902,6 +908,7 @@
           </w:p>
           <w:p>
             <w:pPr>
+              <w:keepNext/>
               <w:spacing w:before="140" w:after="60"/>
             </w:pPr>
             <w:r>
@@ -1025,7 +1032,7 @@
                 <w:rFonts w:ascii="Times New Roman" w:hAnsi="Times New Roman"/>
                 <w:sz w:val="24"/>
               </w:rPr>
-              <w:t xml:space="preserve"> Five triangulated methods decide which exogenous variable is trusted; using the effect to adjust the forecast directly was tested and found not yet effective (Deferred / Future Work).</w:t>
+              <w:t xml:space="preserve"> Five triangulated methods decide which exogenous variable is trusted; using the effect to adjust the forecast directly was tested and found ineffective (Deferred / Future Work).</w:t>
             </w:r>
           </w:p>
           <w:p>
@@ -1131,7 +1138,7 @@
                 <w:rFonts w:ascii="Times New Roman" w:hAnsi="Times New Roman"/>
                 <w:sz w:val="24"/>
               </w:rPr>
-              <w:t xml:space="preserve"> Two pair-specific tail-risk recalibrations, each diagnosed but not yet frozen: covariate-shift-weighted conformal/EVT quantiles for USD/JPY's confirmed distribution drift, and change-point-isolated exclusion of USD/CHF's 2015 SNB shock window; plus a portfolio-correlation adjustment and a measured slippage coefficient.</w:t>
+              <w:t xml:space="preserve"> Two pair-specific tail-risk recalibrations, diagnosed but not yet frozen: shift-weighted conformal/EVT quantiles for USD/JPY's confirmed drift, and change-point exclusion of USD/CHF's 2015 SNB shock window; plus a portfolio-correlation adjustment and a measured slippage coefficient.</w:t>
             </w:r>
           </w:p>
           <w:p>
@@ -1169,11 +1176,12 @@
                 <w:rFonts w:ascii="Times New Roman" w:hAnsi="Times New Roman"/>
                 <w:sz w:val="24"/>
               </w:rPr>
-              <w:t xml:space="preserve"> A secondary model that decides sizing/confidence rather than re-predicting direction [35]. After removing a circular-feature leak, preliminary skill (Brier skill score) is positive in 3/6 pairs, rising to 5/6 when the feature set is augmented with an exogenous implied-volatility index — a candidate risk-layer addition, integration not yet finalized.</w:t>
+              <w:t xml:space="preserve"> A secondary model deciding sizing/confidence rather than re-predicting direction [35]. After removing a circular-feature leak, skill (Brier skill score) is positive in 3/6 pairs, rising to 5/6 with an exogenous implied-volatility feature — a candidate risk-layer addition, not yet integrated.</w:t>
             </w:r>
           </w:p>
           <w:p>
             <w:pPr>
+              <w:keepNext/>
               <w:spacing w:before="140" w:after="60"/>
             </w:pPr>
             <w:r>
@@ -1212,7 +1220,7 @@
                 <w:rFonts w:ascii="Times New Roman" w:hAnsi="Times New Roman"/>
                 <w:sz w:val="24"/>
               </w:rPr>
-              <w:t xml:space="preserve"> is Granger-type F-testing under step-down Westfall–Young control [4]. Four independent methods triangulate the result — the answer to "which algorithm, and how do you know it is causality, not correlation":</w:t>
+              <w:t xml:space="preserve"> is Granger-type F-testing under step-down Westfall–Young control [4]; four independent methods triangulate the result — answering "which algorithm, and how do you know it is causality, not correlation":</w:t>
             </w:r>
           </w:p>
           <w:tbl>
@@ -1229,10 +1237,10 @@
                 <w:insideV w:val="single" w:sz="8" w:color="000000"/>
               </w:tblBorders>
               <w:tblCellMar>
-                <w:top w:w="40" w:type="dxa"/>
-                <w:bottom w:w="40" w:type="dxa"/>
-                <w:left w:w="80" w:type="dxa"/>
-                <w:right w:w="80" w:type="dxa"/>
+                <w:top w:w="25" w:type="dxa"/>
+                <w:bottom w:w="25" w:type="dxa"/>
+                <w:left w:w="60" w:type="dxa"/>
+                <w:right w:w="60" w:type="dxa"/>
               </w:tblCellMar>
             </w:tblPr>
             <w:tblGrid>
@@ -1371,7 +1379,7 @@
                       <w:rFonts w:ascii="Times New Roman" w:hAnsi="Times New Roman"/>
                       <w:sz w:val="21"/>
                     </w:rPr>
-                    <w:t>VIX survives on every pair; gold-implied volatility (GVZCLS) loses significance once conditioned on VIX — the confound-vs-cause distinction pairwise Granger cannot make</w:t>
+                    <w:t>VIX survives on every pair; gold-implied volatility (GVZCLS) loses significance once conditioned on VIX — a confound pairwise Granger cannot detect</w:t>
                   </w:r>
                 </w:p>
               </w:tc>
@@ -1654,7 +1662,7 @@
                 <w:rFonts w:ascii="Times New Roman" w:hAnsi="Times New Roman"/>
                 <w:sz w:val="24"/>
               </w:rPr>
-              <w:t>Four independently authored methods, different assumptions, converging on one variable is stronger evidence than any single p-value; none establishes structural causality — every claim remains temporal-precedence or potential-outcomes under its method's assumptions.</w:t>
+              <w:t>Four independently authored methods with different assumptions converging on one variable is stronger evidence than any single p-value; none establishes structural causality — every claim remains temporal-precedence or potential-outcomes under its method's assumptions.</w:t>
             </w:r>
           </w:p>
           <w:p>
@@ -1691,7 +1699,7 @@
                 <w:rFonts w:ascii="Times New Roman" w:hAnsi="Times New Roman"/>
                 <w:sz w:val="24"/>
               </w:rPr>
-              <w:t xml:space="preserve"> — it is the actual filter behind the frozen feature set. The </w:t>
+              <w:t xml:space="preserve">, the actual filter behind the frozen feature set. The </w:t>
             </w:r>
             <w:r>
               <w:rPr>
@@ -1706,7 +1714,7 @@
                 <w:rFonts w:ascii="Times New Roman" w:hAnsi="Times New Roman"/>
                 <w:sz w:val="24"/>
               </w:rPr>
-              <w:t xml:space="preserve"> (adjusting the forecast directly) was tested and produced </w:t>
+              <w:t xml:space="preserve"> (adjusting the forecast directly) produced </w:t>
             </w:r>
             <w:r>
               <w:rPr>
@@ -1721,11 +1729,12 @@
                 <w:rFonts w:ascii="Times New Roman" w:hAnsi="Times New Roman"/>
                 <w:sz w:val="24"/>
               </w:rPr>
-              <w:t>, plausibly because HAR already absorbs the information indirectly; consistent with this thesis's negative-findings policy, it moves to Deferred / Future Work.</w:t>
+              <w:t>, plausibly because HAR already absorbs the information indirectly; per this thesis's negative-findings policy, it moves to Deferred / Future Work.</w:t>
             </w:r>
           </w:p>
           <w:p>
             <w:pPr>
+              <w:keepNext/>
               <w:spacing w:before="140" w:after="60"/>
             </w:pPr>
             <w:r>
@@ -1786,7 +1795,7 @@
                 <w:rFonts w:ascii="Times New Roman" w:hAnsi="Times New Roman"/>
                 <w:sz w:val="24"/>
               </w:rPr>
-              <w:t xml:space="preserve"> One-time historical bootstrap plus a daily job (four times/day via CI) building daily bars, realized measures, and the macro calendar.</w:t>
+              <w:t xml:space="preserve"> One-time historical bootstrap plus a daily job (4×/day via CI) building daily bars, realized measures, and the macro calendar.</w:t>
             </w:r>
           </w:p>
           <w:p>
@@ -1994,7 +2003,7 @@
                 <w:rFonts w:ascii="Times New Roman" w:hAnsi="Times New Roman"/>
                 <w:sz w:val="24"/>
               </w:rPr>
-              <w:t xml:space="preserve"> The local/CI deployment runs the full FastAPI process and is the only place risk numbers are </w:t>
+              <w:t xml:space="preserve"> The local/CI deployment runs the full FastAPI process, the only place risk numbers are </w:t>
             </w:r>
             <w:r>
               <w:rPr>
@@ -2009,7 +2018,7 @@
                 <w:rFonts w:ascii="Times New Roman" w:hAnsi="Times New Roman"/>
                 <w:sz w:val="24"/>
               </w:rPr>
-              <w:t>; Vercel's serverless size limit cannot host that stack, so a daily job pre-computes once-a-day numbers as static JSON while a lightweight function handles only intraday chart data — practice consistent with scaling ML-serving systems under heterogeneous constraints [31], [32].</w:t>
+              <w:t>; Vercel's serverless size limit cannot host that stack, so a daily job pre-computes once-a-day numbers as static JSON while a lightweight function handles intraday chart data — consistent with scaling ML-serving systems under heterogeneous constraints [31], [32].</w:t>
             </w:r>
           </w:p>
           <w:p>
@@ -2024,14 +2033,14 @@
                 <w:b/>
                 <w:sz w:val="24"/>
               </w:rPr>
-              <w:t>Each layer boundary carries an explicit contract rather than an informal call</w:t>
-            </w:r>
-            <w:r>
-              <w:rPr>
-                <w:rFonts w:ascii="Times New Roman" w:hAnsi="Times New Roman"/>
-                <w:sz w:val="24"/>
-              </w:rPr>
-              <w:t>: the pipeline writes fixed-schema files, the computation layer reads and joins them in-process with no serialisation step, and the API exposes every downstream consumer — including the daily job that supplies the static site — through the same typed response models. That last link is enforced most strictly: the daily job never recomputes through a second code path, it calls the API and snapshots the response, the discipline [31] that keeps the static and live deployments from diverging, applied to every module added under the Research Plan.</w:t>
+              <w:t>Each layer boundary carries an explicit contract, not an informal call</w:t>
+            </w:r>
+            <w:r>
+              <w:rPr>
+                <w:rFonts w:ascii="Times New Roman" w:hAnsi="Times New Roman"/>
+                <w:sz w:val="24"/>
+              </w:rPr>
+              <w:t>: the pipeline writes fixed-schema files, the computation layer joins them in-process with no serialisation step, and the API exposes every downstream consumer — including the daily job feeding the static site — through the same typed response models. That last link is enforced most strictly: the daily job never recomputes through a second code path, it calls the API and snapshots the response — the discipline [31] that keeps deployments from diverging, applied to every module added under the Research Plan.</w:t>
             </w:r>
           </w:p>
         </w:tc>
@@ -2043,6 +2052,7 @@
           </w:tcPr>
           <w:p>
             <w:pPr>
+              <w:keepNext/>
               <w:spacing w:after="100"/>
             </w:pPr>
             <w:r>
@@ -2097,7 +2107,7 @@
                 <w:rFonts w:ascii="Times New Roman" w:hAnsi="Times New Roman"/>
                 <w:sz w:val="24"/>
               </w:rPr>
-              <w:t xml:space="preserve"> Construct bars and realized measures; verify contiguity and session conventions; fix the partition, metrics, multiple-testing procedure, and sealed-set policy in writing </w:t>
+              <w:t xml:space="preserve"> Construct bars and realized measures; verify contiguity and session conventions; fix the partition, metrics, multiple-testing procedure, and sealed-set policy </w:t>
             </w:r>
             <w:r>
               <w:rPr>
@@ -2287,7 +2297,7 @@
                 <w:rFonts w:ascii="Times New Roman" w:hAnsi="Times New Roman"/>
                 <w:sz w:val="24"/>
               </w:rPr>
-              <w:t xml:space="preserve"> Maintain the operating product path throughout, integrating each layer as a versioned artefact the week it completes; harden the system in the final weeks with full provenance; analyse failure cases and calibration degradation in the interface rather than omitting them.</w:t>
+              <w:t xml:space="preserve"> Maintain the operating product path throughout, integrating each layer as a versioned artefact the week it completes; harden the system in the final weeks with full provenance; analyse failure cases and calibration degradation in the interface, not omit them.</w:t>
             </w:r>
           </w:p>
         </w:tc>
@@ -2299,6 +2309,7 @@
           </w:tcPr>
           <w:p>
             <w:pPr>
+              <w:keepNext/>
               <w:spacing w:after="100"/>
             </w:pPr>
             <w:r>
@@ -2399,7 +2410,7 @@
                 <w:rFonts w:ascii="Times New Roman" w:hAnsi="Times New Roman"/>
                 <w:sz w:val="24"/>
               </w:rPr>
-              <w:t xml:space="preserve"> Causally-filtered variables degrade less out of sample than validation-selected ones (mechanism: distribution drift in the latter); the triangulation's validation role is load-bearing, its forecast-performance role tested and reported negative rather than overstated.</w:t>
+              <w:t xml:space="preserve"> Causally-filtered variables degrade less out of sample than validation-selected ones (distribution drift in the latter); the triangulation's validation role is load-bearing, its forecast-performance role tested and reported negative rather than overstated.</w:t>
             </w:r>
           </w:p>
           <w:p>
@@ -2518,6 +2529,7 @@
           </w:tcPr>
           <w:p>
             <w:pPr>
+              <w:keepNext/>
               <w:spacing w:after="100"/>
             </w:pPr>
             <w:r>
@@ -3538,6 +3550,7 @@
           </w:tcPr>
           <w:p>
             <w:pPr>
+              <w:keepNext/>
               <w:spacing w:after="100"/>
             </w:pPr>
             <w:r>
@@ -3593,10 +3606,10 @@
               </w:tblBorders>
               <w:tblLayout w:type="fixed"/>
               <w:tblCellMar>
-                <w:top w:w="40" w:type="dxa"/>
-                <w:bottom w:w="40" w:type="dxa"/>
-                <w:left w:w="80" w:type="dxa"/>
-                <w:right w:w="80" w:type="dxa"/>
+                <w:top w:w="25" w:type="dxa"/>
+                <w:bottom w:w="25" w:type="dxa"/>
+                <w:left w:w="60" w:type="dxa"/>
+                <w:right w:w="60" w:type="dxa"/>
               </w:tblCellMar>
               <w:tblLayout w:type="fixed"/>
             </w:tblPr>
@@ -4738,6 +4751,7 @@
           </w:tcPr>
           <w:p>
             <w:pPr>
+              <w:keepNext/>
               <w:spacing w:after="100"/>
             </w:pPr>
             <w:r>
@@ -4864,6 +4878,7 @@
           </w:tcPr>
           <w:p>
             <w:pPr>
+              <w:keepNext/>
               <w:spacing w:after="100"/>
             </w:pPr>
             <w:r>
@@ -4905,10 +4920,10 @@
               </w:tblBorders>
               <w:tblLayout w:type="fixed"/>
               <w:tblCellMar>
-                <w:top w:w="40" w:type="dxa"/>
-                <w:bottom w:w="40" w:type="dxa"/>
-                <w:left w:w="80" w:type="dxa"/>
-                <w:right w:w="80" w:type="dxa"/>
+                <w:top w:w="25" w:type="dxa"/>
+                <w:bottom w:w="25" w:type="dxa"/>
+                <w:left w:w="60" w:type="dxa"/>
+                <w:right w:w="60" w:type="dxa"/>
               </w:tblCellMar>
               <w:tblLayout w:type="fixed"/>
             </w:tblPr>
@@ -6134,10 +6149,10 @@
         </w:tblBorders>
         <w:tblLayout w:type="fixed"/>
         <w:tblCellMar>
-          <w:top w:w="110" w:type="dxa"/>
-          <w:bottom w:w="110" w:type="dxa"/>
-          <w:left w:w="110" w:type="dxa"/>
-          <w:right w:w="110" w:type="dxa"/>
+          <w:top w:w="70" w:type="dxa"/>
+          <w:bottom w:w="70" w:type="dxa"/>
+          <w:left w:w="90" w:type="dxa"/>
+          <w:right w:w="90" w:type="dxa"/>
         </w:tblCellMar>
         <w:tblLayout w:type="fixed"/>
       </w:tblPr>
@@ -6170,7 +6185,7 @@
           </w:p>
           <w:p>
             <w:pPr>
-              <w:spacing w:after="1040"/>
+              <w:spacing w:after="760"/>
               <w:jc w:val="center"/>
             </w:pPr>
             <w:r>
@@ -6235,7 +6250,7 @@
           </w:p>
           <w:p>
             <w:pPr>
-              <w:spacing w:after="880"/>
+              <w:spacing w:after="640"/>
               <w:jc w:val="center"/>
             </w:pPr>
             <w:r>
@@ -6250,7 +6265,7 @@
           </w:p>
           <w:p>
             <w:pPr>
-              <w:spacing w:after="680"/>
+              <w:spacing w:after="520"/>
               <w:jc w:val="center"/>
             </w:pPr>
             <w:r>
@@ -6283,7 +6298,7 @@
     </w:tbl>
     <w:sectPr>
       <w:pgSz w:w="12240" w:h="15840"/>
-      <w:pgMar w:top="1020" w:right="1020" w:bottom="1020" w:left="1247" w:header="720" w:footer="720" w:gutter="0"/>
+      <w:pgMar w:top="794" w:right="1020" w:bottom="794" w:left="1247" w:header="720" w:footer="720" w:gutter="0"/>
       <w:cols w:space="720"/>
       <w:docGrid w:linePitch="360"/>
     </w:sectPr>
@@ -6655,7 +6670,7 @@
     <w:qFormat/>
     <w:rsid w:val="00FC693F"/>
     <w:pPr>
-      <w:spacing w:after="120" w:line="276" w:lineRule="auto"/>
+      <w:spacing w:after="100" w:line="264" w:lineRule="auto"/>
     </w:pPr>
     <w:rPr>
       <w:rFonts w:ascii="Times New Roman" w:hAnsi="Times New Roman" w:eastAsia="Times New Roman"/>

</xml_diff>